<commit_message>
nmv 21 10 2026
</commit_message>
<xml_diff>
--- a/TS Jatai Ghanam Project/TS 4.7/TS 4.7 Ghanam Malayalam Corrections.docx
+++ b/TS Jatai Ghanam Project/TS 4.7/TS 4.7 Ghanam Malayalam Corrections.docx
@@ -1,7 +1,274 @@
 
 <file path=word/document.xml><?xml version="1.0" encoding="utf-8"?>
-<w:document xmlns:wpc="http://schemas.microsoft.com/office/word/2010/wordprocessingCanvas" xmlns:cx="http://schemas.microsoft.com/office/drawing/2014/chartex" xmlns:cx1="http://schemas.microsoft.com/office/drawing/2015/9/8/chartex" xmlns:cx2="http://schemas.microsoft.com/office/drawing/2015/10/21/chartex" xmlns:cx3="http://schemas.microsoft.com/office/drawing/2016/5/9/chartex" xmlns:cx4="http://schemas.microsoft.com/office/drawing/2016/5/10/chartex" xmlns:cx5="http://schemas.microsoft.com/office/drawing/2016/5/11/chartex" xmlns:cx6="http://schemas.microsoft.com/office/drawing/2016/5/12/chartex" xmlns:cx7="http://schemas.microsoft.com/office/drawing/2016/5/13/chartex" xmlns:cx8="http://schemas.microsoft.com/office/drawing/2016/5/14/chartex" xmlns:mc="http://schemas.openxmlformats.org/markup-compatibility/2006" xmlns:aink="http://schemas.microsoft.com/office/drawing/2016/ink" xmlns:am3d="http://schemas.microsoft.com/office/drawing/2017/model3d" xmlns:o="urn:schemas-microsoft-com:office:office" xmlns:oel="http://schemas.microsoft.com/office/2019/extlst" xmlns:r="http://schemas.openxmlformats.org/officeDocument/2006/relationships" xmlns:m="http://schemas.openxmlformats.org/officeDocument/2006/math" xmlns:v="urn:schemas-microsoft-com:vml" xmlns:wp14="http://schemas.microsoft.com/office/word/2010/wordprocessingDrawing" xmlns:wp="http://schemas.openxmlformats.org/drawingml/2006/wordprocessingDrawing" xmlns:w10="urn:schemas-microsoft-com:office:word" xmlns:w="http://schemas.openxmlformats.org/wordprocessingml/2006/main" xmlns:w14="http://schemas.microsoft.com/office/word/2010/wordml" xmlns:w15="http://schemas.microsoft.com/office/word/2012/wordml" xmlns:w16cex="http://schemas.microsoft.com/office/word/2018/wordml/cex" xmlns:w16cid="http://schemas.microsoft.com/office/word/2016/wordml/cid" xmlns:w16="http://schemas.microsoft.com/office/word/2018/wordml" xmlns:w16du="http://schemas.microsoft.com/office/word/2023/wordml/word16du" xmlns:w16sdtdh="http://schemas.microsoft.com/office/word/2020/wordml/sdtdatahash" xmlns:w16se="http://schemas.microsoft.com/office/word/2015/wordml/symex" xmlns:wpg="http://schemas.microsoft.com/office/word/2010/wordprocessingGroup" xmlns:wpi="http://schemas.microsoft.com/office/word/2010/wordprocessingInk" xmlns:wne="http://schemas.microsoft.com/office/word/2006/wordml" xmlns:wps="http://schemas.microsoft.com/office/word/2010/wordprocessingShape" mc:Ignorable="w14 w15 w16se w16cid w16 w16cex w16sdtdh w16du wp14">
+<w:document xmlns:wpc="http://schemas.microsoft.com/office/word/2010/wordprocessingCanvas" xmlns:cx="http://schemas.microsoft.com/office/drawing/2014/chartex" xmlns:cx1="http://schemas.microsoft.com/office/drawing/2015/9/8/chartex" xmlns:cx2="http://schemas.microsoft.com/office/drawing/2015/10/21/chartex" xmlns:cx3="http://schemas.microsoft.com/office/drawing/2016/5/9/chartex" xmlns:cx4="http://schemas.microsoft.com/office/drawing/2016/5/10/chartex" xmlns:cx5="http://schemas.microsoft.com/office/drawing/2016/5/11/chartex" xmlns:cx6="http://schemas.microsoft.com/office/drawing/2016/5/12/chartex" xmlns:cx7="http://schemas.microsoft.com/office/drawing/2016/5/13/chartex" xmlns:cx8="http://schemas.microsoft.com/office/drawing/2016/5/14/chartex" xmlns:mc="http://schemas.openxmlformats.org/markup-compatibility/2006" xmlns:aink="http://schemas.microsoft.com/office/drawing/2016/ink" xmlns:am3d="http://schemas.microsoft.com/office/drawing/2017/model3d" xmlns:o="urn:schemas-microsoft-com:office:office" xmlns:oel="http://schemas.microsoft.com/office/2019/extlst" xmlns:r="http://schemas.openxmlformats.org/officeDocument/2006/relationships" xmlns:m="http://schemas.openxmlformats.org/officeDocument/2006/math" xmlns:v="urn:schemas-microsoft-com:vml" xmlns:wp14="http://schemas.microsoft.com/office/word/2010/wordprocessingDrawing" xmlns:wp="http://schemas.openxmlformats.org/drawingml/2006/wordprocessingDrawing" xmlns:w10="urn:schemas-microsoft-com:office:word" xmlns:w="http://schemas.openxmlformats.org/wordprocessingml/2006/main" xmlns:w14="http://schemas.microsoft.com/office/word/2010/wordml" xmlns:w15="http://schemas.microsoft.com/office/word/2012/wordml" xmlns:w16cex="http://schemas.microsoft.com/office/word/2018/wordml/cex" xmlns:w16cid="http://schemas.microsoft.com/office/word/2016/wordml/cid" xmlns:w16="http://schemas.microsoft.com/office/word/2018/wordml" xmlns:w16du="http://schemas.microsoft.com/office/word/2023/wordml/word16du" xmlns:w16sdtdh="http://schemas.microsoft.com/office/word/2020/wordml/sdtdatahash" xmlns:w16sdtfl="http://schemas.microsoft.com/office/word/2024/wordml/sdtformatlock" xmlns:w16se="http://schemas.microsoft.com/office/word/2015/wordml/symex" xmlns:wpg="http://schemas.microsoft.com/office/word/2010/wordprocessingGroup" xmlns:wpi="http://schemas.microsoft.com/office/word/2010/wordprocessingInk" xmlns:wne="http://schemas.microsoft.com/office/word/2006/wordml" xmlns:wps="http://schemas.microsoft.com/office/word/2010/wordprocessingShape" mc:Ignorable="w14 w15 w16se w16cid w16 w16cex w16sdtdh w16sdtfl w16du wp14">
   <w:body>
+    <w:p>
+      <w:pPr>
+        <w:spacing w:before="0" w:line="240" w:lineRule="auto"/>
+        <w:jc w:val="center"/>
+        <w:rPr>
+          <w:b/>
+          <w:bCs/>
+          <w:sz w:val="32"/>
+          <w:szCs w:val="32"/>
+          <w:u w:val="single"/>
+        </w:rPr>
+      </w:pPr>
+      <w:r>
+        <w:rPr>
+          <w:b/>
+          <w:bCs/>
+          <w:sz w:val="32"/>
+          <w:szCs w:val="32"/>
+          <w:u w:val="single"/>
+        </w:rPr>
+        <w:t xml:space="preserve">TS </w:t>
+      </w:r>
+      <w:r>
+        <w:rPr>
+          <w:b/>
+          <w:bCs/>
+          <w:sz w:val="32"/>
+          <w:szCs w:val="32"/>
+          <w:u w:val="single"/>
+        </w:rPr>
+        <w:t>Ghanam</w:t>
+      </w:r>
+      <w:r>
+        <w:rPr>
+          <w:b/>
+          <w:bCs/>
+          <w:sz w:val="32"/>
+          <w:szCs w:val="32"/>
+          <w:u w:val="single"/>
+        </w:rPr>
+        <w:t xml:space="preserve"> – TS </w:t>
+      </w:r>
+      <w:r>
+        <w:rPr>
+          <w:b/>
+          <w:bCs/>
+          <w:sz w:val="32"/>
+          <w:szCs w:val="32"/>
+          <w:u w:val="single"/>
+        </w:rPr>
+        <w:t>4.7</w:t>
+      </w:r>
+      <w:r>
+        <w:rPr>
+          <w:b/>
+          <w:bCs/>
+          <w:sz w:val="32"/>
+          <w:szCs w:val="32"/>
+          <w:u w:val="single"/>
+        </w:rPr>
+        <w:t xml:space="preserve"> Malayalam Corrections – Observed till </w:t>
+      </w:r>
+      <w:r>
+        <w:rPr>
+          <w:b/>
+          <w:bCs/>
+          <w:sz w:val="32"/>
+          <w:szCs w:val="32"/>
+          <w:u w:val="single"/>
+        </w:rPr>
+        <w:t>31st Oct 2026</w:t>
+      </w:r>
+    </w:p>
+    <w:p>
+      <w:pPr>
+        <w:spacing w:before="0" w:line="240" w:lineRule="auto"/>
+        <w:jc w:val="center"/>
+        <w:rPr>
+          <w:b/>
+          <w:bCs/>
+          <w:sz w:val="28"/>
+          <w:szCs w:val="32"/>
+        </w:rPr>
+      </w:pPr>
+      <w:r>
+        <w:rPr>
+          <w:b/>
+          <w:bCs/>
+          <w:sz w:val="28"/>
+          <w:szCs w:val="32"/>
+        </w:rPr>
+        <w:t>(ignore those which are already incorporated in your book’s version and date)</w:t>
+      </w:r>
+    </w:p>
+    <w:tbl>
+      <w:tblPr>
+        <w:tblW w:w="14396" w:type="dxa"/>
+        <w:tblInd w:w="-792" w:type="dxa"/>
+        <w:tblBorders>
+          <w:top w:val="single" w:sz="4" w:space="0" w:color="000000"/>
+          <w:left w:val="single" w:sz="4" w:space="0" w:color="000000"/>
+          <w:bottom w:val="single" w:sz="4" w:space="0" w:color="000000"/>
+          <w:right w:val="single" w:sz="4" w:space="0" w:color="000000"/>
+          <w:insideH w:val="single" w:sz="4" w:space="0" w:color="000000"/>
+          <w:insideV w:val="single" w:sz="4" w:space="0" w:color="000000"/>
+        </w:tblBorders>
+        <w:tblLook w:val="04A0" w:firstRow="1" w:lastRow="0" w:firstColumn="1" w:lastColumn="0" w:noHBand="0" w:noVBand="1"/>
+      </w:tblPr>
+      <w:tblGrid>
+        <w:gridCol w:w="6883"/>
+        <w:gridCol w:w="7513"/>
+      </w:tblGrid>
+      <w:tr>
+        <w:tc>
+          <w:tcPr>
+            <w:tcW w:w="6883" w:type="dxa"/>
+          </w:tcPr>
+          <w:p>
+            <w:pPr>
+              <w:spacing w:before="0" w:line="240" w:lineRule="auto"/>
+              <w:jc w:val="center"/>
+              <w:rPr>
+                <w:b/>
+                <w:sz w:val="32"/>
+                <w:szCs w:val="32"/>
+              </w:rPr>
+            </w:pPr>
+            <w:r>
+              <w:rPr>
+                <w:b/>
+                <w:sz w:val="32"/>
+                <w:szCs w:val="32"/>
+              </w:rPr>
+              <w:t>As Printed</w:t>
+            </w:r>
+          </w:p>
+        </w:tc>
+        <w:tc>
+          <w:tcPr>
+            <w:tcW w:w="7513" w:type="dxa"/>
+          </w:tcPr>
+          <w:p>
+            <w:pPr>
+              <w:spacing w:before="0" w:line="240" w:lineRule="auto"/>
+              <w:ind w:right="-18"/>
+              <w:jc w:val="center"/>
+              <w:rPr>
+                <w:b/>
+                <w:sz w:val="32"/>
+                <w:szCs w:val="32"/>
+              </w:rPr>
+            </w:pPr>
+            <w:r>
+              <w:rPr>
+                <w:b/>
+                <w:sz w:val="32"/>
+                <w:szCs w:val="32"/>
+              </w:rPr>
+              <w:t xml:space="preserve">To be read as or corrected as </w:t>
+            </w:r>
+          </w:p>
+        </w:tc>
+      </w:tr>
+      <w:tr>
+        <w:trPr>
+          <w:trHeight w:val="488"/>
+        </w:trPr>
+        <w:tc>
+          <w:tcPr>
+            <w:tcW w:w="6883" w:type="dxa"/>
+          </w:tcPr>
+          <w:p>
+            <w:pPr>
+              <w:widowControl w:val="0"/>
+              <w:autoSpaceDE w:val="0"/>
+              <w:autoSpaceDN w:val="0"/>
+              <w:adjustRightInd w:val="0"/>
+              <w:spacing w:before="0" w:line="240" w:lineRule="auto"/>
+              <w:jc w:val="center"/>
+              <w:rPr>
+                <w:rFonts w:cs="BRH Malayalam Extra"/>
+                <w:b/>
+                <w:bCs/>
+                <w:color w:val="000000"/>
+                <w:szCs w:val="40"/>
+              </w:rPr>
+            </w:pPr>
+            <w:r>
+              <w:rPr>
+                <w:rFonts w:cs="BRH Malayalam Extra"/>
+                <w:b/>
+                <w:bCs/>
+                <w:color w:val="000000"/>
+                <w:szCs w:val="40"/>
+              </w:rPr>
+              <w:t>NONE   NONE   NONE    NONE</w:t>
+            </w:r>
+          </w:p>
+        </w:tc>
+        <w:tc>
+          <w:tcPr>
+            <w:tcW w:w="7513" w:type="dxa"/>
+          </w:tcPr>
+          <w:p>
+            <w:pPr>
+              <w:widowControl w:val="0"/>
+              <w:autoSpaceDE w:val="0"/>
+              <w:autoSpaceDN w:val="0"/>
+              <w:adjustRightInd w:val="0"/>
+              <w:spacing w:before="0" w:line="240" w:lineRule="auto"/>
+              <w:jc w:val="center"/>
+              <w:rPr>
+                <w:rFonts w:cs="BRH Malayalam Extra"/>
+                <w:color w:val="000000"/>
+                <w:szCs w:val="40"/>
+              </w:rPr>
+            </w:pPr>
+            <w:r>
+              <w:rPr>
+                <w:rFonts w:cs="BRH Malayalam Extra"/>
+                <w:b/>
+                <w:bCs/>
+                <w:color w:val="000000"/>
+                <w:szCs w:val="40"/>
+              </w:rPr>
+              <w:t>NONE   NONE   NONE    NONE</w:t>
+            </w:r>
+          </w:p>
+        </w:tc>
+      </w:tr>
+    </w:tbl>
+    <w:p>
+      <w:pPr>
+        <w:spacing w:before="0" w:line="240" w:lineRule="auto"/>
+        <w:jc w:val="center"/>
+        <w:rPr>
+          <w:b/>
+          <w:bCs/>
+          <w:sz w:val="32"/>
+          <w:szCs w:val="32"/>
+          <w:u w:val="single"/>
+        </w:rPr>
+      </w:pPr>
+      <w:r>
+        <w:rPr>
+          <w:b/>
+          <w:bCs/>
+          <w:sz w:val="32"/>
+          <w:szCs w:val="32"/>
+          <w:u w:val="single"/>
+        </w:rPr>
+        <w:t>===============</w:t>
+      </w:r>
+    </w:p>
+    <w:p>
+      <w:pPr>
+        <w:spacing w:before="0" w:line="240" w:lineRule="auto"/>
+        <w:jc w:val="center"/>
+        <w:rPr>
+          <w:b/>
+          <w:bCs/>
+          <w:sz w:val="32"/>
+          <w:szCs w:val="32"/>
+          <w:u w:val="single"/>
+        </w:rPr>
+      </w:pPr>
+    </w:p>
     <w:p>
       <w:pPr>
         <w:spacing w:before="0" w:line="240" w:lineRule="auto"/>
@@ -2731,6 +2998,7 @@
                 <w:szCs w:val="32"/>
                 <w:lang w:val="it-IT"/>
               </w:rPr>
+              <w:lastRenderedPageBreak/>
               <w:t>50</w:t>
             </w:r>
             <w:r>
@@ -3496,7 +3764,6 @@
                 <w:szCs w:val="32"/>
                 <w:lang w:val="it-IT"/>
               </w:rPr>
-              <w:lastRenderedPageBreak/>
               <w:t>dy dõ—tI Z</w:t>
             </w:r>
             <w:r>
@@ -3574,7 +3841,6 @@
                 <w:szCs w:val="32"/>
                 <w:lang w:val="it-IT"/>
               </w:rPr>
-              <w:lastRenderedPageBreak/>
               <w:t>6</w:t>
             </w:r>
             <w:r>
@@ -3878,7 +4144,6 @@
                 <w:szCs w:val="32"/>
                 <w:lang w:val="it-IT"/>
               </w:rPr>
-              <w:lastRenderedPageBreak/>
               <w:t>dy dõ—tI Z</w:t>
             </w:r>
             <w:r>
@@ -3994,7 +4259,6 @@
                 <w:szCs w:val="32"/>
                 <w:lang w:val="it-IT"/>
               </w:rPr>
-              <w:lastRenderedPageBreak/>
               <w:t>57</w:t>
             </w:r>
             <w:r>
@@ -5810,71 +6074,6 @@
         </w:rPr>
         <w:t>==============</w:t>
       </w:r>
-    </w:p>
-    <w:p>
-      <w:pPr>
-        <w:spacing w:before="0" w:line="240" w:lineRule="auto"/>
-        <w:jc w:val="center"/>
-        <w:rPr>
-          <w:b/>
-          <w:bCs/>
-          <w:sz w:val="32"/>
-          <w:szCs w:val="32"/>
-          <w:u w:val="single"/>
-        </w:rPr>
-      </w:pPr>
-    </w:p>
-    <w:p>
-      <w:pPr>
-        <w:spacing w:before="0" w:line="240" w:lineRule="auto"/>
-        <w:jc w:val="center"/>
-        <w:rPr>
-          <w:b/>
-          <w:bCs/>
-          <w:sz w:val="32"/>
-          <w:szCs w:val="32"/>
-          <w:u w:val="single"/>
-        </w:rPr>
-      </w:pPr>
-    </w:p>
-    <w:p>
-      <w:pPr>
-        <w:spacing w:before="0" w:line="240" w:lineRule="auto"/>
-        <w:jc w:val="center"/>
-        <w:rPr>
-          <w:b/>
-          <w:bCs/>
-          <w:sz w:val="32"/>
-          <w:szCs w:val="32"/>
-          <w:u w:val="single"/>
-        </w:rPr>
-      </w:pPr>
-    </w:p>
-    <w:p>
-      <w:pPr>
-        <w:spacing w:before="0" w:line="240" w:lineRule="auto"/>
-        <w:jc w:val="center"/>
-        <w:rPr>
-          <w:b/>
-          <w:bCs/>
-          <w:sz w:val="32"/>
-          <w:szCs w:val="32"/>
-          <w:u w:val="single"/>
-        </w:rPr>
-      </w:pPr>
-    </w:p>
-    <w:p>
-      <w:pPr>
-        <w:spacing w:before="0" w:line="240" w:lineRule="auto"/>
-        <w:jc w:val="center"/>
-        <w:rPr>
-          <w:b/>
-          <w:bCs/>
-          <w:sz w:val="32"/>
-          <w:szCs w:val="32"/>
-          <w:u w:val="single"/>
-        </w:rPr>
-      </w:pPr>
     </w:p>
     <w:p>
       <w:pPr>
@@ -13140,6 +13339,7 @@
                 <w:color w:val="000000"/>
                 <w:sz w:val="32"/>
                 <w:szCs w:val="40"/>
+                <w:lang w:val="it-IT"/>
               </w:rPr>
             </w:pPr>
             <w:r>
@@ -13148,6 +13348,7 @@
                 <w:color w:val="000000"/>
                 <w:sz w:val="32"/>
                 <w:szCs w:val="40"/>
+                <w:lang w:val="it-IT"/>
               </w:rPr>
               <w:t>sõe</w:t>
             </w:r>
@@ -13157,15 +13358,17 @@
                 <w:color w:val="000000"/>
                 <w:sz w:val="28"/>
                 <w:szCs w:val="40"/>
-              </w:rPr>
-              <w:t>–</w:t>
-            </w:r>
-            <w:r>
-              <w:rPr>
-                <w:rFonts w:ascii="BRH Malayalam Extra" w:hAnsi="BRH Malayalam Extra" w:cs="BRH Malayalam Extra"/>
-                <w:color w:val="000000"/>
-                <w:sz w:val="32"/>
-                <w:szCs w:val="40"/>
+                <w:lang w:val="it-IT"/>
+              </w:rPr>
+              <w:t>–</w:t>
+            </w:r>
+            <w:r>
+              <w:rPr>
+                <w:rFonts w:ascii="BRH Malayalam Extra" w:hAnsi="BRH Malayalam Extra" w:cs="BRH Malayalam Extra"/>
+                <w:color w:val="000000"/>
+                <w:sz w:val="32"/>
+                <w:szCs w:val="40"/>
+                <w:lang w:val="it-IT"/>
               </w:rPr>
               <w:t xml:space="preserve">t(MÞ§) sõ—¥² | </w:t>
             </w:r>
@@ -21560,6 +21763,7 @@
                 <w:color w:val="000000"/>
                 <w:sz w:val="32"/>
                 <w:szCs w:val="40"/>
+                <w:lang w:val="it-IT"/>
               </w:rPr>
             </w:pPr>
             <w:r>
@@ -21568,6 +21772,7 @@
                 <w:color w:val="000000"/>
                 <w:sz w:val="32"/>
                 <w:szCs w:val="40"/>
+                <w:lang w:val="it-IT"/>
               </w:rPr>
               <w:t>A</w:t>
             </w:r>
@@ -21577,15 +21782,17 @@
                 <w:color w:val="000000"/>
                 <w:sz w:val="28"/>
                 <w:szCs w:val="40"/>
-              </w:rPr>
-              <w:t>–</w:t>
-            </w:r>
-            <w:r>
-              <w:rPr>
-                <w:rFonts w:ascii="BRH Malayalam Extra" w:hAnsi="BRH Malayalam Extra" w:cs="BRH Malayalam Extra"/>
-                <w:color w:val="000000"/>
-                <w:sz w:val="32"/>
-                <w:szCs w:val="40"/>
+                <w:lang w:val="it-IT"/>
+              </w:rPr>
+              <w:t>–</w:t>
+            </w:r>
+            <w:r>
+              <w:rPr>
+                <w:rFonts w:ascii="BRH Malayalam Extra" w:hAnsi="BRH Malayalam Extra" w:cs="BRH Malayalam Extra"/>
+                <w:color w:val="000000"/>
+                <w:sz w:val="32"/>
+                <w:szCs w:val="40"/>
+                <w:lang w:val="it-IT"/>
               </w:rPr>
               <w:t>tû</w:t>
             </w:r>
@@ -21595,15 +21802,17 @@
                 <w:color w:val="000000"/>
                 <w:sz w:val="28"/>
                 <w:szCs w:val="40"/>
-              </w:rPr>
-              <w:t>–</w:t>
-            </w:r>
-            <w:r>
-              <w:rPr>
-                <w:rFonts w:ascii="BRH Malayalam Extra" w:hAnsi="BRH Malayalam Extra" w:cs="BRH Malayalam Extra"/>
-                <w:color w:val="000000"/>
-                <w:sz w:val="32"/>
-                <w:szCs w:val="40"/>
+                <w:lang w:val="it-IT"/>
+              </w:rPr>
+              <w:t>–</w:t>
+            </w:r>
+            <w:r>
+              <w:rPr>
+                <w:rFonts w:ascii="BRH Malayalam Extra" w:hAnsi="BRH Malayalam Extra" w:cs="BRH Malayalam Extra"/>
+                <w:color w:val="000000"/>
+                <w:sz w:val="32"/>
+                <w:szCs w:val="40"/>
+                <w:lang w:val="it-IT"/>
               </w:rPr>
               <w:t xml:space="preserve"> D¦</w:t>
             </w:r>
@@ -21613,15 +21822,17 @@
                 <w:color w:val="000000"/>
                 <w:sz w:val="28"/>
                 <w:szCs w:val="40"/>
-              </w:rPr>
-              <w:t>–</w:t>
-            </w:r>
-            <w:r>
-              <w:rPr>
-                <w:rFonts w:ascii="BRH Malayalam Extra" w:hAnsi="BRH Malayalam Extra" w:cs="BRH Malayalam Extra"/>
-                <w:color w:val="000000"/>
-                <w:sz w:val="32"/>
-                <w:szCs w:val="40"/>
+                <w:lang w:val="it-IT"/>
+              </w:rPr>
+              <w:t>–</w:t>
+            </w:r>
+            <w:r>
+              <w:rPr>
+                <w:rFonts w:ascii="BRH Malayalam Extra" w:hAnsi="BRH Malayalam Extra" w:cs="BRH Malayalam Extra"/>
+                <w:color w:val="000000"/>
+                <w:sz w:val="32"/>
+                <w:szCs w:val="40"/>
+                <w:lang w:val="it-IT"/>
               </w:rPr>
               <w:t>Zj— D¦</w:t>
             </w:r>
@@ -21631,15 +21842,17 @@
                 <w:color w:val="000000"/>
                 <w:sz w:val="28"/>
                 <w:szCs w:val="40"/>
-              </w:rPr>
-              <w:t>–</w:t>
-            </w:r>
-            <w:r>
-              <w:rPr>
-                <w:rFonts w:ascii="BRH Malayalam Extra" w:hAnsi="BRH Malayalam Extra" w:cs="BRH Malayalam Extra"/>
-                <w:color w:val="000000"/>
-                <w:sz w:val="32"/>
-                <w:szCs w:val="40"/>
+                <w:lang w:val="it-IT"/>
+              </w:rPr>
+              <w:t>–</w:t>
+            </w:r>
+            <w:r>
+              <w:rPr>
+                <w:rFonts w:ascii="BRH Malayalam Extra" w:hAnsi="BRH Malayalam Extra" w:cs="BRH Malayalam Extra"/>
+                <w:color w:val="000000"/>
+                <w:sz w:val="32"/>
+                <w:szCs w:val="40"/>
+                <w:lang w:val="it-IT"/>
               </w:rPr>
               <w:t>Z¥j— A¥tû Atû D¦</w:t>
             </w:r>
@@ -21649,15 +21862,17 @@
                 <w:color w:val="000000"/>
                 <w:sz w:val="28"/>
                 <w:szCs w:val="40"/>
-              </w:rPr>
-              <w:t>–</w:t>
-            </w:r>
-            <w:r>
-              <w:rPr>
-                <w:rFonts w:ascii="BRH Malayalam Extra" w:hAnsi="BRH Malayalam Extra" w:cs="BRH Malayalam Extra"/>
-                <w:color w:val="000000"/>
-                <w:sz w:val="32"/>
-                <w:szCs w:val="40"/>
+                <w:lang w:val="it-IT"/>
+              </w:rPr>
+              <w:t>–</w:t>
+            </w:r>
+            <w:r>
+              <w:rPr>
+                <w:rFonts w:ascii="BRH Malayalam Extra" w:hAnsi="BRH Malayalam Extra" w:cs="BRH Malayalam Extra"/>
+                <w:color w:val="000000"/>
+                <w:sz w:val="32"/>
+                <w:szCs w:val="40"/>
+                <w:lang w:val="it-IT"/>
               </w:rPr>
               <w:t>Z¥j</w:t>
             </w:r>
@@ -21667,15 +21882,17 @@
                 <w:color w:val="000000"/>
                 <w:sz w:val="28"/>
                 <w:szCs w:val="40"/>
-              </w:rPr>
-              <w:t>–</w:t>
-            </w:r>
-            <w:r>
-              <w:rPr>
-                <w:rFonts w:ascii="BRH Malayalam Extra" w:hAnsi="BRH Malayalam Extra" w:cs="BRH Malayalam Extra"/>
-                <w:color w:val="000000"/>
-                <w:sz w:val="32"/>
-                <w:szCs w:val="40"/>
+                <w:lang w:val="it-IT"/>
+              </w:rPr>
+              <w:t>–</w:t>
+            </w:r>
+            <w:r>
+              <w:rPr>
+                <w:rFonts w:ascii="BRH Malayalam Extra" w:hAnsi="BRH Malayalam Extra" w:cs="BRH Malayalam Extra"/>
+                <w:color w:val="000000"/>
+                <w:sz w:val="32"/>
+                <w:szCs w:val="40"/>
+                <w:lang w:val="it-IT"/>
               </w:rPr>
               <w:t xml:space="preserve"> </w:t>
             </w:r>
@@ -21692,6 +21909,7 @@
                 <w:color w:val="000000"/>
                 <w:sz w:val="32"/>
                 <w:szCs w:val="40"/>
+                <w:lang w:val="it-IT"/>
               </w:rPr>
             </w:pPr>
             <w:r>
@@ -21700,6 +21918,7 @@
                 <w:color w:val="000000"/>
                 <w:sz w:val="32"/>
                 <w:szCs w:val="40"/>
+                <w:lang w:val="it-IT"/>
               </w:rPr>
               <w:t>q¡</w:t>
             </w:r>
@@ -21710,6 +21929,7 @@
                 <w:sz w:val="32"/>
                 <w:szCs w:val="40"/>
                 <w:highlight w:val="yellow"/>
+                <w:lang w:val="it-IT"/>
               </w:rPr>
               <w:t>h</w:t>
             </w:r>
@@ -21720,6 +21940,7 @@
                 <w:sz w:val="28"/>
                 <w:szCs w:val="40"/>
                 <w:highlight w:val="yellow"/>
+                <w:lang w:val="it-IT"/>
               </w:rPr>
               <w:t>–</w:t>
             </w:r>
@@ -21730,6 +21951,7 @@
                 <w:sz w:val="32"/>
                 <w:szCs w:val="40"/>
                 <w:highlight w:val="yellow"/>
+                <w:lang w:val="it-IT"/>
               </w:rPr>
               <w:t>I</w:t>
             </w:r>
@@ -21739,6 +21961,7 @@
                 <w:color w:val="000000"/>
                 <w:sz w:val="32"/>
                 <w:szCs w:val="40"/>
+                <w:lang w:val="it-IT"/>
               </w:rPr>
               <w:t xml:space="preserve"> q¡h— i¢</w:t>
             </w:r>
@@ -21748,15 +21971,17 @@
                 <w:color w:val="000000"/>
                 <w:sz w:val="28"/>
                 <w:szCs w:val="40"/>
-              </w:rPr>
-              <w:t>–</w:t>
-            </w:r>
-            <w:r>
-              <w:rPr>
-                <w:rFonts w:ascii="BRH Malayalam Extra" w:hAnsi="BRH Malayalam Extra" w:cs="BRH Malayalam Extra"/>
-                <w:color w:val="000000"/>
-                <w:sz w:val="32"/>
-                <w:szCs w:val="40"/>
+                <w:lang w:val="it-IT"/>
+              </w:rPr>
+              <w:t>–</w:t>
+            </w:r>
+            <w:r>
+              <w:rPr>
+                <w:rFonts w:ascii="BRH Malayalam Extra" w:hAnsi="BRH Malayalam Extra" w:cs="BRH Malayalam Extra"/>
+                <w:color w:val="000000"/>
+                <w:sz w:val="32"/>
+                <w:szCs w:val="40"/>
+                <w:lang w:val="it-IT"/>
               </w:rPr>
               <w:t>Z¥j— A¥tû Atû D¦</w:t>
             </w:r>
@@ -21766,15 +21991,17 @@
                 <w:color w:val="000000"/>
                 <w:sz w:val="28"/>
                 <w:szCs w:val="40"/>
-              </w:rPr>
-              <w:t>–</w:t>
-            </w:r>
-            <w:r>
-              <w:rPr>
-                <w:rFonts w:ascii="BRH Malayalam Extra" w:hAnsi="BRH Malayalam Extra" w:cs="BRH Malayalam Extra"/>
-                <w:color w:val="000000"/>
-                <w:sz w:val="32"/>
-                <w:szCs w:val="40"/>
+                <w:lang w:val="it-IT"/>
+              </w:rPr>
+              <w:t>–</w:t>
+            </w:r>
+            <w:r>
+              <w:rPr>
+                <w:rFonts w:ascii="BRH Malayalam Extra" w:hAnsi="BRH Malayalam Extra" w:cs="BRH Malayalam Extra"/>
+                <w:color w:val="000000"/>
+                <w:sz w:val="32"/>
+                <w:szCs w:val="40"/>
+                <w:lang w:val="it-IT"/>
               </w:rPr>
               <w:t>Z¥j</w:t>
             </w:r>
@@ -21784,15 +22011,17 @@
                 <w:color w:val="000000"/>
                 <w:sz w:val="28"/>
                 <w:szCs w:val="40"/>
-              </w:rPr>
-              <w:t>–</w:t>
-            </w:r>
-            <w:r>
-              <w:rPr>
-                <w:rFonts w:ascii="BRH Malayalam Extra" w:hAnsi="BRH Malayalam Extra" w:cs="BRH Malayalam Extra"/>
-                <w:color w:val="000000"/>
-                <w:sz w:val="32"/>
-                <w:szCs w:val="40"/>
+                <w:lang w:val="it-IT"/>
+              </w:rPr>
+              <w:t>–</w:t>
+            </w:r>
+            <w:r>
+              <w:rPr>
+                <w:rFonts w:ascii="BRH Malayalam Extra" w:hAnsi="BRH Malayalam Extra" w:cs="BRH Malayalam Extra"/>
+                <w:color w:val="000000"/>
+                <w:sz w:val="32"/>
+                <w:szCs w:val="40"/>
+                <w:lang w:val="it-IT"/>
               </w:rPr>
               <w:t xml:space="preserve"> </w:t>
             </w:r>
@@ -21809,6 +22038,7 @@
                 <w:color w:val="000000"/>
                 <w:sz w:val="32"/>
                 <w:szCs w:val="40"/>
+                <w:lang w:val="it-IT"/>
               </w:rPr>
             </w:pPr>
             <w:r>
@@ -21817,6 +22047,7 @@
                 <w:color w:val="000000"/>
                 <w:sz w:val="32"/>
                 <w:szCs w:val="40"/>
+                <w:lang w:val="it-IT"/>
               </w:rPr>
               <w:t xml:space="preserve">q¡h˜I | </w:t>
             </w:r>
@@ -21833,6 +22064,7 @@
                 <w:color w:val="000000"/>
                 <w:sz w:val="32"/>
                 <w:szCs w:val="40"/>
+                <w:lang w:val="it-IT"/>
               </w:rPr>
             </w:pPr>
             <w:r>
@@ -21840,6 +22072,7 @@
                 <w:rFonts w:cs="BRH Malayalam Extra"/>
                 <w:color w:val="000000"/>
                 <w:szCs w:val="40"/>
+                <w:lang w:val="it-IT"/>
               </w:rPr>
               <w:t>50</w:t>
             </w:r>
@@ -21849,6 +22082,7 @@
                 <w:color w:val="000000"/>
                 <w:sz w:val="32"/>
                 <w:szCs w:val="40"/>
+                <w:lang w:val="it-IT"/>
               </w:rPr>
               <w:t>)</w:t>
             </w:r>
@@ -21858,6 +22092,7 @@
                 <w:color w:val="000000"/>
                 <w:sz w:val="32"/>
                 <w:szCs w:val="40"/>
+                <w:lang w:val="it-IT"/>
               </w:rPr>
               <w:tab/>
             </w:r>
@@ -21866,6 +22101,7 @@
                 <w:rFonts w:cs="BRH Malayalam Extra"/>
                 <w:color w:val="000000"/>
                 <w:szCs w:val="40"/>
+                <w:lang w:val="it-IT"/>
               </w:rPr>
               <w:t>4</w:t>
             </w:r>
@@ -21875,6 +22111,7 @@
                 <w:color w:val="000000"/>
                 <w:sz w:val="32"/>
                 <w:szCs w:val="40"/>
+                <w:lang w:val="it-IT"/>
               </w:rPr>
               <w:t>.</w:t>
             </w:r>
@@ -21883,6 +22120,7 @@
                 <w:rFonts w:cs="BRH Malayalam Extra"/>
                 <w:color w:val="000000"/>
                 <w:szCs w:val="40"/>
+                <w:lang w:val="it-IT"/>
               </w:rPr>
               <w:t>7</w:t>
             </w:r>
@@ -21892,6 +22130,7 @@
                 <w:color w:val="000000"/>
                 <w:sz w:val="32"/>
                 <w:szCs w:val="40"/>
+                <w:lang w:val="it-IT"/>
               </w:rPr>
               <w:t>.</w:t>
             </w:r>
@@ -21900,6 +22139,7 @@
                 <w:rFonts w:cs="BRH Malayalam Extra"/>
                 <w:color w:val="000000"/>
                 <w:szCs w:val="40"/>
+                <w:lang w:val="it-IT"/>
               </w:rPr>
               <w:t>15</w:t>
             </w:r>
@@ -21909,6 +22149,7 @@
                 <w:color w:val="000000"/>
                 <w:sz w:val="32"/>
                 <w:szCs w:val="40"/>
+                <w:lang w:val="it-IT"/>
               </w:rPr>
               <w:t>.</w:t>
             </w:r>
@@ -21917,6 +22158,7 @@
                 <w:rFonts w:cs="BRH Malayalam Extra"/>
                 <w:color w:val="000000"/>
                 <w:szCs w:val="40"/>
+                <w:lang w:val="it-IT"/>
               </w:rPr>
               <w:t>3</w:t>
             </w:r>
@@ -21926,6 +22168,7 @@
                 <w:color w:val="000000"/>
                 <w:sz w:val="32"/>
                 <w:szCs w:val="40"/>
+                <w:lang w:val="it-IT"/>
               </w:rPr>
               <w:t>(</w:t>
             </w:r>
@@ -21934,6 +22177,7 @@
                 <w:rFonts w:cs="BRH Malayalam Extra"/>
                 <w:color w:val="000000"/>
                 <w:szCs w:val="40"/>
+                <w:lang w:val="it-IT"/>
               </w:rPr>
               <w:t>45</w:t>
             </w:r>
@@ -21943,6 +22187,7 @@
                 <w:color w:val="000000"/>
                 <w:sz w:val="32"/>
                 <w:szCs w:val="40"/>
+                <w:lang w:val="it-IT"/>
               </w:rPr>
               <w:t>)- D¦</w:t>
             </w:r>
@@ -21952,15 +22197,17 @@
                 <w:color w:val="000000"/>
                 <w:sz w:val="28"/>
                 <w:szCs w:val="40"/>
-              </w:rPr>
-              <w:t>–</w:t>
-            </w:r>
-            <w:r>
-              <w:rPr>
-                <w:rFonts w:ascii="BRH Malayalam Extra" w:hAnsi="BRH Malayalam Extra" w:cs="BRH Malayalam Extra"/>
-                <w:color w:val="000000"/>
-                <w:sz w:val="32"/>
-                <w:szCs w:val="40"/>
+                <w:lang w:val="it-IT"/>
+              </w:rPr>
+              <w:t>–</w:t>
+            </w:r>
+            <w:r>
+              <w:rPr>
+                <w:rFonts w:ascii="BRH Malayalam Extra" w:hAnsi="BRH Malayalam Extra" w:cs="BRH Malayalam Extra"/>
+                <w:color w:val="000000"/>
+                <w:sz w:val="32"/>
+                <w:szCs w:val="40"/>
+                <w:lang w:val="it-IT"/>
               </w:rPr>
               <w:t>Z¥j˜ | q¡h˜I | Miy—rç¦ |</w:t>
             </w:r>
@@ -21977,6 +22224,7 @@
                 <w:color w:val="000000"/>
                 <w:sz w:val="32"/>
                 <w:szCs w:val="40"/>
+                <w:lang w:val="it-IT"/>
               </w:rPr>
             </w:pPr>
             <w:r>
@@ -21985,6 +22233,7 @@
                 <w:color w:val="000000"/>
                 <w:sz w:val="32"/>
                 <w:szCs w:val="40"/>
+                <w:lang w:val="it-IT"/>
               </w:rPr>
               <w:t>D¦</w:t>
             </w:r>
@@ -21994,15 +22243,17 @@
                 <w:color w:val="000000"/>
                 <w:sz w:val="28"/>
                 <w:szCs w:val="40"/>
-              </w:rPr>
-              <w:t>–</w:t>
-            </w:r>
-            <w:r>
-              <w:rPr>
-                <w:rFonts w:ascii="BRH Malayalam Extra" w:hAnsi="BRH Malayalam Extra" w:cs="BRH Malayalam Extra"/>
-                <w:color w:val="000000"/>
-                <w:sz w:val="32"/>
-                <w:szCs w:val="40"/>
+                <w:lang w:val="it-IT"/>
+              </w:rPr>
+              <w:t>–</w:t>
+            </w:r>
+            <w:r>
+              <w:rPr>
+                <w:rFonts w:ascii="BRH Malayalam Extra" w:hAnsi="BRH Malayalam Extra" w:cs="BRH Malayalam Extra"/>
+                <w:color w:val="000000"/>
+                <w:sz w:val="32"/>
+                <w:szCs w:val="40"/>
+                <w:lang w:val="it-IT"/>
               </w:rPr>
               <w:t>Z¥j</w:t>
             </w:r>
@@ -22012,15 +22263,17 @@
                 <w:color w:val="000000"/>
                 <w:sz w:val="28"/>
                 <w:szCs w:val="40"/>
-              </w:rPr>
-              <w:t>–</w:t>
-            </w:r>
-            <w:r>
-              <w:rPr>
-                <w:rFonts w:ascii="BRH Malayalam Extra" w:hAnsi="BRH Malayalam Extra" w:cs="BRH Malayalam Extra"/>
-                <w:color w:val="000000"/>
-                <w:sz w:val="32"/>
-                <w:szCs w:val="40"/>
+                <w:lang w:val="it-IT"/>
+              </w:rPr>
+              <w:t>–</w:t>
+            </w:r>
+            <w:r>
+              <w:rPr>
+                <w:rFonts w:ascii="BRH Malayalam Extra" w:hAnsi="BRH Malayalam Extra" w:cs="BRH Malayalam Extra"/>
+                <w:color w:val="000000"/>
+                <w:sz w:val="32"/>
+                <w:szCs w:val="40"/>
+                <w:lang w:val="it-IT"/>
               </w:rPr>
               <w:t xml:space="preserve"> q¡h</w:t>
             </w:r>
@@ -22031,6 +22284,7 @@
                 <w:sz w:val="28"/>
                 <w:szCs w:val="40"/>
                 <w:highlight w:val="yellow"/>
+                <w:lang w:val="it-IT"/>
               </w:rPr>
               <w:t>–</w:t>
             </w:r>
@@ -22041,6 +22295,7 @@
                 <w:sz w:val="32"/>
                 <w:szCs w:val="40"/>
                 <w:highlight w:val="yellow"/>
+                <w:lang w:val="it-IT"/>
               </w:rPr>
               <w:t>I</w:t>
             </w:r>
@@ -22050,6 +22305,7 @@
                 <w:color w:val="000000"/>
                 <w:sz w:val="32"/>
                 <w:szCs w:val="40"/>
+                <w:lang w:val="it-IT"/>
               </w:rPr>
               <w:t xml:space="preserve"> q¡h— i¢</w:t>
             </w:r>
@@ -22059,15 +22315,17 @@
                 <w:color w:val="000000"/>
                 <w:sz w:val="28"/>
                 <w:szCs w:val="40"/>
-              </w:rPr>
-              <w:t>–</w:t>
-            </w:r>
-            <w:r>
-              <w:rPr>
-                <w:rFonts w:ascii="BRH Malayalam Extra" w:hAnsi="BRH Malayalam Extra" w:cs="BRH Malayalam Extra"/>
-                <w:color w:val="000000"/>
-                <w:sz w:val="32"/>
-                <w:szCs w:val="40"/>
+                <w:lang w:val="it-IT"/>
+              </w:rPr>
+              <w:t>–</w:t>
+            </w:r>
+            <w:r>
+              <w:rPr>
+                <w:rFonts w:ascii="BRH Malayalam Extra" w:hAnsi="BRH Malayalam Extra" w:cs="BRH Malayalam Extra"/>
+                <w:color w:val="000000"/>
+                <w:sz w:val="32"/>
+                <w:szCs w:val="40"/>
+                <w:lang w:val="it-IT"/>
               </w:rPr>
               <w:t>Zj— D¦</w:t>
             </w:r>
@@ -22077,15 +22335,17 @@
                 <w:color w:val="000000"/>
                 <w:sz w:val="28"/>
                 <w:szCs w:val="40"/>
-              </w:rPr>
-              <w:t>–</w:t>
-            </w:r>
-            <w:r>
-              <w:rPr>
-                <w:rFonts w:ascii="BRH Malayalam Extra" w:hAnsi="BRH Malayalam Extra" w:cs="BRH Malayalam Extra"/>
-                <w:color w:val="000000"/>
-                <w:sz w:val="32"/>
-                <w:szCs w:val="40"/>
+                <w:lang w:val="it-IT"/>
+              </w:rPr>
+              <w:t>–</w:t>
+            </w:r>
+            <w:r>
+              <w:rPr>
+                <w:rFonts w:ascii="BRH Malayalam Extra" w:hAnsi="BRH Malayalam Extra" w:cs="BRH Malayalam Extra"/>
+                <w:color w:val="000000"/>
+                <w:sz w:val="32"/>
+                <w:szCs w:val="40"/>
+                <w:lang w:val="it-IT"/>
               </w:rPr>
               <w:t>Z¥j</w:t>
             </w:r>
@@ -22095,15 +22355,17 @@
                 <w:color w:val="000000"/>
                 <w:sz w:val="28"/>
                 <w:szCs w:val="40"/>
-              </w:rPr>
-              <w:t>–</w:t>
-            </w:r>
-            <w:r>
-              <w:rPr>
-                <w:rFonts w:ascii="BRH Malayalam Extra" w:hAnsi="BRH Malayalam Extra" w:cs="BRH Malayalam Extra"/>
-                <w:color w:val="000000"/>
-                <w:sz w:val="32"/>
-                <w:szCs w:val="40"/>
+                <w:lang w:val="it-IT"/>
+              </w:rPr>
+              <w:t>–</w:t>
+            </w:r>
+            <w:r>
+              <w:rPr>
+                <w:rFonts w:ascii="BRH Malayalam Extra" w:hAnsi="BRH Malayalam Extra" w:cs="BRH Malayalam Extra"/>
+                <w:color w:val="000000"/>
+                <w:sz w:val="32"/>
+                <w:szCs w:val="40"/>
+                <w:lang w:val="it-IT"/>
               </w:rPr>
               <w:t xml:space="preserve"> q¡h</w:t>
             </w:r>
@@ -22113,15 +22375,17 @@
                 <w:color w:val="000000"/>
                 <w:sz w:val="28"/>
                 <w:szCs w:val="40"/>
-              </w:rPr>
-              <w:t>–</w:t>
-            </w:r>
-            <w:r>
-              <w:rPr>
-                <w:rFonts w:ascii="BRH Malayalam Extra" w:hAnsi="BRH Malayalam Extra" w:cs="BRH Malayalam Extra"/>
-                <w:color w:val="000000"/>
-                <w:sz w:val="32"/>
-                <w:szCs w:val="40"/>
+                <w:lang w:val="it-IT"/>
+              </w:rPr>
+              <w:t>–</w:t>
+            </w:r>
+            <w:r>
+              <w:rPr>
+                <w:rFonts w:ascii="BRH Malayalam Extra" w:hAnsi="BRH Malayalam Extra" w:cs="BRH Malayalam Extra"/>
+                <w:color w:val="000000"/>
+                <w:sz w:val="32"/>
+                <w:szCs w:val="40"/>
+                <w:lang w:val="it-IT"/>
               </w:rPr>
               <w:t xml:space="preserve">I </w:t>
             </w:r>
@@ -22138,6 +22402,7 @@
                 <w:color w:val="000000"/>
                 <w:sz w:val="32"/>
                 <w:szCs w:val="40"/>
+                <w:lang w:val="it-IT"/>
               </w:rPr>
             </w:pPr>
             <w:r>
@@ -22146,6 +22411,7 @@
                 <w:color w:val="000000"/>
                 <w:sz w:val="32"/>
                 <w:szCs w:val="40"/>
+                <w:lang w:val="it-IT"/>
               </w:rPr>
               <w:t>Miy—rç¦</w:t>
             </w:r>
@@ -22155,15 +22421,17 @@
                 <w:color w:val="000000"/>
                 <w:sz w:val="28"/>
                 <w:szCs w:val="40"/>
-              </w:rPr>
-              <w:t>–</w:t>
-            </w:r>
-            <w:r>
-              <w:rPr>
-                <w:rFonts w:ascii="BRH Malayalam Extra" w:hAnsi="BRH Malayalam Extra" w:cs="BRH Malayalam Extra"/>
-                <w:color w:val="000000"/>
-                <w:sz w:val="32"/>
-                <w:szCs w:val="40"/>
+                <w:lang w:val="it-IT"/>
+              </w:rPr>
+              <w:t>–</w:t>
+            </w:r>
+            <w:r>
+              <w:rPr>
+                <w:rFonts w:ascii="BRH Malayalam Extra" w:hAnsi="BRH Malayalam Extra" w:cs="BRH Malayalam Extra"/>
+                <w:color w:val="000000"/>
+                <w:sz w:val="32"/>
+                <w:szCs w:val="40"/>
+                <w:lang w:val="it-IT"/>
               </w:rPr>
               <w:t xml:space="preserve"> Miy—rç¦</w:t>
             </w:r>
@@ -22173,15 +22441,17 @@
                 <w:color w:val="000000"/>
                 <w:sz w:val="28"/>
                 <w:szCs w:val="40"/>
-              </w:rPr>
-              <w:t>–</w:t>
-            </w:r>
-            <w:r>
-              <w:rPr>
-                <w:rFonts w:ascii="BRH Malayalam Extra" w:hAnsi="BRH Malayalam Extra" w:cs="BRH Malayalam Extra"/>
-                <w:color w:val="000000"/>
-                <w:sz w:val="32"/>
-                <w:szCs w:val="40"/>
+                <w:lang w:val="it-IT"/>
+              </w:rPr>
+              <w:t>–</w:t>
+            </w:r>
+            <w:r>
+              <w:rPr>
+                <w:rFonts w:ascii="BRH Malayalam Extra" w:hAnsi="BRH Malayalam Extra" w:cs="BRH Malayalam Extra"/>
+                <w:color w:val="000000"/>
+                <w:sz w:val="32"/>
+                <w:szCs w:val="40"/>
+                <w:lang w:val="it-IT"/>
               </w:rPr>
               <w:t xml:space="preserve"> q¡h— i¢</w:t>
             </w:r>
@@ -22191,15 +22461,17 @@
                 <w:color w:val="000000"/>
                 <w:sz w:val="28"/>
                 <w:szCs w:val="40"/>
-              </w:rPr>
-              <w:t>–</w:t>
-            </w:r>
-            <w:r>
-              <w:rPr>
-                <w:rFonts w:ascii="BRH Malayalam Extra" w:hAnsi="BRH Malayalam Extra" w:cs="BRH Malayalam Extra"/>
-                <w:color w:val="000000"/>
-                <w:sz w:val="32"/>
-                <w:szCs w:val="40"/>
+                <w:lang w:val="it-IT"/>
+              </w:rPr>
+              <w:t>–</w:t>
+            </w:r>
+            <w:r>
+              <w:rPr>
+                <w:rFonts w:ascii="BRH Malayalam Extra" w:hAnsi="BRH Malayalam Extra" w:cs="BRH Malayalam Extra"/>
+                <w:color w:val="000000"/>
+                <w:sz w:val="32"/>
+                <w:szCs w:val="40"/>
+                <w:lang w:val="it-IT"/>
               </w:rPr>
               <w:t>Zj— D¦</w:t>
             </w:r>
@@ -22209,15 +22481,17 @@
                 <w:color w:val="000000"/>
                 <w:sz w:val="28"/>
                 <w:szCs w:val="40"/>
-              </w:rPr>
-              <w:t>–</w:t>
-            </w:r>
-            <w:r>
-              <w:rPr>
-                <w:rFonts w:ascii="BRH Malayalam Extra" w:hAnsi="BRH Malayalam Extra" w:cs="BRH Malayalam Extra"/>
-                <w:color w:val="000000"/>
-                <w:sz w:val="32"/>
-                <w:szCs w:val="40"/>
+                <w:lang w:val="it-IT"/>
+              </w:rPr>
+              <w:t>–</w:t>
+            </w:r>
+            <w:r>
+              <w:rPr>
+                <w:rFonts w:ascii="BRH Malayalam Extra" w:hAnsi="BRH Malayalam Extra" w:cs="BRH Malayalam Extra"/>
+                <w:color w:val="000000"/>
+                <w:sz w:val="32"/>
+                <w:szCs w:val="40"/>
+                <w:lang w:val="it-IT"/>
               </w:rPr>
               <w:t>Z¥j</w:t>
             </w:r>
@@ -22227,15 +22501,17 @@
                 <w:color w:val="000000"/>
                 <w:sz w:val="28"/>
                 <w:szCs w:val="40"/>
-              </w:rPr>
-              <w:t>–</w:t>
-            </w:r>
-            <w:r>
-              <w:rPr>
-                <w:rFonts w:ascii="BRH Malayalam Extra" w:hAnsi="BRH Malayalam Extra" w:cs="BRH Malayalam Extra"/>
-                <w:color w:val="000000"/>
-                <w:sz w:val="32"/>
-                <w:szCs w:val="40"/>
+                <w:lang w:val="it-IT"/>
+              </w:rPr>
+              <w:t>–</w:t>
+            </w:r>
+            <w:r>
+              <w:rPr>
+                <w:rFonts w:ascii="BRH Malayalam Extra" w:hAnsi="BRH Malayalam Extra" w:cs="BRH Malayalam Extra"/>
+                <w:color w:val="000000"/>
+                <w:sz w:val="32"/>
+                <w:szCs w:val="40"/>
+                <w:lang w:val="it-IT"/>
               </w:rPr>
               <w:t xml:space="preserve"> q¡h</w:t>
             </w:r>
@@ -22245,15 +22521,17 @@
                 <w:color w:val="000000"/>
                 <w:sz w:val="28"/>
                 <w:szCs w:val="40"/>
-              </w:rPr>
-              <w:t>–</w:t>
-            </w:r>
-            <w:r>
-              <w:rPr>
-                <w:rFonts w:ascii="BRH Malayalam Extra" w:hAnsi="BRH Malayalam Extra" w:cs="BRH Malayalam Extra"/>
-                <w:color w:val="000000"/>
-                <w:sz w:val="32"/>
-                <w:szCs w:val="40"/>
+                <w:lang w:val="it-IT"/>
+              </w:rPr>
+              <w:t>–</w:t>
+            </w:r>
+            <w:r>
+              <w:rPr>
+                <w:rFonts w:ascii="BRH Malayalam Extra" w:hAnsi="BRH Malayalam Extra" w:cs="BRH Malayalam Extra"/>
+                <w:color w:val="000000"/>
+                <w:sz w:val="32"/>
+                <w:szCs w:val="40"/>
+                <w:lang w:val="it-IT"/>
               </w:rPr>
               <w:t xml:space="preserve">I </w:t>
             </w:r>
@@ -22270,6 +22548,7 @@
                 <w:color w:val="000000"/>
                 <w:sz w:val="32"/>
                 <w:szCs w:val="40"/>
+                <w:lang w:val="it-IT"/>
               </w:rPr>
             </w:pPr>
             <w:r>
@@ -22278,6 +22557,7 @@
                 <w:color w:val="000000"/>
                 <w:sz w:val="32"/>
                 <w:szCs w:val="40"/>
+                <w:lang w:val="it-IT"/>
               </w:rPr>
               <w:t xml:space="preserve">Miy—rç¦ | </w:t>
             </w:r>
@@ -22294,6 +22574,7 @@
                 <w:color w:val="000000"/>
                 <w:sz w:val="32"/>
                 <w:szCs w:val="40"/>
+                <w:lang w:val="it-IT"/>
               </w:rPr>
             </w:pPr>
             <w:r>
@@ -22301,6 +22582,7 @@
                 <w:rFonts w:cs="BRH Malayalam Extra"/>
                 <w:color w:val="000000"/>
                 <w:szCs w:val="40"/>
+                <w:lang w:val="it-IT"/>
               </w:rPr>
               <w:t>51</w:t>
             </w:r>
@@ -22310,6 +22592,7 @@
                 <w:color w:val="000000"/>
                 <w:sz w:val="32"/>
                 <w:szCs w:val="40"/>
+                <w:lang w:val="it-IT"/>
               </w:rPr>
               <w:t>)</w:t>
             </w:r>
@@ -22319,6 +22602,7 @@
                 <w:color w:val="000000"/>
                 <w:sz w:val="32"/>
                 <w:szCs w:val="40"/>
+                <w:lang w:val="it-IT"/>
               </w:rPr>
               <w:tab/>
             </w:r>
@@ -22327,6 +22611,7 @@
                 <w:rFonts w:cs="BRH Malayalam Extra"/>
                 <w:color w:val="000000"/>
                 <w:szCs w:val="40"/>
+                <w:lang w:val="it-IT"/>
               </w:rPr>
               <w:t>4</w:t>
             </w:r>
@@ -22336,6 +22621,7 @@
                 <w:color w:val="000000"/>
                 <w:sz w:val="32"/>
                 <w:szCs w:val="40"/>
+                <w:lang w:val="it-IT"/>
               </w:rPr>
               <w:t>.</w:t>
             </w:r>
@@ -22344,6 +22630,7 @@
                 <w:rFonts w:cs="BRH Malayalam Extra"/>
                 <w:color w:val="000000"/>
                 <w:szCs w:val="40"/>
+                <w:lang w:val="it-IT"/>
               </w:rPr>
               <w:t>7</w:t>
             </w:r>
@@ -22353,6 +22640,7 @@
                 <w:color w:val="000000"/>
                 <w:sz w:val="32"/>
                 <w:szCs w:val="40"/>
+                <w:lang w:val="it-IT"/>
               </w:rPr>
               <w:t>.</w:t>
             </w:r>
@@ -22361,6 +22649,7 @@
                 <w:rFonts w:cs="BRH Malayalam Extra"/>
                 <w:color w:val="000000"/>
                 <w:szCs w:val="40"/>
+                <w:lang w:val="it-IT"/>
               </w:rPr>
               <w:t>15</w:t>
             </w:r>
@@ -22370,6 +22659,7 @@
                 <w:color w:val="000000"/>
                 <w:sz w:val="32"/>
                 <w:szCs w:val="40"/>
+                <w:lang w:val="it-IT"/>
               </w:rPr>
               <w:t>.</w:t>
             </w:r>
@@ -22378,6 +22668,7 @@
                 <w:rFonts w:cs="BRH Malayalam Extra"/>
                 <w:color w:val="000000"/>
                 <w:szCs w:val="40"/>
+                <w:lang w:val="it-IT"/>
               </w:rPr>
               <w:t>3</w:t>
             </w:r>
@@ -22387,6 +22678,7 @@
                 <w:color w:val="000000"/>
                 <w:sz w:val="32"/>
                 <w:szCs w:val="40"/>
+                <w:lang w:val="it-IT"/>
               </w:rPr>
               <w:t>(</w:t>
             </w:r>
@@ -22395,6 +22687,7 @@
                 <w:rFonts w:cs="BRH Malayalam Extra"/>
                 <w:color w:val="000000"/>
                 <w:szCs w:val="40"/>
+                <w:lang w:val="it-IT"/>
               </w:rPr>
               <w:t>46</w:t>
             </w:r>
@@ -22404,6 +22697,7 @@
                 <w:color w:val="000000"/>
                 <w:sz w:val="32"/>
                 <w:szCs w:val="40"/>
+                <w:lang w:val="it-IT"/>
               </w:rPr>
               <w:t>)- q¡h˜I | Miy—rç¦ | s¡</w:t>
             </w:r>
@@ -22413,15 +22707,17 @@
                 <w:color w:val="000000"/>
                 <w:sz w:val="28"/>
                 <w:szCs w:val="40"/>
-              </w:rPr>
-              <w:t>–</w:t>
-            </w:r>
-            <w:r>
-              <w:rPr>
-                <w:rFonts w:ascii="BRH Malayalam Extra" w:hAnsi="BRH Malayalam Extra" w:cs="BRH Malayalam Extra"/>
-                <w:color w:val="000000"/>
-                <w:sz w:val="32"/>
-                <w:szCs w:val="40"/>
+                <w:lang w:val="it-IT"/>
+              </w:rPr>
+              <w:t>–</w:t>
+            </w:r>
+            <w:r>
+              <w:rPr>
+                <w:rFonts w:ascii="BRH Malayalam Extra" w:hAnsi="BRH Malayalam Extra" w:cs="BRH Malayalam Extra"/>
+                <w:color w:val="000000"/>
+                <w:sz w:val="32"/>
+                <w:szCs w:val="40"/>
+                <w:lang w:val="it-IT"/>
               </w:rPr>
               <w:t>j¥i—hyJ |</w:t>
             </w:r>
@@ -22438,6 +22734,7 @@
                 <w:color w:val="000000"/>
                 <w:sz w:val="32"/>
                 <w:szCs w:val="40"/>
+                <w:lang w:val="it-IT"/>
               </w:rPr>
             </w:pPr>
             <w:r>
@@ -22446,6 +22743,7 @@
                 <w:color w:val="000000"/>
                 <w:sz w:val="32"/>
                 <w:szCs w:val="40"/>
+                <w:lang w:val="it-IT"/>
               </w:rPr>
               <w:t>q¡h</w:t>
             </w:r>
@@ -22455,15 +22753,17 @@
                 <w:color w:val="000000"/>
                 <w:sz w:val="28"/>
                 <w:szCs w:val="40"/>
-              </w:rPr>
-              <w:t>–</w:t>
-            </w:r>
-            <w:r>
-              <w:rPr>
-                <w:rFonts w:ascii="BRH Malayalam Extra" w:hAnsi="BRH Malayalam Extra" w:cs="BRH Malayalam Extra"/>
-                <w:color w:val="000000"/>
-                <w:sz w:val="32"/>
-                <w:szCs w:val="40"/>
+                <w:lang w:val="it-IT"/>
+              </w:rPr>
+              <w:t>–</w:t>
+            </w:r>
+            <w:r>
+              <w:rPr>
+                <w:rFonts w:ascii="BRH Malayalam Extra" w:hAnsi="BRH Malayalam Extra" w:cs="BRH Malayalam Extra"/>
+                <w:color w:val="000000"/>
+                <w:sz w:val="32"/>
+                <w:szCs w:val="40"/>
+                <w:lang w:val="it-IT"/>
               </w:rPr>
               <w:t>I Miy—rç¦</w:t>
             </w:r>
@@ -22473,15 +22773,17 @@
                 <w:color w:val="000000"/>
                 <w:sz w:val="28"/>
                 <w:szCs w:val="40"/>
-              </w:rPr>
-              <w:t>–</w:t>
-            </w:r>
-            <w:r>
-              <w:rPr>
-                <w:rFonts w:ascii="BRH Malayalam Extra" w:hAnsi="BRH Malayalam Extra" w:cs="BRH Malayalam Extra"/>
-                <w:color w:val="000000"/>
-                <w:sz w:val="32"/>
-                <w:szCs w:val="40"/>
+                <w:lang w:val="it-IT"/>
+              </w:rPr>
+              <w:t>–</w:t>
+            </w:r>
+            <w:r>
+              <w:rPr>
+                <w:rFonts w:ascii="BRH Malayalam Extra" w:hAnsi="BRH Malayalam Extra" w:cs="BRH Malayalam Extra"/>
+                <w:color w:val="000000"/>
+                <w:sz w:val="32"/>
+                <w:szCs w:val="40"/>
+                <w:lang w:val="it-IT"/>
               </w:rPr>
               <w:t xml:space="preserve"> Miy—rç¦</w:t>
             </w:r>
@@ -22491,15 +22793,17 @@
                 <w:color w:val="000000"/>
                 <w:sz w:val="28"/>
                 <w:szCs w:val="40"/>
-              </w:rPr>
-              <w:t>–</w:t>
-            </w:r>
-            <w:r>
-              <w:rPr>
-                <w:rFonts w:ascii="BRH Malayalam Extra" w:hAnsi="BRH Malayalam Extra" w:cs="BRH Malayalam Extra"/>
-                <w:color w:val="000000"/>
-                <w:sz w:val="32"/>
-                <w:szCs w:val="40"/>
+                <w:lang w:val="it-IT"/>
+              </w:rPr>
+              <w:t>–</w:t>
+            </w:r>
+            <w:r>
+              <w:rPr>
+                <w:rFonts w:ascii="BRH Malayalam Extra" w:hAnsi="BRH Malayalam Extra" w:cs="BRH Malayalam Extra"/>
+                <w:color w:val="000000"/>
+                <w:sz w:val="32"/>
+                <w:szCs w:val="40"/>
+                <w:lang w:val="it-IT"/>
               </w:rPr>
               <w:t xml:space="preserve"> q¡h</w:t>
             </w:r>
@@ -22510,6 +22814,7 @@
                 <w:sz w:val="28"/>
                 <w:szCs w:val="40"/>
                 <w:highlight w:val="yellow"/>
+                <w:lang w:val="it-IT"/>
               </w:rPr>
               <w:t>–</w:t>
             </w:r>
@@ -22520,6 +22825,7 @@
                 <w:sz w:val="32"/>
                 <w:szCs w:val="40"/>
                 <w:highlight w:val="yellow"/>
+                <w:lang w:val="it-IT"/>
               </w:rPr>
               <w:t>I</w:t>
             </w:r>
@@ -22529,6 +22835,7 @@
                 <w:color w:val="000000"/>
                 <w:sz w:val="32"/>
                 <w:szCs w:val="40"/>
+                <w:lang w:val="it-IT"/>
               </w:rPr>
               <w:t xml:space="preserve"> q¡h</w:t>
             </w:r>
@@ -22538,15 +22845,17 @@
                 <w:color w:val="000000"/>
                 <w:sz w:val="28"/>
                 <w:szCs w:val="40"/>
-              </w:rPr>
-              <w:t>–</w:t>
-            </w:r>
-            <w:r>
-              <w:rPr>
-                <w:rFonts w:ascii="BRH Malayalam Extra" w:hAnsi="BRH Malayalam Extra" w:cs="BRH Malayalam Extra"/>
-                <w:color w:val="000000"/>
-                <w:sz w:val="32"/>
-                <w:szCs w:val="40"/>
+                <w:lang w:val="it-IT"/>
+              </w:rPr>
+              <w:t>–</w:t>
+            </w:r>
+            <w:r>
+              <w:rPr>
+                <w:rFonts w:ascii="BRH Malayalam Extra" w:hAnsi="BRH Malayalam Extra" w:cs="BRH Malayalam Extra"/>
+                <w:color w:val="000000"/>
+                <w:sz w:val="32"/>
+                <w:szCs w:val="40"/>
+                <w:lang w:val="it-IT"/>
               </w:rPr>
               <w:t xml:space="preserve">I Miy—rç¦ </w:t>
             </w:r>
@@ -22563,6 +22872,7 @@
                 <w:color w:val="000000"/>
                 <w:sz w:val="32"/>
                 <w:szCs w:val="40"/>
+                <w:lang w:val="it-IT"/>
               </w:rPr>
             </w:pPr>
             <w:r>
@@ -22571,6 +22881,7 @@
                 <w:color w:val="000000"/>
                 <w:sz w:val="32"/>
                 <w:szCs w:val="40"/>
+                <w:lang w:val="it-IT"/>
               </w:rPr>
               <w:t>s¡</w:t>
             </w:r>
@@ -22580,15 +22891,17 @@
                 <w:color w:val="000000"/>
                 <w:sz w:val="28"/>
                 <w:szCs w:val="40"/>
-              </w:rPr>
-              <w:t>–</w:t>
-            </w:r>
-            <w:r>
-              <w:rPr>
-                <w:rFonts w:ascii="BRH Malayalam Extra" w:hAnsi="BRH Malayalam Extra" w:cs="BRH Malayalam Extra"/>
-                <w:color w:val="000000"/>
-                <w:sz w:val="32"/>
-                <w:szCs w:val="40"/>
+                <w:lang w:val="it-IT"/>
+              </w:rPr>
+              <w:t>–</w:t>
+            </w:r>
+            <w:r>
+              <w:rPr>
+                <w:rFonts w:ascii="BRH Malayalam Extra" w:hAnsi="BRH Malayalam Extra" w:cs="BRH Malayalam Extra"/>
+                <w:color w:val="000000"/>
+                <w:sz w:val="32"/>
+                <w:szCs w:val="40"/>
+                <w:lang w:val="it-IT"/>
               </w:rPr>
               <w:t>j¥i—hyJ s¡</w:t>
             </w:r>
@@ -22598,15 +22911,17 @@
                 <w:color w:val="000000"/>
                 <w:sz w:val="28"/>
                 <w:szCs w:val="40"/>
-              </w:rPr>
-              <w:t>–</w:t>
-            </w:r>
-            <w:r>
-              <w:rPr>
-                <w:rFonts w:ascii="BRH Malayalam Extra" w:hAnsi="BRH Malayalam Extra" w:cs="BRH Malayalam Extra"/>
-                <w:color w:val="000000"/>
-                <w:sz w:val="32"/>
-                <w:szCs w:val="40"/>
+                <w:lang w:val="it-IT"/>
+              </w:rPr>
+              <w:t>–</w:t>
+            </w:r>
+            <w:r>
+              <w:rPr>
+                <w:rFonts w:ascii="BRH Malayalam Extra" w:hAnsi="BRH Malayalam Extra" w:cs="BRH Malayalam Extra"/>
+                <w:color w:val="000000"/>
+                <w:sz w:val="32"/>
+                <w:szCs w:val="40"/>
+                <w:lang w:val="it-IT"/>
               </w:rPr>
               <w:t>j¥i—hy</w:t>
             </w:r>
@@ -22616,15 +22931,17 @@
                 <w:color w:val="000000"/>
                 <w:sz w:val="28"/>
                 <w:szCs w:val="40"/>
-              </w:rPr>
-              <w:t>–</w:t>
-            </w:r>
-            <w:r>
-              <w:rPr>
-                <w:rFonts w:ascii="BRH Malayalam Extra" w:hAnsi="BRH Malayalam Extra" w:cs="BRH Malayalam Extra"/>
-                <w:color w:val="000000"/>
-                <w:sz w:val="32"/>
-                <w:szCs w:val="40"/>
+                <w:lang w:val="it-IT"/>
+              </w:rPr>
+              <w:t>–</w:t>
+            </w:r>
+            <w:r>
+              <w:rPr>
+                <w:rFonts w:ascii="BRH Malayalam Extra" w:hAnsi="BRH Malayalam Extra" w:cs="BRH Malayalam Extra"/>
+                <w:color w:val="000000"/>
+                <w:sz w:val="32"/>
+                <w:szCs w:val="40"/>
+                <w:lang w:val="it-IT"/>
               </w:rPr>
               <w:t>ª Miy—rç¦</w:t>
             </w:r>
@@ -22634,15 +22951,17 @@
                 <w:color w:val="000000"/>
                 <w:sz w:val="28"/>
                 <w:szCs w:val="40"/>
-              </w:rPr>
-              <w:t>–</w:t>
-            </w:r>
-            <w:r>
-              <w:rPr>
-                <w:rFonts w:ascii="BRH Malayalam Extra" w:hAnsi="BRH Malayalam Extra" w:cs="BRH Malayalam Extra"/>
-                <w:color w:val="000000"/>
-                <w:sz w:val="32"/>
-                <w:szCs w:val="40"/>
+                <w:lang w:val="it-IT"/>
+              </w:rPr>
+              <w:t>–</w:t>
+            </w:r>
+            <w:r>
+              <w:rPr>
+                <w:rFonts w:ascii="BRH Malayalam Extra" w:hAnsi="BRH Malayalam Extra" w:cs="BRH Malayalam Extra"/>
+                <w:color w:val="000000"/>
+                <w:sz w:val="32"/>
+                <w:szCs w:val="40"/>
+                <w:lang w:val="it-IT"/>
               </w:rPr>
               <w:t xml:space="preserve"> q¡h</w:t>
             </w:r>
@@ -22653,6 +22972,7 @@
                 <w:sz w:val="28"/>
                 <w:szCs w:val="40"/>
                 <w:highlight w:val="yellow"/>
+                <w:lang w:val="it-IT"/>
               </w:rPr>
               <w:t>–</w:t>
             </w:r>
@@ -22663,6 +22983,7 @@
                 <w:sz w:val="32"/>
                 <w:szCs w:val="40"/>
                 <w:highlight w:val="yellow"/>
+                <w:lang w:val="it-IT"/>
               </w:rPr>
               <w:t>I</w:t>
             </w:r>
@@ -22672,6 +22993,7 @@
                 <w:color w:val="000000"/>
                 <w:sz w:val="32"/>
                 <w:szCs w:val="40"/>
+                <w:lang w:val="it-IT"/>
               </w:rPr>
               <w:t xml:space="preserve"> q¡h</w:t>
             </w:r>
@@ -22681,15 +23003,17 @@
                 <w:color w:val="000000"/>
                 <w:sz w:val="28"/>
                 <w:szCs w:val="40"/>
-              </w:rPr>
-              <w:t>–</w:t>
-            </w:r>
-            <w:r>
-              <w:rPr>
-                <w:rFonts w:ascii="BRH Malayalam Extra" w:hAnsi="BRH Malayalam Extra" w:cs="BRH Malayalam Extra"/>
-                <w:color w:val="000000"/>
-                <w:sz w:val="32"/>
-                <w:szCs w:val="40"/>
+                <w:lang w:val="it-IT"/>
+              </w:rPr>
+              <w:t>–</w:t>
+            </w:r>
+            <w:r>
+              <w:rPr>
+                <w:rFonts w:ascii="BRH Malayalam Extra" w:hAnsi="BRH Malayalam Extra" w:cs="BRH Malayalam Extra"/>
+                <w:color w:val="000000"/>
+                <w:sz w:val="32"/>
+                <w:szCs w:val="40"/>
+                <w:lang w:val="it-IT"/>
               </w:rPr>
               <w:t xml:space="preserve">I </w:t>
             </w:r>
@@ -22704,6 +23028,7 @@
               <w:rPr>
                 <w:rFonts w:cs="BRH Malayalam Extra"/>
                 <w:szCs w:val="40"/>
+                <w:lang w:val="it-IT"/>
               </w:rPr>
             </w:pPr>
             <w:r>
@@ -22712,6 +23037,7 @@
                 <w:color w:val="000000"/>
                 <w:sz w:val="32"/>
                 <w:szCs w:val="40"/>
+                <w:lang w:val="it-IT"/>
               </w:rPr>
               <w:t>Miy—rç¦ s¡</w:t>
             </w:r>
@@ -22721,15 +23047,17 @@
                 <w:color w:val="000000"/>
                 <w:sz w:val="28"/>
                 <w:szCs w:val="40"/>
-              </w:rPr>
-              <w:t>–</w:t>
-            </w:r>
-            <w:r>
-              <w:rPr>
-                <w:rFonts w:ascii="BRH Malayalam Extra" w:hAnsi="BRH Malayalam Extra" w:cs="BRH Malayalam Extra"/>
-                <w:color w:val="000000"/>
-                <w:sz w:val="32"/>
-                <w:szCs w:val="40"/>
+                <w:lang w:val="it-IT"/>
+              </w:rPr>
+              <w:t>–</w:t>
+            </w:r>
+            <w:r>
+              <w:rPr>
+                <w:rFonts w:ascii="BRH Malayalam Extra" w:hAnsi="BRH Malayalam Extra" w:cs="BRH Malayalam Extra"/>
+                <w:color w:val="000000"/>
+                <w:sz w:val="32"/>
+                <w:szCs w:val="40"/>
+                <w:lang w:val="it-IT"/>
               </w:rPr>
               <w:t xml:space="preserve">j¥i—hyJ | </w:t>
             </w:r>
@@ -22751,6 +23079,7 @@
                 <w:color w:val="000000"/>
                 <w:sz w:val="32"/>
                 <w:szCs w:val="32"/>
+                <w:lang w:val="it-IT"/>
               </w:rPr>
             </w:pPr>
             <w:r>
@@ -22758,6 +23087,7 @@
                 <w:rFonts w:cs="BRH Malayalam Extra"/>
                 <w:color w:val="000000"/>
                 <w:szCs w:val="32"/>
+                <w:lang w:val="it-IT"/>
               </w:rPr>
               <w:t>49</w:t>
             </w:r>
@@ -22767,6 +23097,7 @@
                 <w:color w:val="000000"/>
                 <w:sz w:val="32"/>
                 <w:szCs w:val="32"/>
+                <w:lang w:val="it-IT"/>
               </w:rPr>
               <w:t>)</w:t>
             </w:r>
@@ -22776,6 +23107,7 @@
                 <w:color w:val="000000"/>
                 <w:sz w:val="32"/>
                 <w:szCs w:val="32"/>
+                <w:lang w:val="it-IT"/>
               </w:rPr>
               <w:tab/>
             </w:r>
@@ -22784,6 +23116,7 @@
                 <w:rFonts w:cs="BRH Malayalam Extra"/>
                 <w:color w:val="000000"/>
                 <w:szCs w:val="32"/>
+                <w:lang w:val="it-IT"/>
               </w:rPr>
               <w:t>4</w:t>
             </w:r>
@@ -22793,6 +23126,7 @@
                 <w:color w:val="000000"/>
                 <w:sz w:val="32"/>
                 <w:szCs w:val="32"/>
+                <w:lang w:val="it-IT"/>
               </w:rPr>
               <w:t>.</w:t>
             </w:r>
@@ -22801,6 +23135,7 @@
                 <w:rFonts w:cs="BRH Malayalam Extra"/>
                 <w:color w:val="000000"/>
                 <w:szCs w:val="32"/>
+                <w:lang w:val="it-IT"/>
               </w:rPr>
               <w:t>7</w:t>
             </w:r>
@@ -22810,6 +23145,7 @@
                 <w:color w:val="000000"/>
                 <w:sz w:val="32"/>
                 <w:szCs w:val="32"/>
+                <w:lang w:val="it-IT"/>
               </w:rPr>
               <w:t>.</w:t>
             </w:r>
@@ -22818,6 +23154,7 @@
                 <w:rFonts w:cs="BRH Malayalam Extra"/>
                 <w:color w:val="000000"/>
                 <w:szCs w:val="32"/>
+                <w:lang w:val="it-IT"/>
               </w:rPr>
               <w:t>15</w:t>
             </w:r>
@@ -22827,6 +23164,7 @@
                 <w:color w:val="000000"/>
                 <w:sz w:val="32"/>
                 <w:szCs w:val="32"/>
+                <w:lang w:val="it-IT"/>
               </w:rPr>
               <w:t>.</w:t>
             </w:r>
@@ -22835,6 +23173,7 @@
                 <w:rFonts w:cs="BRH Malayalam Extra"/>
                 <w:color w:val="000000"/>
                 <w:szCs w:val="32"/>
+                <w:lang w:val="it-IT"/>
               </w:rPr>
               <w:t>3</w:t>
             </w:r>
@@ -22844,6 +23183,7 @@
                 <w:color w:val="000000"/>
                 <w:sz w:val="32"/>
                 <w:szCs w:val="32"/>
+                <w:lang w:val="it-IT"/>
               </w:rPr>
               <w:t>(</w:t>
             </w:r>
@@ -22852,6 +23192,7 @@
                 <w:rFonts w:cs="BRH Malayalam Extra"/>
                 <w:color w:val="000000"/>
                 <w:szCs w:val="32"/>
+                <w:lang w:val="it-IT"/>
               </w:rPr>
               <w:t>44</w:t>
             </w:r>
@@ -22861,6 +23202,7 @@
                 <w:color w:val="000000"/>
                 <w:sz w:val="32"/>
                 <w:szCs w:val="32"/>
+                <w:lang w:val="it-IT"/>
               </w:rPr>
               <w:t>)- A</w:t>
             </w:r>
@@ -22870,15 +23212,17 @@
                 <w:color w:val="000000"/>
                 <w:sz w:val="26"/>
                 <w:szCs w:val="32"/>
-              </w:rPr>
-              <w:t>–</w:t>
-            </w:r>
-            <w:r>
-              <w:rPr>
-                <w:rFonts w:ascii="BRH Malayalam Extra" w:hAnsi="BRH Malayalam Extra" w:cs="BRH Malayalam Extra"/>
-                <w:color w:val="000000"/>
-                <w:sz w:val="32"/>
-                <w:szCs w:val="32"/>
+                <w:lang w:val="it-IT"/>
+              </w:rPr>
+              <w:t>–</w:t>
+            </w:r>
+            <w:r>
+              <w:rPr>
+                <w:rFonts w:ascii="BRH Malayalam Extra" w:hAnsi="BRH Malayalam Extra" w:cs="BRH Malayalam Extra"/>
+                <w:color w:val="000000"/>
+                <w:sz w:val="32"/>
+                <w:szCs w:val="32"/>
+                <w:lang w:val="it-IT"/>
               </w:rPr>
               <w:t>¥tû</w:t>
             </w:r>
@@ -22888,15 +23232,17 @@
                 <w:color w:val="000000"/>
                 <w:sz w:val="26"/>
                 <w:szCs w:val="32"/>
-              </w:rPr>
-              <w:t>–</w:t>
-            </w:r>
-            <w:r>
-              <w:rPr>
-                <w:rFonts w:ascii="BRH Malayalam Extra" w:hAnsi="BRH Malayalam Extra" w:cs="BRH Malayalam Extra"/>
-                <w:color w:val="000000"/>
-                <w:sz w:val="32"/>
-                <w:szCs w:val="32"/>
+                <w:lang w:val="it-IT"/>
+              </w:rPr>
+              <w:t>–</w:t>
+            </w:r>
+            <w:r>
+              <w:rPr>
+                <w:rFonts w:ascii="BRH Malayalam Extra" w:hAnsi="BRH Malayalam Extra" w:cs="BRH Malayalam Extra"/>
+                <w:color w:val="000000"/>
+                <w:sz w:val="32"/>
+                <w:szCs w:val="32"/>
+                <w:lang w:val="it-IT"/>
               </w:rPr>
               <w:t xml:space="preserve"> | D¦</w:t>
             </w:r>
@@ -22906,15 +23252,17 @@
                 <w:color w:val="000000"/>
                 <w:sz w:val="26"/>
                 <w:szCs w:val="32"/>
-              </w:rPr>
-              <w:t>–</w:t>
-            </w:r>
-            <w:r>
-              <w:rPr>
-                <w:rFonts w:ascii="BRH Malayalam Extra" w:hAnsi="BRH Malayalam Extra" w:cs="BRH Malayalam Extra"/>
-                <w:color w:val="000000"/>
-                <w:sz w:val="32"/>
-                <w:szCs w:val="32"/>
+                <w:lang w:val="it-IT"/>
+              </w:rPr>
+              <w:t>–</w:t>
+            </w:r>
+            <w:r>
+              <w:rPr>
+                <w:rFonts w:ascii="BRH Malayalam Extra" w:hAnsi="BRH Malayalam Extra" w:cs="BRH Malayalam Extra"/>
+                <w:color w:val="000000"/>
+                <w:sz w:val="32"/>
+                <w:szCs w:val="32"/>
+                <w:lang w:val="it-IT"/>
               </w:rPr>
               <w:t>Z¥j˜ | q¡h˜I |</w:t>
             </w:r>
@@ -22931,6 +23279,7 @@
                 <w:color w:val="000000"/>
                 <w:sz w:val="32"/>
                 <w:szCs w:val="32"/>
+                <w:lang w:val="it-IT"/>
               </w:rPr>
             </w:pPr>
             <w:r>
@@ -22939,6 +23288,7 @@
                 <w:color w:val="000000"/>
                 <w:sz w:val="32"/>
                 <w:szCs w:val="32"/>
+                <w:lang w:val="it-IT"/>
               </w:rPr>
               <w:t>A</w:t>
             </w:r>
@@ -22948,15 +23298,17 @@
                 <w:color w:val="000000"/>
                 <w:sz w:val="26"/>
                 <w:szCs w:val="32"/>
-              </w:rPr>
-              <w:t>–</w:t>
-            </w:r>
-            <w:r>
-              <w:rPr>
-                <w:rFonts w:ascii="BRH Malayalam Extra" w:hAnsi="BRH Malayalam Extra" w:cs="BRH Malayalam Extra"/>
-                <w:color w:val="000000"/>
-                <w:sz w:val="32"/>
-                <w:szCs w:val="32"/>
+                <w:lang w:val="it-IT"/>
+              </w:rPr>
+              <w:t>–</w:t>
+            </w:r>
+            <w:r>
+              <w:rPr>
+                <w:rFonts w:ascii="BRH Malayalam Extra" w:hAnsi="BRH Malayalam Extra" w:cs="BRH Malayalam Extra"/>
+                <w:color w:val="000000"/>
+                <w:sz w:val="32"/>
+                <w:szCs w:val="32"/>
+                <w:lang w:val="it-IT"/>
               </w:rPr>
               <w:t>tû</w:t>
             </w:r>
@@ -22966,15 +23318,17 @@
                 <w:color w:val="000000"/>
                 <w:sz w:val="26"/>
                 <w:szCs w:val="32"/>
-              </w:rPr>
-              <w:t>–</w:t>
-            </w:r>
-            <w:r>
-              <w:rPr>
-                <w:rFonts w:ascii="BRH Malayalam Extra" w:hAnsi="BRH Malayalam Extra" w:cs="BRH Malayalam Extra"/>
-                <w:color w:val="000000"/>
-                <w:sz w:val="32"/>
-                <w:szCs w:val="32"/>
+                <w:lang w:val="it-IT"/>
+              </w:rPr>
+              <w:t>–</w:t>
+            </w:r>
+            <w:r>
+              <w:rPr>
+                <w:rFonts w:ascii="BRH Malayalam Extra" w:hAnsi="BRH Malayalam Extra" w:cs="BRH Malayalam Extra"/>
+                <w:color w:val="000000"/>
+                <w:sz w:val="32"/>
+                <w:szCs w:val="32"/>
+                <w:lang w:val="it-IT"/>
               </w:rPr>
               <w:t xml:space="preserve"> D¦</w:t>
             </w:r>
@@ -22984,15 +23338,17 @@
                 <w:color w:val="000000"/>
                 <w:sz w:val="26"/>
                 <w:szCs w:val="32"/>
-              </w:rPr>
-              <w:t>–</w:t>
-            </w:r>
-            <w:r>
-              <w:rPr>
-                <w:rFonts w:ascii="BRH Malayalam Extra" w:hAnsi="BRH Malayalam Extra" w:cs="BRH Malayalam Extra"/>
-                <w:color w:val="000000"/>
-                <w:sz w:val="32"/>
-                <w:szCs w:val="32"/>
+                <w:lang w:val="it-IT"/>
+              </w:rPr>
+              <w:t>–</w:t>
+            </w:r>
+            <w:r>
+              <w:rPr>
+                <w:rFonts w:ascii="BRH Malayalam Extra" w:hAnsi="BRH Malayalam Extra" w:cs="BRH Malayalam Extra"/>
+                <w:color w:val="000000"/>
+                <w:sz w:val="32"/>
+                <w:szCs w:val="32"/>
+                <w:lang w:val="it-IT"/>
               </w:rPr>
               <w:t>Zj— D¦</w:t>
             </w:r>
@@ -23002,15 +23358,17 @@
                 <w:color w:val="000000"/>
                 <w:sz w:val="26"/>
                 <w:szCs w:val="32"/>
-              </w:rPr>
-              <w:t>–</w:t>
-            </w:r>
-            <w:r>
-              <w:rPr>
-                <w:rFonts w:ascii="BRH Malayalam Extra" w:hAnsi="BRH Malayalam Extra" w:cs="BRH Malayalam Extra"/>
-                <w:color w:val="000000"/>
-                <w:sz w:val="32"/>
-                <w:szCs w:val="32"/>
+                <w:lang w:val="it-IT"/>
+              </w:rPr>
+              <w:t>–</w:t>
+            </w:r>
+            <w:r>
+              <w:rPr>
+                <w:rFonts w:ascii="BRH Malayalam Extra" w:hAnsi="BRH Malayalam Extra" w:cs="BRH Malayalam Extra"/>
+                <w:color w:val="000000"/>
+                <w:sz w:val="32"/>
+                <w:szCs w:val="32"/>
+                <w:lang w:val="it-IT"/>
               </w:rPr>
               <w:t>Z¥j— A¥tû Atû D¦</w:t>
             </w:r>
@@ -23020,15 +23378,17 @@
                 <w:color w:val="000000"/>
                 <w:sz w:val="26"/>
                 <w:szCs w:val="32"/>
-              </w:rPr>
-              <w:t>–</w:t>
-            </w:r>
-            <w:r>
-              <w:rPr>
-                <w:rFonts w:ascii="BRH Malayalam Extra" w:hAnsi="BRH Malayalam Extra" w:cs="BRH Malayalam Extra"/>
-                <w:color w:val="000000"/>
-                <w:sz w:val="32"/>
-                <w:szCs w:val="32"/>
+                <w:lang w:val="it-IT"/>
+              </w:rPr>
+              <w:t>–</w:t>
+            </w:r>
+            <w:r>
+              <w:rPr>
+                <w:rFonts w:ascii="BRH Malayalam Extra" w:hAnsi="BRH Malayalam Extra" w:cs="BRH Malayalam Extra"/>
+                <w:color w:val="000000"/>
+                <w:sz w:val="32"/>
+                <w:szCs w:val="32"/>
+                <w:lang w:val="it-IT"/>
               </w:rPr>
               <w:t>Z¥j</w:t>
             </w:r>
@@ -23038,15 +23398,17 @@
                 <w:color w:val="000000"/>
                 <w:sz w:val="26"/>
                 <w:szCs w:val="32"/>
-              </w:rPr>
-              <w:t>–</w:t>
-            </w:r>
-            <w:r>
-              <w:rPr>
-                <w:rFonts w:ascii="BRH Malayalam Extra" w:hAnsi="BRH Malayalam Extra" w:cs="BRH Malayalam Extra"/>
-                <w:color w:val="000000"/>
-                <w:sz w:val="32"/>
-                <w:szCs w:val="32"/>
+                <w:lang w:val="it-IT"/>
+              </w:rPr>
+              <w:t>–</w:t>
+            </w:r>
+            <w:r>
+              <w:rPr>
+                <w:rFonts w:ascii="BRH Malayalam Extra" w:hAnsi="BRH Malayalam Extra" w:cs="BRH Malayalam Extra"/>
+                <w:color w:val="000000"/>
+                <w:sz w:val="32"/>
+                <w:szCs w:val="32"/>
+                <w:lang w:val="it-IT"/>
               </w:rPr>
               <w:t xml:space="preserve"> </w:t>
             </w:r>
@@ -23063,6 +23425,7 @@
                 <w:color w:val="000000"/>
                 <w:sz w:val="32"/>
                 <w:szCs w:val="32"/>
+                <w:lang w:val="it-IT"/>
               </w:rPr>
             </w:pPr>
             <w:r>
@@ -23071,6 +23434,7 @@
                 <w:color w:val="000000"/>
                 <w:sz w:val="32"/>
                 <w:szCs w:val="32"/>
+                <w:lang w:val="it-IT"/>
               </w:rPr>
               <w:t>q¡h</w:t>
             </w:r>
@@ -23081,6 +23445,7 @@
                 <w:sz w:val="26"/>
                 <w:szCs w:val="32"/>
                 <w:highlight w:val="green"/>
+                <w:lang w:val="it-IT"/>
               </w:rPr>
               <w:t>–</w:t>
             </w:r>
@@ -23091,6 +23456,7 @@
                 <w:sz w:val="32"/>
                 <w:szCs w:val="32"/>
                 <w:highlight w:val="green"/>
+                <w:lang w:val="it-IT"/>
               </w:rPr>
               <w:t>(³§)</w:t>
             </w:r>
@@ -23101,15 +23467,17 @@
                 <w:sz w:val="26"/>
                 <w:szCs w:val="32"/>
                 <w:highlight w:val="green"/>
-              </w:rPr>
-              <w:t>–</w:t>
-            </w:r>
-            <w:r>
-              <w:rPr>
-                <w:rFonts w:ascii="BRH Malayalam Extra" w:hAnsi="BRH Malayalam Extra" w:cs="BRH Malayalam Extra"/>
-                <w:color w:val="000000"/>
-                <w:sz w:val="32"/>
-                <w:szCs w:val="32"/>
+                <w:lang w:val="it-IT"/>
+              </w:rPr>
+              <w:t>–</w:t>
+            </w:r>
+            <w:r>
+              <w:rPr>
+                <w:rFonts w:ascii="BRH Malayalam Extra" w:hAnsi="BRH Malayalam Extra" w:cs="BRH Malayalam Extra"/>
+                <w:color w:val="000000"/>
+                <w:sz w:val="32"/>
+                <w:szCs w:val="32"/>
+                <w:lang w:val="it-IT"/>
               </w:rPr>
               <w:t xml:space="preserve"> q¡h— i¢</w:t>
             </w:r>
@@ -23119,15 +23487,17 @@
                 <w:color w:val="000000"/>
                 <w:sz w:val="26"/>
                 <w:szCs w:val="32"/>
-              </w:rPr>
-              <w:t>–</w:t>
-            </w:r>
-            <w:r>
-              <w:rPr>
-                <w:rFonts w:ascii="BRH Malayalam Extra" w:hAnsi="BRH Malayalam Extra" w:cs="BRH Malayalam Extra"/>
-                <w:color w:val="000000"/>
-                <w:sz w:val="32"/>
-                <w:szCs w:val="32"/>
+                <w:lang w:val="it-IT"/>
+              </w:rPr>
+              <w:t>–</w:t>
+            </w:r>
+            <w:r>
+              <w:rPr>
+                <w:rFonts w:ascii="BRH Malayalam Extra" w:hAnsi="BRH Malayalam Extra" w:cs="BRH Malayalam Extra"/>
+                <w:color w:val="000000"/>
+                <w:sz w:val="32"/>
+                <w:szCs w:val="32"/>
+                <w:lang w:val="it-IT"/>
               </w:rPr>
               <w:t>Z¥j— A¥tû Atû D¦</w:t>
             </w:r>
@@ -23137,15 +23507,17 @@
                 <w:color w:val="000000"/>
                 <w:sz w:val="26"/>
                 <w:szCs w:val="32"/>
-              </w:rPr>
-              <w:t>–</w:t>
-            </w:r>
-            <w:r>
-              <w:rPr>
-                <w:rFonts w:ascii="BRH Malayalam Extra" w:hAnsi="BRH Malayalam Extra" w:cs="BRH Malayalam Extra"/>
-                <w:color w:val="000000"/>
-                <w:sz w:val="32"/>
-                <w:szCs w:val="32"/>
+                <w:lang w:val="it-IT"/>
+              </w:rPr>
+              <w:t>–</w:t>
+            </w:r>
+            <w:r>
+              <w:rPr>
+                <w:rFonts w:ascii="BRH Malayalam Extra" w:hAnsi="BRH Malayalam Extra" w:cs="BRH Malayalam Extra"/>
+                <w:color w:val="000000"/>
+                <w:sz w:val="32"/>
+                <w:szCs w:val="32"/>
+                <w:lang w:val="it-IT"/>
               </w:rPr>
               <w:t>Z¥j</w:t>
             </w:r>
@@ -23155,15 +23527,17 @@
                 <w:color w:val="000000"/>
                 <w:sz w:val="26"/>
                 <w:szCs w:val="32"/>
-              </w:rPr>
-              <w:t>–</w:t>
-            </w:r>
-            <w:r>
-              <w:rPr>
-                <w:rFonts w:ascii="BRH Malayalam Extra" w:hAnsi="BRH Malayalam Extra" w:cs="BRH Malayalam Extra"/>
-                <w:color w:val="000000"/>
-                <w:sz w:val="32"/>
-                <w:szCs w:val="32"/>
+                <w:lang w:val="it-IT"/>
+              </w:rPr>
+              <w:t>–</w:t>
+            </w:r>
+            <w:r>
+              <w:rPr>
+                <w:rFonts w:ascii="BRH Malayalam Extra" w:hAnsi="BRH Malayalam Extra" w:cs="BRH Malayalam Extra"/>
+                <w:color w:val="000000"/>
+                <w:sz w:val="32"/>
+                <w:szCs w:val="32"/>
+                <w:lang w:val="it-IT"/>
               </w:rPr>
               <w:t xml:space="preserve"> q¡h˜I | </w:t>
             </w:r>
@@ -23180,6 +23554,7 @@
                 <w:color w:val="000000"/>
                 <w:sz w:val="32"/>
                 <w:szCs w:val="32"/>
+                <w:lang w:val="it-IT"/>
               </w:rPr>
             </w:pPr>
             <w:r>
@@ -23187,6 +23562,7 @@
                 <w:rFonts w:cs="BRH Malayalam Extra"/>
                 <w:color w:val="000000"/>
                 <w:szCs w:val="32"/>
+                <w:lang w:val="it-IT"/>
               </w:rPr>
               <w:t>50</w:t>
             </w:r>
@@ -23196,6 +23572,7 @@
                 <w:color w:val="000000"/>
                 <w:sz w:val="32"/>
                 <w:szCs w:val="32"/>
+                <w:lang w:val="it-IT"/>
               </w:rPr>
               <w:t>)</w:t>
             </w:r>
@@ -23205,6 +23582,7 @@
                 <w:color w:val="000000"/>
                 <w:sz w:val="32"/>
                 <w:szCs w:val="32"/>
+                <w:lang w:val="it-IT"/>
               </w:rPr>
               <w:tab/>
             </w:r>
@@ -23213,6 +23591,7 @@
                 <w:rFonts w:cs="BRH Malayalam Extra"/>
                 <w:color w:val="000000"/>
                 <w:szCs w:val="32"/>
+                <w:lang w:val="it-IT"/>
               </w:rPr>
               <w:t>4</w:t>
             </w:r>
@@ -23222,6 +23601,7 @@
                 <w:color w:val="000000"/>
                 <w:sz w:val="32"/>
                 <w:szCs w:val="32"/>
+                <w:lang w:val="it-IT"/>
               </w:rPr>
               <w:t>.</w:t>
             </w:r>
@@ -23230,6 +23610,7 @@
                 <w:rFonts w:cs="BRH Malayalam Extra"/>
                 <w:color w:val="000000"/>
                 <w:szCs w:val="32"/>
+                <w:lang w:val="it-IT"/>
               </w:rPr>
               <w:t>7</w:t>
             </w:r>
@@ -23239,6 +23620,7 @@
                 <w:color w:val="000000"/>
                 <w:sz w:val="32"/>
                 <w:szCs w:val="32"/>
+                <w:lang w:val="it-IT"/>
               </w:rPr>
               <w:t>.</w:t>
             </w:r>
@@ -23247,6 +23629,7 @@
                 <w:rFonts w:cs="BRH Malayalam Extra"/>
                 <w:color w:val="000000"/>
                 <w:szCs w:val="32"/>
+                <w:lang w:val="it-IT"/>
               </w:rPr>
               <w:t>15</w:t>
             </w:r>
@@ -23256,6 +23639,7 @@
                 <w:color w:val="000000"/>
                 <w:sz w:val="32"/>
                 <w:szCs w:val="32"/>
+                <w:lang w:val="it-IT"/>
               </w:rPr>
               <w:t>.</w:t>
             </w:r>
@@ -23264,6 +23648,7 @@
                 <w:rFonts w:cs="BRH Malayalam Extra"/>
                 <w:color w:val="000000"/>
                 <w:szCs w:val="32"/>
+                <w:lang w:val="it-IT"/>
               </w:rPr>
               <w:t>3</w:t>
             </w:r>
@@ -23273,6 +23658,7 @@
                 <w:color w:val="000000"/>
                 <w:sz w:val="32"/>
                 <w:szCs w:val="32"/>
+                <w:lang w:val="it-IT"/>
               </w:rPr>
               <w:t>(</w:t>
             </w:r>
@@ -23281,6 +23667,7 @@
                 <w:rFonts w:cs="BRH Malayalam Extra"/>
                 <w:color w:val="000000"/>
                 <w:szCs w:val="32"/>
+                <w:lang w:val="it-IT"/>
               </w:rPr>
               <w:t>45</w:t>
             </w:r>
@@ -23290,6 +23677,7 @@
                 <w:color w:val="000000"/>
                 <w:sz w:val="32"/>
                 <w:szCs w:val="32"/>
+                <w:lang w:val="it-IT"/>
               </w:rPr>
               <w:t>)- D¦</w:t>
             </w:r>
@@ -23299,15 +23687,17 @@
                 <w:color w:val="000000"/>
                 <w:sz w:val="26"/>
                 <w:szCs w:val="32"/>
-              </w:rPr>
-              <w:t>–</w:t>
-            </w:r>
-            <w:r>
-              <w:rPr>
-                <w:rFonts w:ascii="BRH Malayalam Extra" w:hAnsi="BRH Malayalam Extra" w:cs="BRH Malayalam Extra"/>
-                <w:color w:val="000000"/>
-                <w:sz w:val="32"/>
-                <w:szCs w:val="32"/>
+                <w:lang w:val="it-IT"/>
+              </w:rPr>
+              <w:t>–</w:t>
+            </w:r>
+            <w:r>
+              <w:rPr>
+                <w:rFonts w:ascii="BRH Malayalam Extra" w:hAnsi="BRH Malayalam Extra" w:cs="BRH Malayalam Extra"/>
+                <w:color w:val="000000"/>
+                <w:sz w:val="32"/>
+                <w:szCs w:val="32"/>
+                <w:lang w:val="it-IT"/>
               </w:rPr>
               <w:t>Z¥j˜ | q¡h˜I | Miy—rç¦ |</w:t>
             </w:r>
@@ -23324,6 +23714,7 @@
                 <w:color w:val="000000"/>
                 <w:sz w:val="32"/>
                 <w:szCs w:val="32"/>
+                <w:lang w:val="it-IT"/>
               </w:rPr>
             </w:pPr>
             <w:r>
@@ -23332,6 +23723,7 @@
                 <w:color w:val="000000"/>
                 <w:sz w:val="32"/>
                 <w:szCs w:val="32"/>
+                <w:lang w:val="it-IT"/>
               </w:rPr>
               <w:t>D¦</w:t>
             </w:r>
@@ -23341,15 +23733,17 @@
                 <w:color w:val="000000"/>
                 <w:sz w:val="26"/>
                 <w:szCs w:val="32"/>
-              </w:rPr>
-              <w:t>–</w:t>
-            </w:r>
-            <w:r>
-              <w:rPr>
-                <w:rFonts w:ascii="BRH Malayalam Extra" w:hAnsi="BRH Malayalam Extra" w:cs="BRH Malayalam Extra"/>
-                <w:color w:val="000000"/>
-                <w:sz w:val="32"/>
-                <w:szCs w:val="32"/>
+                <w:lang w:val="it-IT"/>
+              </w:rPr>
+              <w:t>–</w:t>
+            </w:r>
+            <w:r>
+              <w:rPr>
+                <w:rFonts w:ascii="BRH Malayalam Extra" w:hAnsi="BRH Malayalam Extra" w:cs="BRH Malayalam Extra"/>
+                <w:color w:val="000000"/>
+                <w:sz w:val="32"/>
+                <w:szCs w:val="32"/>
+                <w:lang w:val="it-IT"/>
               </w:rPr>
               <w:t>Z¥j</w:t>
             </w:r>
@@ -23359,15 +23753,17 @@
                 <w:color w:val="000000"/>
                 <w:sz w:val="26"/>
                 <w:szCs w:val="32"/>
-              </w:rPr>
-              <w:t>–</w:t>
-            </w:r>
-            <w:r>
-              <w:rPr>
-                <w:rFonts w:ascii="BRH Malayalam Extra" w:hAnsi="BRH Malayalam Extra" w:cs="BRH Malayalam Extra"/>
-                <w:color w:val="000000"/>
-                <w:sz w:val="32"/>
-                <w:szCs w:val="32"/>
+                <w:lang w:val="it-IT"/>
+              </w:rPr>
+              <w:t>–</w:t>
+            </w:r>
+            <w:r>
+              <w:rPr>
+                <w:rFonts w:ascii="BRH Malayalam Extra" w:hAnsi="BRH Malayalam Extra" w:cs="BRH Malayalam Extra"/>
+                <w:color w:val="000000"/>
+                <w:sz w:val="32"/>
+                <w:szCs w:val="32"/>
+                <w:lang w:val="it-IT"/>
               </w:rPr>
               <w:t xml:space="preserve"> q¡h</w:t>
             </w:r>
@@ -23377,15 +23773,17 @@
                 <w:color w:val="000000"/>
                 <w:sz w:val="26"/>
                 <w:szCs w:val="32"/>
-              </w:rPr>
-              <w:t>–</w:t>
-            </w:r>
-            <w:r>
-              <w:rPr>
-                <w:rFonts w:ascii="BRH Malayalam Extra" w:hAnsi="BRH Malayalam Extra" w:cs="BRH Malayalam Extra"/>
-                <w:color w:val="000000"/>
-                <w:sz w:val="32"/>
-                <w:szCs w:val="32"/>
+                <w:lang w:val="it-IT"/>
+              </w:rPr>
+              <w:t>–</w:t>
+            </w:r>
+            <w:r>
+              <w:rPr>
+                <w:rFonts w:ascii="BRH Malayalam Extra" w:hAnsi="BRH Malayalam Extra" w:cs="BRH Malayalam Extra"/>
+                <w:color w:val="000000"/>
+                <w:sz w:val="32"/>
+                <w:szCs w:val="32"/>
+                <w:lang w:val="it-IT"/>
               </w:rPr>
               <w:t>(</w:t>
             </w:r>
@@ -23396,6 +23794,7 @@
                 <w:sz w:val="32"/>
                 <w:szCs w:val="32"/>
                 <w:highlight w:val="green"/>
+                <w:lang w:val="it-IT"/>
               </w:rPr>
               <w:t>³§</w:t>
             </w:r>
@@ -23405,6 +23804,7 @@
                 <w:color w:val="000000"/>
                 <w:sz w:val="32"/>
                 <w:szCs w:val="32"/>
+                <w:lang w:val="it-IT"/>
               </w:rPr>
               <w:t>)</w:t>
             </w:r>
@@ -23414,15 +23814,17 @@
                 <w:color w:val="000000"/>
                 <w:sz w:val="26"/>
                 <w:szCs w:val="32"/>
-              </w:rPr>
-              <w:t>–</w:t>
-            </w:r>
-            <w:r>
-              <w:rPr>
-                <w:rFonts w:ascii="BRH Malayalam Extra" w:hAnsi="BRH Malayalam Extra" w:cs="BRH Malayalam Extra"/>
-                <w:color w:val="000000"/>
-                <w:sz w:val="32"/>
-                <w:szCs w:val="32"/>
+                <w:lang w:val="it-IT"/>
+              </w:rPr>
+              <w:t>–</w:t>
+            </w:r>
+            <w:r>
+              <w:rPr>
+                <w:rFonts w:ascii="BRH Malayalam Extra" w:hAnsi="BRH Malayalam Extra" w:cs="BRH Malayalam Extra"/>
+                <w:color w:val="000000"/>
+                <w:sz w:val="32"/>
+                <w:szCs w:val="32"/>
+                <w:lang w:val="it-IT"/>
               </w:rPr>
               <w:t xml:space="preserve"> q¡h— i¢</w:t>
             </w:r>
@@ -23432,15 +23834,17 @@
                 <w:color w:val="000000"/>
                 <w:sz w:val="26"/>
                 <w:szCs w:val="32"/>
-              </w:rPr>
-              <w:t>–</w:t>
-            </w:r>
-            <w:r>
-              <w:rPr>
-                <w:rFonts w:ascii="BRH Malayalam Extra" w:hAnsi="BRH Malayalam Extra" w:cs="BRH Malayalam Extra"/>
-                <w:color w:val="000000"/>
-                <w:sz w:val="32"/>
-                <w:szCs w:val="32"/>
+                <w:lang w:val="it-IT"/>
+              </w:rPr>
+              <w:t>–</w:t>
+            </w:r>
+            <w:r>
+              <w:rPr>
+                <w:rFonts w:ascii="BRH Malayalam Extra" w:hAnsi="BRH Malayalam Extra" w:cs="BRH Malayalam Extra"/>
+                <w:color w:val="000000"/>
+                <w:sz w:val="32"/>
+                <w:szCs w:val="32"/>
+                <w:lang w:val="it-IT"/>
               </w:rPr>
               <w:t>Zj— D¦</w:t>
             </w:r>
@@ -23450,15 +23854,17 @@
                 <w:color w:val="000000"/>
                 <w:sz w:val="26"/>
                 <w:szCs w:val="32"/>
-              </w:rPr>
-              <w:t>–</w:t>
-            </w:r>
-            <w:r>
-              <w:rPr>
-                <w:rFonts w:ascii="BRH Malayalam Extra" w:hAnsi="BRH Malayalam Extra" w:cs="BRH Malayalam Extra"/>
-                <w:color w:val="000000"/>
-                <w:sz w:val="32"/>
-                <w:szCs w:val="32"/>
+                <w:lang w:val="it-IT"/>
+              </w:rPr>
+              <w:t>–</w:t>
+            </w:r>
+            <w:r>
+              <w:rPr>
+                <w:rFonts w:ascii="BRH Malayalam Extra" w:hAnsi="BRH Malayalam Extra" w:cs="BRH Malayalam Extra"/>
+                <w:color w:val="000000"/>
+                <w:sz w:val="32"/>
+                <w:szCs w:val="32"/>
+                <w:lang w:val="it-IT"/>
               </w:rPr>
               <w:t>Z¥j</w:t>
             </w:r>
@@ -23468,15 +23874,17 @@
                 <w:color w:val="000000"/>
                 <w:sz w:val="26"/>
                 <w:szCs w:val="32"/>
-              </w:rPr>
-              <w:t>–</w:t>
-            </w:r>
-            <w:r>
-              <w:rPr>
-                <w:rFonts w:ascii="BRH Malayalam Extra" w:hAnsi="BRH Malayalam Extra" w:cs="BRH Malayalam Extra"/>
-                <w:color w:val="000000"/>
-                <w:sz w:val="32"/>
-                <w:szCs w:val="32"/>
+                <w:lang w:val="it-IT"/>
+              </w:rPr>
+              <w:t>–</w:t>
+            </w:r>
+            <w:r>
+              <w:rPr>
+                <w:rFonts w:ascii="BRH Malayalam Extra" w:hAnsi="BRH Malayalam Extra" w:cs="BRH Malayalam Extra"/>
+                <w:color w:val="000000"/>
+                <w:sz w:val="32"/>
+                <w:szCs w:val="32"/>
+                <w:lang w:val="it-IT"/>
               </w:rPr>
               <w:t xml:space="preserve"> q¡h</w:t>
             </w:r>
@@ -23486,15 +23894,17 @@
                 <w:color w:val="000000"/>
                 <w:sz w:val="26"/>
                 <w:szCs w:val="32"/>
-              </w:rPr>
-              <w:t>–</w:t>
-            </w:r>
-            <w:r>
-              <w:rPr>
-                <w:rFonts w:ascii="BRH Malayalam Extra" w:hAnsi="BRH Malayalam Extra" w:cs="BRH Malayalam Extra"/>
-                <w:color w:val="000000"/>
-                <w:sz w:val="32"/>
-                <w:szCs w:val="32"/>
+                <w:lang w:val="it-IT"/>
+              </w:rPr>
+              <w:t>–</w:t>
+            </w:r>
+            <w:r>
+              <w:rPr>
+                <w:rFonts w:ascii="BRH Malayalam Extra" w:hAnsi="BRH Malayalam Extra" w:cs="BRH Malayalam Extra"/>
+                <w:color w:val="000000"/>
+                <w:sz w:val="32"/>
+                <w:szCs w:val="32"/>
+                <w:lang w:val="it-IT"/>
               </w:rPr>
               <w:t xml:space="preserve">I </w:t>
             </w:r>
@@ -23511,6 +23921,7 @@
                 <w:color w:val="000000"/>
                 <w:sz w:val="32"/>
                 <w:szCs w:val="32"/>
+                <w:lang w:val="it-IT"/>
               </w:rPr>
             </w:pPr>
             <w:r>
@@ -23519,6 +23930,7 @@
                 <w:color w:val="000000"/>
                 <w:sz w:val="32"/>
                 <w:szCs w:val="32"/>
+                <w:lang w:val="it-IT"/>
               </w:rPr>
               <w:t>Miy—rç¦</w:t>
             </w:r>
@@ -23528,15 +23940,17 @@
                 <w:color w:val="000000"/>
                 <w:sz w:val="26"/>
                 <w:szCs w:val="32"/>
-              </w:rPr>
-              <w:t>–</w:t>
-            </w:r>
-            <w:r>
-              <w:rPr>
-                <w:rFonts w:ascii="BRH Malayalam Extra" w:hAnsi="BRH Malayalam Extra" w:cs="BRH Malayalam Extra"/>
-                <w:color w:val="000000"/>
-                <w:sz w:val="32"/>
-                <w:szCs w:val="32"/>
+                <w:lang w:val="it-IT"/>
+              </w:rPr>
+              <w:t>–</w:t>
+            </w:r>
+            <w:r>
+              <w:rPr>
+                <w:rFonts w:ascii="BRH Malayalam Extra" w:hAnsi="BRH Malayalam Extra" w:cs="BRH Malayalam Extra"/>
+                <w:color w:val="000000"/>
+                <w:sz w:val="32"/>
+                <w:szCs w:val="32"/>
+                <w:lang w:val="it-IT"/>
               </w:rPr>
               <w:t xml:space="preserve"> Miy—rç¦</w:t>
             </w:r>
@@ -23546,15 +23960,17 @@
                 <w:color w:val="000000"/>
                 <w:sz w:val="26"/>
                 <w:szCs w:val="32"/>
-              </w:rPr>
-              <w:t>–</w:t>
-            </w:r>
-            <w:r>
-              <w:rPr>
-                <w:rFonts w:ascii="BRH Malayalam Extra" w:hAnsi="BRH Malayalam Extra" w:cs="BRH Malayalam Extra"/>
-                <w:color w:val="000000"/>
-                <w:sz w:val="32"/>
-                <w:szCs w:val="32"/>
+                <w:lang w:val="it-IT"/>
+              </w:rPr>
+              <w:t>–</w:t>
+            </w:r>
+            <w:r>
+              <w:rPr>
+                <w:rFonts w:ascii="BRH Malayalam Extra" w:hAnsi="BRH Malayalam Extra" w:cs="BRH Malayalam Extra"/>
+                <w:color w:val="000000"/>
+                <w:sz w:val="32"/>
+                <w:szCs w:val="32"/>
+                <w:lang w:val="it-IT"/>
               </w:rPr>
               <w:t xml:space="preserve"> q¡h— i¢</w:t>
             </w:r>
@@ -23564,15 +23980,17 @@
                 <w:color w:val="000000"/>
                 <w:sz w:val="26"/>
                 <w:szCs w:val="32"/>
-              </w:rPr>
-              <w:t>–</w:t>
-            </w:r>
-            <w:r>
-              <w:rPr>
-                <w:rFonts w:ascii="BRH Malayalam Extra" w:hAnsi="BRH Malayalam Extra" w:cs="BRH Malayalam Extra"/>
-                <w:color w:val="000000"/>
-                <w:sz w:val="32"/>
-                <w:szCs w:val="32"/>
+                <w:lang w:val="it-IT"/>
+              </w:rPr>
+              <w:t>–</w:t>
+            </w:r>
+            <w:r>
+              <w:rPr>
+                <w:rFonts w:ascii="BRH Malayalam Extra" w:hAnsi="BRH Malayalam Extra" w:cs="BRH Malayalam Extra"/>
+                <w:color w:val="000000"/>
+                <w:sz w:val="32"/>
+                <w:szCs w:val="32"/>
+                <w:lang w:val="it-IT"/>
               </w:rPr>
               <w:t>Zj— D¦</w:t>
             </w:r>
@@ -23582,15 +24000,17 @@
                 <w:color w:val="000000"/>
                 <w:sz w:val="26"/>
                 <w:szCs w:val="32"/>
-              </w:rPr>
-              <w:t>–</w:t>
-            </w:r>
-            <w:r>
-              <w:rPr>
-                <w:rFonts w:ascii="BRH Malayalam Extra" w:hAnsi="BRH Malayalam Extra" w:cs="BRH Malayalam Extra"/>
-                <w:color w:val="000000"/>
-                <w:sz w:val="32"/>
-                <w:szCs w:val="32"/>
+                <w:lang w:val="it-IT"/>
+              </w:rPr>
+              <w:t>–</w:t>
+            </w:r>
+            <w:r>
+              <w:rPr>
+                <w:rFonts w:ascii="BRH Malayalam Extra" w:hAnsi="BRH Malayalam Extra" w:cs="BRH Malayalam Extra"/>
+                <w:color w:val="000000"/>
+                <w:sz w:val="32"/>
+                <w:szCs w:val="32"/>
+                <w:lang w:val="it-IT"/>
               </w:rPr>
               <w:t>Z¥j</w:t>
             </w:r>
@@ -23600,15 +24020,17 @@
                 <w:color w:val="000000"/>
                 <w:sz w:val="26"/>
                 <w:szCs w:val="32"/>
-              </w:rPr>
-              <w:t>–</w:t>
-            </w:r>
-            <w:r>
-              <w:rPr>
-                <w:rFonts w:ascii="BRH Malayalam Extra" w:hAnsi="BRH Malayalam Extra" w:cs="BRH Malayalam Extra"/>
-                <w:color w:val="000000"/>
-                <w:sz w:val="32"/>
-                <w:szCs w:val="32"/>
+                <w:lang w:val="it-IT"/>
+              </w:rPr>
+              <w:t>–</w:t>
+            </w:r>
+            <w:r>
+              <w:rPr>
+                <w:rFonts w:ascii="BRH Malayalam Extra" w:hAnsi="BRH Malayalam Extra" w:cs="BRH Malayalam Extra"/>
+                <w:color w:val="000000"/>
+                <w:sz w:val="32"/>
+                <w:szCs w:val="32"/>
+                <w:lang w:val="it-IT"/>
               </w:rPr>
               <w:t xml:space="preserve"> q¡h</w:t>
             </w:r>
@@ -23618,15 +24040,17 @@
                 <w:color w:val="000000"/>
                 <w:sz w:val="26"/>
                 <w:szCs w:val="32"/>
-              </w:rPr>
-              <w:t>–</w:t>
-            </w:r>
-            <w:r>
-              <w:rPr>
-                <w:rFonts w:ascii="BRH Malayalam Extra" w:hAnsi="BRH Malayalam Extra" w:cs="BRH Malayalam Extra"/>
-                <w:color w:val="000000"/>
-                <w:sz w:val="32"/>
-                <w:szCs w:val="32"/>
+                <w:lang w:val="it-IT"/>
+              </w:rPr>
+              <w:t>–</w:t>
+            </w:r>
+            <w:r>
+              <w:rPr>
+                <w:rFonts w:ascii="BRH Malayalam Extra" w:hAnsi="BRH Malayalam Extra" w:cs="BRH Malayalam Extra"/>
+                <w:color w:val="000000"/>
+                <w:sz w:val="32"/>
+                <w:szCs w:val="32"/>
+                <w:lang w:val="it-IT"/>
               </w:rPr>
               <w:t xml:space="preserve">I </w:t>
             </w:r>
@@ -23643,6 +24067,7 @@
                 <w:color w:val="000000"/>
                 <w:sz w:val="32"/>
                 <w:szCs w:val="32"/>
+                <w:lang w:val="it-IT"/>
               </w:rPr>
             </w:pPr>
             <w:r>
@@ -23651,6 +24076,7 @@
                 <w:color w:val="000000"/>
                 <w:sz w:val="32"/>
                 <w:szCs w:val="32"/>
+                <w:lang w:val="it-IT"/>
               </w:rPr>
               <w:t xml:space="preserve">Miy—rç¦ | </w:t>
             </w:r>
@@ -23667,6 +24093,7 @@
                 <w:color w:val="000000"/>
                 <w:sz w:val="32"/>
                 <w:szCs w:val="32"/>
+                <w:lang w:val="it-IT"/>
               </w:rPr>
             </w:pPr>
             <w:r>
@@ -23674,6 +24101,7 @@
                 <w:rFonts w:cs="BRH Malayalam Extra"/>
                 <w:color w:val="000000"/>
                 <w:szCs w:val="32"/>
+                <w:lang w:val="it-IT"/>
               </w:rPr>
               <w:t>51</w:t>
             </w:r>
@@ -23683,6 +24111,7 @@
                 <w:color w:val="000000"/>
                 <w:sz w:val="32"/>
                 <w:szCs w:val="32"/>
+                <w:lang w:val="it-IT"/>
               </w:rPr>
               <w:t>)</w:t>
             </w:r>
@@ -23692,6 +24121,7 @@
                 <w:color w:val="000000"/>
                 <w:sz w:val="32"/>
                 <w:szCs w:val="32"/>
+                <w:lang w:val="it-IT"/>
               </w:rPr>
               <w:tab/>
             </w:r>
@@ -23700,6 +24130,7 @@
                 <w:rFonts w:cs="BRH Malayalam Extra"/>
                 <w:color w:val="000000"/>
                 <w:szCs w:val="32"/>
+                <w:lang w:val="it-IT"/>
               </w:rPr>
               <w:t>4</w:t>
             </w:r>
@@ -23709,6 +24140,7 @@
                 <w:color w:val="000000"/>
                 <w:sz w:val="32"/>
                 <w:szCs w:val="32"/>
+                <w:lang w:val="it-IT"/>
               </w:rPr>
               <w:t>.</w:t>
             </w:r>
@@ -23717,6 +24149,7 @@
                 <w:rFonts w:cs="BRH Malayalam Extra"/>
                 <w:color w:val="000000"/>
                 <w:szCs w:val="32"/>
+                <w:lang w:val="it-IT"/>
               </w:rPr>
               <w:t>7</w:t>
             </w:r>
@@ -23726,6 +24159,7 @@
                 <w:color w:val="000000"/>
                 <w:sz w:val="32"/>
                 <w:szCs w:val="32"/>
+                <w:lang w:val="it-IT"/>
               </w:rPr>
               <w:t>.</w:t>
             </w:r>
@@ -23734,6 +24168,7 @@
                 <w:rFonts w:cs="BRH Malayalam Extra"/>
                 <w:color w:val="000000"/>
                 <w:szCs w:val="32"/>
+                <w:lang w:val="it-IT"/>
               </w:rPr>
               <w:t>15</w:t>
             </w:r>
@@ -23743,6 +24178,7 @@
                 <w:color w:val="000000"/>
                 <w:sz w:val="32"/>
                 <w:szCs w:val="32"/>
+                <w:lang w:val="it-IT"/>
               </w:rPr>
               <w:t>.</w:t>
             </w:r>
@@ -23751,6 +24187,7 @@
                 <w:rFonts w:cs="BRH Malayalam Extra"/>
                 <w:color w:val="000000"/>
                 <w:szCs w:val="32"/>
+                <w:lang w:val="it-IT"/>
               </w:rPr>
               <w:t>3</w:t>
             </w:r>
@@ -23760,6 +24197,7 @@
                 <w:color w:val="000000"/>
                 <w:sz w:val="32"/>
                 <w:szCs w:val="32"/>
+                <w:lang w:val="it-IT"/>
               </w:rPr>
               <w:t>(</w:t>
             </w:r>
@@ -23768,6 +24206,7 @@
                 <w:rFonts w:cs="BRH Malayalam Extra"/>
                 <w:color w:val="000000"/>
                 <w:szCs w:val="32"/>
+                <w:lang w:val="it-IT"/>
               </w:rPr>
               <w:t>46</w:t>
             </w:r>
@@ -23777,6 +24216,7 @@
                 <w:color w:val="000000"/>
                 <w:sz w:val="32"/>
                 <w:szCs w:val="32"/>
+                <w:lang w:val="it-IT"/>
               </w:rPr>
               <w:t>)- q¡h˜I | Miy—rç¦ | s¡</w:t>
             </w:r>
@@ -23786,15 +24226,17 @@
                 <w:color w:val="000000"/>
                 <w:sz w:val="26"/>
                 <w:szCs w:val="32"/>
-              </w:rPr>
-              <w:t>–</w:t>
-            </w:r>
-            <w:r>
-              <w:rPr>
-                <w:rFonts w:ascii="BRH Malayalam Extra" w:hAnsi="BRH Malayalam Extra" w:cs="BRH Malayalam Extra"/>
-                <w:color w:val="000000"/>
-                <w:sz w:val="32"/>
-                <w:szCs w:val="32"/>
+                <w:lang w:val="it-IT"/>
+              </w:rPr>
+              <w:t>–</w:t>
+            </w:r>
+            <w:r>
+              <w:rPr>
+                <w:rFonts w:ascii="BRH Malayalam Extra" w:hAnsi="BRH Malayalam Extra" w:cs="BRH Malayalam Extra"/>
+                <w:color w:val="000000"/>
+                <w:sz w:val="32"/>
+                <w:szCs w:val="32"/>
+                <w:lang w:val="it-IT"/>
               </w:rPr>
               <w:t>j¥i—hyJ |</w:t>
             </w:r>
@@ -23811,6 +24253,7 @@
                 <w:color w:val="000000"/>
                 <w:sz w:val="32"/>
                 <w:szCs w:val="32"/>
+                <w:lang w:val="it-IT"/>
               </w:rPr>
             </w:pPr>
             <w:r>
@@ -23819,6 +24262,7 @@
                 <w:color w:val="000000"/>
                 <w:sz w:val="32"/>
                 <w:szCs w:val="32"/>
+                <w:lang w:val="it-IT"/>
               </w:rPr>
               <w:t>q¡h</w:t>
             </w:r>
@@ -23828,15 +24272,17 @@
                 <w:color w:val="000000"/>
                 <w:sz w:val="26"/>
                 <w:szCs w:val="32"/>
-              </w:rPr>
-              <w:t>–</w:t>
-            </w:r>
-            <w:r>
-              <w:rPr>
-                <w:rFonts w:ascii="BRH Malayalam Extra" w:hAnsi="BRH Malayalam Extra" w:cs="BRH Malayalam Extra"/>
-                <w:color w:val="000000"/>
-                <w:sz w:val="32"/>
-                <w:szCs w:val="32"/>
+                <w:lang w:val="it-IT"/>
+              </w:rPr>
+              <w:t>–</w:t>
+            </w:r>
+            <w:r>
+              <w:rPr>
+                <w:rFonts w:ascii="BRH Malayalam Extra" w:hAnsi="BRH Malayalam Extra" w:cs="BRH Malayalam Extra"/>
+                <w:color w:val="000000"/>
+                <w:sz w:val="32"/>
+                <w:szCs w:val="32"/>
+                <w:lang w:val="it-IT"/>
               </w:rPr>
               <w:t>I Miy—rç¦</w:t>
             </w:r>
@@ -23846,15 +24292,17 @@
                 <w:color w:val="000000"/>
                 <w:sz w:val="26"/>
                 <w:szCs w:val="32"/>
-              </w:rPr>
-              <w:t>–</w:t>
-            </w:r>
-            <w:r>
-              <w:rPr>
-                <w:rFonts w:ascii="BRH Malayalam Extra" w:hAnsi="BRH Malayalam Extra" w:cs="BRH Malayalam Extra"/>
-                <w:color w:val="000000"/>
-                <w:sz w:val="32"/>
-                <w:szCs w:val="32"/>
+                <w:lang w:val="it-IT"/>
+              </w:rPr>
+              <w:t>–</w:t>
+            </w:r>
+            <w:r>
+              <w:rPr>
+                <w:rFonts w:ascii="BRH Malayalam Extra" w:hAnsi="BRH Malayalam Extra" w:cs="BRH Malayalam Extra"/>
+                <w:color w:val="000000"/>
+                <w:sz w:val="32"/>
+                <w:szCs w:val="32"/>
+                <w:lang w:val="it-IT"/>
               </w:rPr>
               <w:t xml:space="preserve"> Miy—rç¦</w:t>
             </w:r>
@@ -23864,15 +24312,17 @@
                 <w:color w:val="000000"/>
                 <w:sz w:val="26"/>
                 <w:szCs w:val="32"/>
-              </w:rPr>
-              <w:t>–</w:t>
-            </w:r>
-            <w:r>
-              <w:rPr>
-                <w:rFonts w:ascii="BRH Malayalam Extra" w:hAnsi="BRH Malayalam Extra" w:cs="BRH Malayalam Extra"/>
-                <w:color w:val="000000"/>
-                <w:sz w:val="32"/>
-                <w:szCs w:val="32"/>
+                <w:lang w:val="it-IT"/>
+              </w:rPr>
+              <w:t>–</w:t>
+            </w:r>
+            <w:r>
+              <w:rPr>
+                <w:rFonts w:ascii="BRH Malayalam Extra" w:hAnsi="BRH Malayalam Extra" w:cs="BRH Malayalam Extra"/>
+                <w:color w:val="000000"/>
+                <w:sz w:val="32"/>
+                <w:szCs w:val="32"/>
+                <w:lang w:val="it-IT"/>
               </w:rPr>
               <w:t xml:space="preserve"> q¡h</w:t>
             </w:r>
@@ -23882,6 +24332,7 @@
                 <w:color w:val="000000"/>
                 <w:sz w:val="26"/>
                 <w:szCs w:val="32"/>
+                <w:lang w:val="it-IT"/>
               </w:rPr>
               <w:t>–</w:t>
             </w:r>
@@ -23892,6 +24343,7 @@
                 <w:sz w:val="32"/>
                 <w:szCs w:val="32"/>
                 <w:highlight w:val="green"/>
+                <w:lang w:val="it-IT"/>
               </w:rPr>
               <w:t>(³§</w:t>
             </w:r>
@@ -23901,6 +24353,7 @@
                 <w:color w:val="000000"/>
                 <w:sz w:val="32"/>
                 <w:szCs w:val="32"/>
+                <w:lang w:val="it-IT"/>
               </w:rPr>
               <w:t>)</w:t>
             </w:r>
@@ -23910,15 +24363,17 @@
                 <w:color w:val="000000"/>
                 <w:sz w:val="26"/>
                 <w:szCs w:val="32"/>
-              </w:rPr>
-              <w:t>–</w:t>
-            </w:r>
-            <w:r>
-              <w:rPr>
-                <w:rFonts w:ascii="BRH Malayalam Extra" w:hAnsi="BRH Malayalam Extra" w:cs="BRH Malayalam Extra"/>
-                <w:color w:val="000000"/>
-                <w:sz w:val="32"/>
-                <w:szCs w:val="32"/>
+                <w:lang w:val="it-IT"/>
+              </w:rPr>
+              <w:t>–</w:t>
+            </w:r>
+            <w:r>
+              <w:rPr>
+                <w:rFonts w:ascii="BRH Malayalam Extra" w:hAnsi="BRH Malayalam Extra" w:cs="BRH Malayalam Extra"/>
+                <w:color w:val="000000"/>
+                <w:sz w:val="32"/>
+                <w:szCs w:val="32"/>
+                <w:lang w:val="it-IT"/>
               </w:rPr>
               <w:t xml:space="preserve"> q¡h</w:t>
             </w:r>
@@ -23928,15 +24383,17 @@
                 <w:color w:val="000000"/>
                 <w:sz w:val="26"/>
                 <w:szCs w:val="32"/>
-              </w:rPr>
-              <w:t>–</w:t>
-            </w:r>
-            <w:r>
-              <w:rPr>
-                <w:rFonts w:ascii="BRH Malayalam Extra" w:hAnsi="BRH Malayalam Extra" w:cs="BRH Malayalam Extra"/>
-                <w:color w:val="000000"/>
-                <w:sz w:val="32"/>
-                <w:szCs w:val="32"/>
+                <w:lang w:val="it-IT"/>
+              </w:rPr>
+              <w:t>–</w:t>
+            </w:r>
+            <w:r>
+              <w:rPr>
+                <w:rFonts w:ascii="BRH Malayalam Extra" w:hAnsi="BRH Malayalam Extra" w:cs="BRH Malayalam Extra"/>
+                <w:color w:val="000000"/>
+                <w:sz w:val="32"/>
+                <w:szCs w:val="32"/>
+                <w:lang w:val="it-IT"/>
               </w:rPr>
               <w:t xml:space="preserve">I Miy—rç¦ </w:t>
             </w:r>
@@ -23953,6 +24410,7 @@
                 <w:color w:val="000000"/>
                 <w:sz w:val="32"/>
                 <w:szCs w:val="32"/>
+                <w:lang w:val="it-IT"/>
               </w:rPr>
             </w:pPr>
             <w:r>
@@ -23961,6 +24419,7 @@
                 <w:color w:val="000000"/>
                 <w:sz w:val="32"/>
                 <w:szCs w:val="32"/>
+                <w:lang w:val="it-IT"/>
               </w:rPr>
               <w:t>s¡</w:t>
             </w:r>
@@ -23970,15 +24429,17 @@
                 <w:color w:val="000000"/>
                 <w:sz w:val="26"/>
                 <w:szCs w:val="32"/>
-              </w:rPr>
-              <w:t>–</w:t>
-            </w:r>
-            <w:r>
-              <w:rPr>
-                <w:rFonts w:ascii="BRH Malayalam Extra" w:hAnsi="BRH Malayalam Extra" w:cs="BRH Malayalam Extra"/>
-                <w:color w:val="000000"/>
-                <w:sz w:val="32"/>
-                <w:szCs w:val="32"/>
+                <w:lang w:val="it-IT"/>
+              </w:rPr>
+              <w:t>–</w:t>
+            </w:r>
+            <w:r>
+              <w:rPr>
+                <w:rFonts w:ascii="BRH Malayalam Extra" w:hAnsi="BRH Malayalam Extra" w:cs="BRH Malayalam Extra"/>
+                <w:color w:val="000000"/>
+                <w:sz w:val="32"/>
+                <w:szCs w:val="32"/>
+                <w:lang w:val="it-IT"/>
               </w:rPr>
               <w:t>j¥i—hyJ s¡</w:t>
             </w:r>
@@ -23988,15 +24449,17 @@
                 <w:color w:val="000000"/>
                 <w:sz w:val="26"/>
                 <w:szCs w:val="32"/>
-              </w:rPr>
-              <w:t>–</w:t>
-            </w:r>
-            <w:r>
-              <w:rPr>
-                <w:rFonts w:ascii="BRH Malayalam Extra" w:hAnsi="BRH Malayalam Extra" w:cs="BRH Malayalam Extra"/>
-                <w:color w:val="000000"/>
-                <w:sz w:val="32"/>
-                <w:szCs w:val="32"/>
+                <w:lang w:val="it-IT"/>
+              </w:rPr>
+              <w:t>–</w:t>
+            </w:r>
+            <w:r>
+              <w:rPr>
+                <w:rFonts w:ascii="BRH Malayalam Extra" w:hAnsi="BRH Malayalam Extra" w:cs="BRH Malayalam Extra"/>
+                <w:color w:val="000000"/>
+                <w:sz w:val="32"/>
+                <w:szCs w:val="32"/>
+                <w:lang w:val="it-IT"/>
               </w:rPr>
               <w:t>j¥i—hy</w:t>
             </w:r>
@@ -24006,15 +24469,17 @@
                 <w:color w:val="000000"/>
                 <w:sz w:val="26"/>
                 <w:szCs w:val="32"/>
-              </w:rPr>
-              <w:t>–</w:t>
-            </w:r>
-            <w:r>
-              <w:rPr>
-                <w:rFonts w:ascii="BRH Malayalam Extra" w:hAnsi="BRH Malayalam Extra" w:cs="BRH Malayalam Extra"/>
-                <w:color w:val="000000"/>
-                <w:sz w:val="32"/>
-                <w:szCs w:val="32"/>
+                <w:lang w:val="it-IT"/>
+              </w:rPr>
+              <w:t>–</w:t>
+            </w:r>
+            <w:r>
+              <w:rPr>
+                <w:rFonts w:ascii="BRH Malayalam Extra" w:hAnsi="BRH Malayalam Extra" w:cs="BRH Malayalam Extra"/>
+                <w:color w:val="000000"/>
+                <w:sz w:val="32"/>
+                <w:szCs w:val="32"/>
+                <w:lang w:val="it-IT"/>
               </w:rPr>
               <w:t>ª Miy—rç¦</w:t>
             </w:r>
@@ -24024,15 +24489,17 @@
                 <w:color w:val="000000"/>
                 <w:sz w:val="26"/>
                 <w:szCs w:val="32"/>
-              </w:rPr>
-              <w:t>–</w:t>
-            </w:r>
-            <w:r>
-              <w:rPr>
-                <w:rFonts w:ascii="BRH Malayalam Extra" w:hAnsi="BRH Malayalam Extra" w:cs="BRH Malayalam Extra"/>
-                <w:color w:val="000000"/>
-                <w:sz w:val="32"/>
-                <w:szCs w:val="32"/>
+                <w:lang w:val="it-IT"/>
+              </w:rPr>
+              <w:t>–</w:t>
+            </w:r>
+            <w:r>
+              <w:rPr>
+                <w:rFonts w:ascii="BRH Malayalam Extra" w:hAnsi="BRH Malayalam Extra" w:cs="BRH Malayalam Extra"/>
+                <w:color w:val="000000"/>
+                <w:sz w:val="32"/>
+                <w:szCs w:val="32"/>
+                <w:lang w:val="it-IT"/>
               </w:rPr>
               <w:t xml:space="preserve"> q¡h</w:t>
             </w:r>
@@ -24042,15 +24509,17 @@
                 <w:color w:val="000000"/>
                 <w:sz w:val="26"/>
                 <w:szCs w:val="32"/>
-              </w:rPr>
-              <w:t>–</w:t>
-            </w:r>
-            <w:r>
-              <w:rPr>
-                <w:rFonts w:ascii="BRH Malayalam Extra" w:hAnsi="BRH Malayalam Extra" w:cs="BRH Malayalam Extra"/>
-                <w:color w:val="000000"/>
-                <w:sz w:val="32"/>
-                <w:szCs w:val="32"/>
+                <w:lang w:val="it-IT"/>
+              </w:rPr>
+              <w:t>–</w:t>
+            </w:r>
+            <w:r>
+              <w:rPr>
+                <w:rFonts w:ascii="BRH Malayalam Extra" w:hAnsi="BRH Malayalam Extra" w:cs="BRH Malayalam Extra"/>
+                <w:color w:val="000000"/>
+                <w:sz w:val="32"/>
+                <w:szCs w:val="32"/>
+                <w:lang w:val="it-IT"/>
               </w:rPr>
               <w:t>(</w:t>
             </w:r>
@@ -24061,6 +24530,7 @@
                 <w:sz w:val="32"/>
                 <w:szCs w:val="32"/>
                 <w:highlight w:val="green"/>
+                <w:lang w:val="it-IT"/>
               </w:rPr>
               <w:t>³§</w:t>
             </w:r>
@@ -24070,6 +24540,7 @@
                 <w:color w:val="000000"/>
                 <w:sz w:val="32"/>
                 <w:szCs w:val="32"/>
+                <w:lang w:val="it-IT"/>
               </w:rPr>
               <w:t>)</w:t>
             </w:r>
@@ -24079,15 +24550,17 @@
                 <w:color w:val="000000"/>
                 <w:sz w:val="26"/>
                 <w:szCs w:val="32"/>
-              </w:rPr>
-              <w:t>–</w:t>
-            </w:r>
-            <w:r>
-              <w:rPr>
-                <w:rFonts w:ascii="BRH Malayalam Extra" w:hAnsi="BRH Malayalam Extra" w:cs="BRH Malayalam Extra"/>
-                <w:color w:val="000000"/>
-                <w:sz w:val="32"/>
-                <w:szCs w:val="32"/>
+                <w:lang w:val="it-IT"/>
+              </w:rPr>
+              <w:t>–</w:t>
+            </w:r>
+            <w:r>
+              <w:rPr>
+                <w:rFonts w:ascii="BRH Malayalam Extra" w:hAnsi="BRH Malayalam Extra" w:cs="BRH Malayalam Extra"/>
+                <w:color w:val="000000"/>
+                <w:sz w:val="32"/>
+                <w:szCs w:val="32"/>
+                <w:lang w:val="it-IT"/>
               </w:rPr>
               <w:t xml:space="preserve"> q¡h</w:t>
             </w:r>
@@ -24097,15 +24570,17 @@
                 <w:color w:val="000000"/>
                 <w:sz w:val="26"/>
                 <w:szCs w:val="32"/>
-              </w:rPr>
-              <w:t>–</w:t>
-            </w:r>
-            <w:r>
-              <w:rPr>
-                <w:rFonts w:ascii="BRH Malayalam Extra" w:hAnsi="BRH Malayalam Extra" w:cs="BRH Malayalam Extra"/>
-                <w:color w:val="000000"/>
-                <w:sz w:val="32"/>
-                <w:szCs w:val="32"/>
+                <w:lang w:val="it-IT"/>
+              </w:rPr>
+              <w:t>–</w:t>
+            </w:r>
+            <w:r>
+              <w:rPr>
+                <w:rFonts w:ascii="BRH Malayalam Extra" w:hAnsi="BRH Malayalam Extra" w:cs="BRH Malayalam Extra"/>
+                <w:color w:val="000000"/>
+                <w:sz w:val="32"/>
+                <w:szCs w:val="32"/>
+                <w:lang w:val="it-IT"/>
               </w:rPr>
               <w:t xml:space="preserve">I </w:t>
             </w:r>
@@ -24120,6 +24595,7 @@
               <w:rPr>
                 <w:rFonts w:cs="BRH Malayalam Extra"/>
                 <w:szCs w:val="40"/>
+                <w:lang w:val="it-IT"/>
               </w:rPr>
             </w:pPr>
             <w:r>
@@ -24128,6 +24604,7 @@
                 <w:color w:val="000000"/>
                 <w:sz w:val="32"/>
                 <w:szCs w:val="32"/>
+                <w:lang w:val="it-IT"/>
               </w:rPr>
               <w:t>Miy—rç¦ s¡</w:t>
             </w:r>
@@ -24137,15 +24614,17 @@
                 <w:color w:val="000000"/>
                 <w:sz w:val="26"/>
                 <w:szCs w:val="32"/>
-              </w:rPr>
-              <w:t>–</w:t>
-            </w:r>
-            <w:r>
-              <w:rPr>
-                <w:rFonts w:ascii="BRH Malayalam Extra" w:hAnsi="BRH Malayalam Extra" w:cs="BRH Malayalam Extra"/>
-                <w:color w:val="000000"/>
-                <w:sz w:val="32"/>
-                <w:szCs w:val="32"/>
+                <w:lang w:val="it-IT"/>
+              </w:rPr>
+              <w:t>–</w:t>
+            </w:r>
+            <w:r>
+              <w:rPr>
+                <w:rFonts w:ascii="BRH Malayalam Extra" w:hAnsi="BRH Malayalam Extra" w:cs="BRH Malayalam Extra"/>
+                <w:color w:val="000000"/>
+                <w:sz w:val="32"/>
+                <w:szCs w:val="32"/>
+                <w:lang w:val="it-IT"/>
               </w:rPr>
               <w:t xml:space="preserve">j¥i—hyJ | </w:t>
             </w:r>
@@ -24168,6 +24647,7 @@
                 <w:rFonts w:cs="BRH Malayalam Extra"/>
                 <w:color w:val="000000"/>
                 <w:szCs w:val="40"/>
+                <w:lang w:val="it-IT"/>
               </w:rPr>
             </w:pPr>
           </w:p>
@@ -24182,6 +24662,7 @@
                 <w:rFonts w:cs="BRH Malayalam Extra"/>
                 <w:color w:val="000000"/>
                 <w:szCs w:val="40"/>
+                <w:lang w:val="it-IT"/>
               </w:rPr>
             </w:pPr>
           </w:p>
@@ -24197,6 +24678,7 @@
                 <w:color w:val="000000"/>
                 <w:sz w:val="32"/>
                 <w:szCs w:val="40"/>
+                <w:lang w:val="it-IT"/>
               </w:rPr>
             </w:pPr>
             <w:r>
@@ -24204,6 +24686,7 @@
                 <w:rFonts w:cs="BRH Malayalam Extra"/>
                 <w:color w:val="000000"/>
                 <w:szCs w:val="40"/>
+                <w:lang w:val="it-IT"/>
               </w:rPr>
               <w:lastRenderedPageBreak/>
               <w:t>2</w:t>
@@ -24214,6 +24697,7 @@
                 <w:color w:val="000000"/>
                 <w:sz w:val="32"/>
                 <w:szCs w:val="40"/>
+                <w:lang w:val="it-IT"/>
               </w:rPr>
               <w:t>)</w:t>
             </w:r>
@@ -24223,6 +24707,7 @@
                 <w:color w:val="000000"/>
                 <w:sz w:val="32"/>
                 <w:szCs w:val="40"/>
+                <w:lang w:val="it-IT"/>
               </w:rPr>
               <w:tab/>
             </w:r>
@@ -24231,6 +24716,7 @@
                 <w:rFonts w:cs="BRH Malayalam Extra"/>
                 <w:color w:val="000000"/>
                 <w:szCs w:val="40"/>
+                <w:lang w:val="it-IT"/>
               </w:rPr>
               <w:t>4</w:t>
             </w:r>
@@ -24240,6 +24726,7 @@
                 <w:color w:val="000000"/>
                 <w:sz w:val="32"/>
                 <w:szCs w:val="40"/>
+                <w:lang w:val="it-IT"/>
               </w:rPr>
               <w:t>.</w:t>
             </w:r>
@@ -24248,6 +24735,7 @@
                 <w:rFonts w:cs="BRH Malayalam Extra"/>
                 <w:color w:val="000000"/>
                 <w:szCs w:val="40"/>
+                <w:lang w:val="it-IT"/>
               </w:rPr>
               <w:t>7</w:t>
             </w:r>
@@ -24257,6 +24745,7 @@
                 <w:color w:val="000000"/>
                 <w:sz w:val="32"/>
                 <w:szCs w:val="40"/>
+                <w:lang w:val="it-IT"/>
               </w:rPr>
               <w:t>.</w:t>
             </w:r>
@@ -24265,6 +24754,7 @@
                 <w:rFonts w:cs="BRH Malayalam Extra"/>
                 <w:color w:val="000000"/>
                 <w:szCs w:val="40"/>
+                <w:lang w:val="it-IT"/>
               </w:rPr>
               <w:t>15</w:t>
             </w:r>
@@ -24274,6 +24764,7 @@
                 <w:color w:val="000000"/>
                 <w:sz w:val="32"/>
                 <w:szCs w:val="40"/>
+                <w:lang w:val="it-IT"/>
               </w:rPr>
               <w:t>.</w:t>
             </w:r>
@@ -24282,6 +24773,7 @@
                 <w:rFonts w:cs="BRH Malayalam Extra"/>
                 <w:color w:val="000000"/>
                 <w:szCs w:val="40"/>
+                <w:lang w:val="it-IT"/>
               </w:rPr>
               <w:t>7</w:t>
             </w:r>
@@ -24291,6 +24783,7 @@
                 <w:color w:val="000000"/>
                 <w:sz w:val="32"/>
                 <w:szCs w:val="40"/>
+                <w:lang w:val="it-IT"/>
               </w:rPr>
               <w:t>(</w:t>
             </w:r>
@@ -24299,6 +24792,7 @@
                 <w:rFonts w:cs="BRH Malayalam Extra"/>
                 <w:color w:val="000000"/>
                 <w:szCs w:val="40"/>
+                <w:lang w:val="it-IT"/>
               </w:rPr>
               <w:t>2</w:t>
             </w:r>
@@ -24308,6 +24802,7 @@
                 <w:color w:val="000000"/>
                 <w:sz w:val="32"/>
                 <w:szCs w:val="40"/>
+                <w:lang w:val="it-IT"/>
               </w:rPr>
               <w:t>)- K£</w:t>
             </w:r>
@@ -24317,15 +24812,17 @@
                 <w:color w:val="000000"/>
                 <w:sz w:val="28"/>
                 <w:szCs w:val="40"/>
-              </w:rPr>
-              <w:t>–</w:t>
-            </w:r>
-            <w:r>
-              <w:rPr>
-                <w:rFonts w:ascii="BRH Malayalam Extra" w:hAnsi="BRH Malayalam Extra" w:cs="BRH Malayalam Extra"/>
-                <w:color w:val="000000"/>
-                <w:sz w:val="32"/>
-                <w:szCs w:val="40"/>
+                <w:lang w:val="it-IT"/>
+              </w:rPr>
+              <w:t>–</w:t>
+            </w:r>
+            <w:r>
+              <w:rPr>
+                <w:rFonts w:ascii="BRH Malayalam Extra" w:hAnsi="BRH Malayalam Extra" w:cs="BRH Malayalam Extra"/>
+                <w:color w:val="000000"/>
+                <w:sz w:val="32"/>
+                <w:szCs w:val="40"/>
+                <w:lang w:val="it-IT"/>
               </w:rPr>
               <w:t xml:space="preserve">cy | </w:t>
             </w:r>
@@ -24336,6 +24833,7 @@
                 <w:sz w:val="32"/>
                 <w:szCs w:val="40"/>
                 <w:highlight w:val="yellow"/>
+                <w:lang w:val="it-IT"/>
               </w:rPr>
               <w:t>s</w:t>
             </w:r>
@@ -24345,6 +24843,7 @@
                 <w:color w:val="000000"/>
                 <w:sz w:val="32"/>
                 <w:szCs w:val="40"/>
+                <w:lang w:val="it-IT"/>
               </w:rPr>
               <w:t>û | A</w:t>
             </w:r>
@@ -24354,15 +24853,17 @@
                 <w:color w:val="000000"/>
                 <w:sz w:val="28"/>
                 <w:szCs w:val="40"/>
-              </w:rPr>
-              <w:t>–</w:t>
-            </w:r>
-            <w:r>
-              <w:rPr>
-                <w:rFonts w:ascii="BRH Malayalam Extra" w:hAnsi="BRH Malayalam Extra" w:cs="BRH Malayalam Extra"/>
-                <w:color w:val="000000"/>
-                <w:sz w:val="32"/>
-                <w:szCs w:val="40"/>
+                <w:lang w:val="it-IT"/>
+              </w:rPr>
+              <w:t>–</w:t>
+            </w:r>
+            <w:r>
+              <w:rPr>
+                <w:rFonts w:ascii="BRH Malayalam Extra" w:hAnsi="BRH Malayalam Extra" w:cs="BRH Malayalam Extra"/>
+                <w:color w:val="000000"/>
+                <w:sz w:val="32"/>
+                <w:szCs w:val="40"/>
+                <w:lang w:val="it-IT"/>
               </w:rPr>
               <w:t xml:space="preserve">sôx© | </w:t>
             </w:r>
@@ -24379,6 +24880,7 @@
                 <w:color w:val="000000"/>
                 <w:sz w:val="32"/>
                 <w:szCs w:val="40"/>
+                <w:lang w:val="it-IT"/>
               </w:rPr>
             </w:pPr>
             <w:r>
@@ -24387,6 +24889,7 @@
                 <w:color w:val="000000"/>
                 <w:sz w:val="32"/>
                 <w:szCs w:val="40"/>
+                <w:lang w:val="it-IT"/>
               </w:rPr>
               <w:t>K£</w:t>
             </w:r>
@@ -24396,15 +24899,17 @@
                 <w:color w:val="000000"/>
                 <w:sz w:val="28"/>
                 <w:szCs w:val="40"/>
-              </w:rPr>
-              <w:t>–</w:t>
-            </w:r>
-            <w:r>
-              <w:rPr>
-                <w:rFonts w:ascii="BRH Malayalam Extra" w:hAnsi="BRH Malayalam Extra" w:cs="BRH Malayalam Extra"/>
-                <w:color w:val="000000"/>
-                <w:sz w:val="32"/>
-                <w:szCs w:val="40"/>
+                <w:lang w:val="it-IT"/>
+              </w:rPr>
+              <w:t>–</w:t>
+            </w:r>
+            <w:r>
+              <w:rPr>
+                <w:rFonts w:ascii="BRH Malayalam Extra" w:hAnsi="BRH Malayalam Extra" w:cs="BRH Malayalam Extra"/>
+                <w:color w:val="000000"/>
+                <w:sz w:val="32"/>
+                <w:szCs w:val="40"/>
+                <w:lang w:val="it-IT"/>
               </w:rPr>
               <w:t xml:space="preserve">cz </w:t>
             </w:r>
@@ -24415,6 +24920,7 @@
                 <w:sz w:val="32"/>
                 <w:szCs w:val="40"/>
                 <w:highlight w:val="yellow"/>
+                <w:lang w:val="it-IT"/>
               </w:rPr>
               <w:t>sû sû</w:t>
             </w:r>
@@ -24424,6 +24930,7 @@
                 <w:color w:val="000000"/>
                 <w:sz w:val="32"/>
                 <w:szCs w:val="40"/>
+                <w:lang w:val="it-IT"/>
               </w:rPr>
               <w:t xml:space="preserve"> K£</w:t>
             </w:r>
@@ -24433,15 +24940,17 @@
                 <w:color w:val="000000"/>
                 <w:sz w:val="28"/>
                 <w:szCs w:val="40"/>
-              </w:rPr>
-              <w:t>–</w:t>
-            </w:r>
-            <w:r>
-              <w:rPr>
-                <w:rFonts w:ascii="BRH Malayalam Extra" w:hAnsi="BRH Malayalam Extra" w:cs="BRH Malayalam Extra"/>
-                <w:color w:val="000000"/>
-                <w:sz w:val="32"/>
-                <w:szCs w:val="40"/>
+                <w:lang w:val="it-IT"/>
+              </w:rPr>
+              <w:t>–</w:t>
+            </w:r>
+            <w:r>
+              <w:rPr>
+                <w:rFonts w:ascii="BRH Malayalam Extra" w:hAnsi="BRH Malayalam Extra" w:cs="BRH Malayalam Extra"/>
+                <w:color w:val="000000"/>
+                <w:sz w:val="32"/>
+                <w:szCs w:val="40"/>
+                <w:lang w:val="it-IT"/>
               </w:rPr>
               <w:t>cy K£</w:t>
             </w:r>
@@ -24451,15 +24960,17 @@
                 <w:color w:val="000000"/>
                 <w:sz w:val="28"/>
                 <w:szCs w:val="40"/>
-              </w:rPr>
-              <w:t>–</w:t>
-            </w:r>
-            <w:r>
-              <w:rPr>
-                <w:rFonts w:ascii="BRH Malayalam Extra" w:hAnsi="BRH Malayalam Extra" w:cs="BRH Malayalam Extra"/>
-                <w:color w:val="000000"/>
-                <w:sz w:val="32"/>
-                <w:szCs w:val="40"/>
+                <w:lang w:val="it-IT"/>
+              </w:rPr>
+              <w:t>–</w:t>
+            </w:r>
+            <w:r>
+              <w:rPr>
+                <w:rFonts w:ascii="BRH Malayalam Extra" w:hAnsi="BRH Malayalam Extra" w:cs="BRH Malayalam Extra"/>
+                <w:color w:val="000000"/>
+                <w:sz w:val="32"/>
+                <w:szCs w:val="40"/>
+                <w:lang w:val="it-IT"/>
               </w:rPr>
               <w:t xml:space="preserve">cz </w:t>
             </w:r>
@@ -24470,6 +24981,7 @@
                 <w:sz w:val="32"/>
                 <w:szCs w:val="40"/>
                 <w:highlight w:val="yellow"/>
+                <w:lang w:val="it-IT"/>
               </w:rPr>
               <w:t>sûx</w:t>
             </w:r>
@@ -24479,6 +24991,7 @@
                 <w:color w:val="000000"/>
                 <w:sz w:val="32"/>
                 <w:szCs w:val="40"/>
+                <w:lang w:val="it-IT"/>
               </w:rPr>
               <w:t xml:space="preserve">sôx(³§) </w:t>
             </w:r>
@@ -28726,6 +29239,7 @@
                 <w:color w:val="000000"/>
                 <w:sz w:val="32"/>
                 <w:szCs w:val="32"/>
+                <w:lang w:val="it-IT"/>
               </w:rPr>
             </w:pPr>
             <w:r>
@@ -28733,6 +29247,7 @@
                 <w:rFonts w:cs="BRH Malayalam Extra"/>
                 <w:color w:val="000000"/>
                 <w:szCs w:val="32"/>
+                <w:lang w:val="it-IT"/>
               </w:rPr>
               <w:t>30</w:t>
             </w:r>
@@ -28742,6 +29257,7 @@
                 <w:color w:val="000000"/>
                 <w:sz w:val="32"/>
                 <w:szCs w:val="32"/>
+                <w:lang w:val="it-IT"/>
               </w:rPr>
               <w:t>)</w:t>
             </w:r>
@@ -28751,6 +29267,7 @@
                 <w:color w:val="000000"/>
                 <w:sz w:val="32"/>
                 <w:szCs w:val="32"/>
+                <w:lang w:val="it-IT"/>
               </w:rPr>
               <w:tab/>
             </w:r>
@@ -28759,6 +29276,7 @@
                 <w:rFonts w:cs="BRH Malayalam Extra"/>
                 <w:color w:val="000000"/>
                 <w:szCs w:val="32"/>
+                <w:lang w:val="it-IT"/>
               </w:rPr>
               <w:t>4</w:t>
             </w:r>
@@ -28768,6 +29286,7 @@
                 <w:color w:val="000000"/>
                 <w:sz w:val="32"/>
                 <w:szCs w:val="32"/>
+                <w:lang w:val="it-IT"/>
               </w:rPr>
               <w:t>.</w:t>
             </w:r>
@@ -28776,6 +29295,7 @@
                 <w:rFonts w:cs="BRH Malayalam Extra"/>
                 <w:color w:val="000000"/>
                 <w:szCs w:val="32"/>
+                <w:lang w:val="it-IT"/>
               </w:rPr>
               <w:t>7</w:t>
             </w:r>
@@ -28785,6 +29305,7 @@
                 <w:color w:val="000000"/>
                 <w:sz w:val="32"/>
                 <w:szCs w:val="32"/>
+                <w:lang w:val="it-IT"/>
               </w:rPr>
               <w:t>.</w:t>
             </w:r>
@@ -28793,6 +29314,7 @@
                 <w:rFonts w:cs="BRH Malayalam Extra"/>
                 <w:color w:val="000000"/>
                 <w:szCs w:val="32"/>
+                <w:lang w:val="it-IT"/>
               </w:rPr>
               <w:t>15</w:t>
             </w:r>
@@ -28802,6 +29324,7 @@
                 <w:color w:val="000000"/>
                 <w:sz w:val="32"/>
                 <w:szCs w:val="32"/>
+                <w:lang w:val="it-IT"/>
               </w:rPr>
               <w:t>.</w:t>
             </w:r>
@@ -28810,6 +29333,7 @@
                 <w:rFonts w:cs="BRH Malayalam Extra"/>
                 <w:color w:val="000000"/>
                 <w:szCs w:val="32"/>
+                <w:lang w:val="it-IT"/>
               </w:rPr>
               <w:t>7</w:t>
             </w:r>
@@ -28819,6 +29343,7 @@
                 <w:color w:val="000000"/>
                 <w:sz w:val="32"/>
                 <w:szCs w:val="32"/>
+                <w:lang w:val="it-IT"/>
               </w:rPr>
               <w:t>(</w:t>
             </w:r>
@@ -28827,6 +29352,7 @@
                 <w:rFonts w:cs="BRH Malayalam Extra"/>
                 <w:color w:val="000000"/>
                 <w:szCs w:val="32"/>
+                <w:lang w:val="it-IT"/>
               </w:rPr>
               <w:t>30</w:t>
             </w:r>
@@ -28836,6 +29362,7 @@
                 <w:color w:val="000000"/>
                 <w:sz w:val="32"/>
                 <w:szCs w:val="32"/>
+                <w:lang w:val="it-IT"/>
               </w:rPr>
               <w:t>)- A</w:t>
             </w:r>
@@ -28845,15 +29372,17 @@
                 <w:color w:val="000000"/>
                 <w:sz w:val="26"/>
                 <w:szCs w:val="32"/>
-              </w:rPr>
-              <w:t>–</w:t>
-            </w:r>
-            <w:r>
-              <w:rPr>
-                <w:rFonts w:ascii="BRH Malayalam Extra" w:hAnsi="BRH Malayalam Extra" w:cs="BRH Malayalam Extra"/>
-                <w:color w:val="000000"/>
-                <w:sz w:val="32"/>
-                <w:szCs w:val="32"/>
+                <w:lang w:val="it-IT"/>
+              </w:rPr>
+              <w:t>–</w:t>
+            </w:r>
+            <w:r>
+              <w:rPr>
+                <w:rFonts w:ascii="BRH Malayalam Extra" w:hAnsi="BRH Malayalam Extra" w:cs="BRH Malayalam Extra"/>
+                <w:color w:val="000000"/>
+                <w:sz w:val="32"/>
+                <w:szCs w:val="32"/>
+                <w:lang w:val="it-IT"/>
               </w:rPr>
               <w:t>Zx</w:t>
             </w:r>
@@ -28863,15 +29392,17 @@
                 <w:color w:val="000000"/>
                 <w:sz w:val="26"/>
                 <w:szCs w:val="32"/>
-              </w:rPr>
-              <w:t>–</w:t>
-            </w:r>
-            <w:r>
-              <w:rPr>
-                <w:rFonts w:ascii="BRH Malayalam Extra" w:hAnsi="BRH Malayalam Extra" w:cs="BRH Malayalam Extra"/>
-                <w:color w:val="000000"/>
-                <w:sz w:val="32"/>
-                <w:szCs w:val="32"/>
+                <w:lang w:val="it-IT"/>
+              </w:rPr>
+              <w:t>–</w:t>
+            </w:r>
+            <w:r>
+              <w:rPr>
+                <w:rFonts w:ascii="BRH Malayalam Extra" w:hAnsi="BRH Malayalam Extra" w:cs="BRH Malayalam Extra"/>
+                <w:color w:val="000000"/>
+                <w:sz w:val="32"/>
+                <w:szCs w:val="32"/>
+                <w:lang w:val="it-IT"/>
               </w:rPr>
               <w:t>ky</w:t>
             </w:r>
@@ -28881,15 +29412,17 @@
                 <w:color w:val="000000"/>
                 <w:sz w:val="26"/>
                 <w:szCs w:val="32"/>
-              </w:rPr>
-              <w:t>–</w:t>
-            </w:r>
-            <w:r>
-              <w:rPr>
-                <w:rFonts w:ascii="BRH Malayalam Extra" w:hAnsi="BRH Malayalam Extra" w:cs="BRH Malayalam Extra"/>
-                <w:color w:val="000000"/>
-                <w:sz w:val="32"/>
-                <w:szCs w:val="32"/>
+                <w:lang w:val="it-IT"/>
+              </w:rPr>
+              <w:t>–</w:t>
+            </w:r>
+            <w:r>
+              <w:rPr>
+                <w:rFonts w:ascii="BRH Malayalam Extra" w:hAnsi="BRH Malayalam Extra" w:cs="BRH Malayalam Extra"/>
+                <w:color w:val="000000"/>
+                <w:sz w:val="32"/>
+                <w:szCs w:val="32"/>
+                <w:lang w:val="it-IT"/>
               </w:rPr>
               <w:t xml:space="preserve"> | A</w:t>
             </w:r>
@@ -28899,15 +29432,17 @@
                 <w:color w:val="000000"/>
                 <w:sz w:val="26"/>
                 <w:szCs w:val="32"/>
-              </w:rPr>
-              <w:t>–</w:t>
-            </w:r>
-            <w:r>
-              <w:rPr>
-                <w:rFonts w:ascii="BRH Malayalam Extra" w:hAnsi="BRH Malayalam Extra" w:cs="BRH Malayalam Extra"/>
-                <w:color w:val="000000"/>
-                <w:sz w:val="32"/>
-                <w:szCs w:val="32"/>
+                <w:lang w:val="it-IT"/>
+              </w:rPr>
+              <w:t>–</w:t>
+            </w:r>
+            <w:r>
+              <w:rPr>
+                <w:rFonts w:ascii="BRH Malayalam Extra" w:hAnsi="BRH Malayalam Extra" w:cs="BRH Malayalam Extra"/>
+                <w:color w:val="000000"/>
+                <w:sz w:val="32"/>
+                <w:szCs w:val="32"/>
+                <w:lang w:val="it-IT"/>
               </w:rPr>
               <w:t>¥²</w:t>
             </w:r>
@@ -28917,15 +29452,17 @@
                 <w:color w:val="000000"/>
                 <w:sz w:val="26"/>
                 <w:szCs w:val="32"/>
-              </w:rPr>
-              <w:t>–</w:t>
-            </w:r>
-            <w:r>
-              <w:rPr>
-                <w:rFonts w:ascii="BRH Malayalam Extra" w:hAnsi="BRH Malayalam Extra" w:cs="BRH Malayalam Extra"/>
-                <w:color w:val="000000"/>
-                <w:sz w:val="32"/>
-                <w:szCs w:val="32"/>
+                <w:lang w:val="it-IT"/>
+              </w:rPr>
+              <w:t>–</w:t>
+            </w:r>
+            <w:r>
+              <w:rPr>
+                <w:rFonts w:ascii="BRH Malayalam Extra" w:hAnsi="BRH Malayalam Extra" w:cs="BRH Malayalam Extra"/>
+                <w:color w:val="000000"/>
+                <w:sz w:val="32"/>
+                <w:szCs w:val="32"/>
+                <w:lang w:val="it-IT"/>
               </w:rPr>
               <w:t xml:space="preserve"> | öe</w:t>
             </w:r>
@@ -28935,15 +29472,17 @@
                 <w:color w:val="000000"/>
                 <w:sz w:val="26"/>
                 <w:szCs w:val="32"/>
-              </w:rPr>
-              <w:t>–</w:t>
-            </w:r>
-            <w:r>
-              <w:rPr>
-                <w:rFonts w:ascii="BRH Malayalam Extra" w:hAnsi="BRH Malayalam Extra" w:cs="BRH Malayalam Extra"/>
-                <w:color w:val="000000"/>
-                <w:sz w:val="32"/>
-                <w:szCs w:val="32"/>
+                <w:lang w:val="it-IT"/>
+              </w:rPr>
+              <w:t>–</w:t>
+            </w:r>
+            <w:r>
+              <w:rPr>
+                <w:rFonts w:ascii="BRH Malayalam Extra" w:hAnsi="BRH Malayalam Extra" w:cs="BRH Malayalam Extra"/>
+                <w:color w:val="000000"/>
+                <w:sz w:val="32"/>
+                <w:szCs w:val="32"/>
+                <w:lang w:val="it-IT"/>
               </w:rPr>
               <w:t>Z</w:t>
             </w:r>
@@ -28953,15 +29492,17 @@
                 <w:color w:val="000000"/>
                 <w:sz w:val="26"/>
                 <w:szCs w:val="32"/>
-              </w:rPr>
-              <w:t>–</w:t>
-            </w:r>
-            <w:r>
-              <w:rPr>
-                <w:rFonts w:ascii="BRH Malayalam Extra" w:hAnsi="BRH Malayalam Extra" w:cs="BRH Malayalam Extra"/>
-                <w:color w:val="000000"/>
-                <w:sz w:val="32"/>
-                <w:szCs w:val="32"/>
+                <w:lang w:val="it-IT"/>
+              </w:rPr>
+              <w:t>–</w:t>
+            </w:r>
+            <w:r>
+              <w:rPr>
+                <w:rFonts w:ascii="BRH Malayalam Extra" w:hAnsi="BRH Malayalam Extra" w:cs="BRH Malayalam Extra"/>
+                <w:color w:val="000000"/>
+                <w:sz w:val="32"/>
+                <w:szCs w:val="32"/>
+                <w:lang w:val="it-IT"/>
               </w:rPr>
               <w:t>kxI |</w:t>
             </w:r>
@@ -28978,6 +29519,7 @@
                 <w:color w:val="000000"/>
                 <w:sz w:val="32"/>
                 <w:szCs w:val="32"/>
+                <w:lang w:val="it-IT"/>
               </w:rPr>
             </w:pPr>
             <w:r>
@@ -28986,6 +29528,7 @@
                 <w:color w:val="000000"/>
                 <w:sz w:val="32"/>
                 <w:szCs w:val="32"/>
+                <w:lang w:val="it-IT"/>
               </w:rPr>
               <w:t>A</w:t>
             </w:r>
@@ -28995,15 +29538,17 @@
                 <w:color w:val="000000"/>
                 <w:sz w:val="26"/>
                 <w:szCs w:val="32"/>
-              </w:rPr>
-              <w:t>–</w:t>
-            </w:r>
-            <w:r>
-              <w:rPr>
-                <w:rFonts w:ascii="BRH Malayalam Extra" w:hAnsi="BRH Malayalam Extra" w:cs="BRH Malayalam Extra"/>
-                <w:color w:val="000000"/>
-                <w:sz w:val="32"/>
-                <w:szCs w:val="32"/>
+                <w:lang w:val="it-IT"/>
+              </w:rPr>
+              <w:t>–</w:t>
+            </w:r>
+            <w:r>
+              <w:rPr>
+                <w:rFonts w:ascii="BRH Malayalam Extra" w:hAnsi="BRH Malayalam Extra" w:cs="BRH Malayalam Extra"/>
+                <w:color w:val="000000"/>
+                <w:sz w:val="32"/>
+                <w:szCs w:val="32"/>
+                <w:lang w:val="it-IT"/>
               </w:rPr>
               <w:t>Zx</w:t>
             </w:r>
@@ -29013,15 +29558,17 @@
                 <w:color w:val="000000"/>
                 <w:sz w:val="26"/>
                 <w:szCs w:val="32"/>
-              </w:rPr>
-              <w:t>–</w:t>
-            </w:r>
-            <w:r>
-              <w:rPr>
-                <w:rFonts w:ascii="BRH Malayalam Extra" w:hAnsi="BRH Malayalam Extra" w:cs="BRH Malayalam Extra"/>
-                <w:color w:val="000000"/>
-                <w:sz w:val="32"/>
-                <w:szCs w:val="32"/>
+                <w:lang w:val="it-IT"/>
+              </w:rPr>
+              <w:t>–</w:t>
+            </w:r>
+            <w:r>
+              <w:rPr>
+                <w:rFonts w:ascii="BRH Malayalam Extra" w:hAnsi="BRH Malayalam Extra" w:cs="BRH Malayalam Extra"/>
+                <w:color w:val="000000"/>
+                <w:sz w:val="32"/>
+                <w:szCs w:val="32"/>
+                <w:lang w:val="it-IT"/>
               </w:rPr>
               <w:t>ª j</w:t>
             </w:r>
@@ -29031,15 +29578,17 @@
                 <w:color w:val="000000"/>
                 <w:sz w:val="26"/>
                 <w:szCs w:val="32"/>
-              </w:rPr>
-              <w:t>–</w:t>
-            </w:r>
-            <w:r>
-              <w:rPr>
-                <w:rFonts w:ascii="BRH Malayalam Extra" w:hAnsi="BRH Malayalam Extra" w:cs="BRH Malayalam Extra"/>
-                <w:color w:val="000000"/>
-                <w:sz w:val="32"/>
-                <w:szCs w:val="32"/>
+                <w:lang w:val="it-IT"/>
+              </w:rPr>
+              <w:t>–</w:t>
+            </w:r>
+            <w:r>
+              <w:rPr>
+                <w:rFonts w:ascii="BRH Malayalam Extra" w:hAnsi="BRH Malayalam Extra" w:cs="BRH Malayalam Extra"/>
+                <w:color w:val="000000"/>
+                <w:sz w:val="32"/>
+                <w:szCs w:val="32"/>
+                <w:lang w:val="it-IT"/>
               </w:rPr>
               <w:t>¥²</w:t>
             </w:r>
@@ -29049,15 +29598,17 @@
                 <w:color w:val="000000"/>
                 <w:sz w:val="26"/>
                 <w:szCs w:val="32"/>
-              </w:rPr>
-              <w:t>–</w:t>
-            </w:r>
-            <w:r>
-              <w:rPr>
-                <w:rFonts w:ascii="BRH Malayalam Extra" w:hAnsi="BRH Malayalam Extra" w:cs="BRH Malayalam Extra"/>
-                <w:color w:val="000000"/>
-                <w:sz w:val="32"/>
-                <w:szCs w:val="32"/>
+                <w:lang w:val="it-IT"/>
+              </w:rPr>
+              <w:t>–</w:t>
+            </w:r>
+            <w:r>
+              <w:rPr>
+                <w:rFonts w:ascii="BRH Malayalam Extra" w:hAnsi="BRH Malayalam Extra" w:cs="BRH Malayalam Extra"/>
+                <w:color w:val="000000"/>
+                <w:sz w:val="32"/>
+                <w:szCs w:val="32"/>
+                <w:lang w:val="it-IT"/>
               </w:rPr>
               <w:t xml:space="preserve"> A</w:t>
             </w:r>
@@ -29067,15 +29618,17 @@
                 <w:color w:val="000000"/>
                 <w:sz w:val="26"/>
                 <w:szCs w:val="32"/>
-              </w:rPr>
-              <w:t>–</w:t>
-            </w:r>
-            <w:r>
-              <w:rPr>
-                <w:rFonts w:ascii="BRH Malayalam Extra" w:hAnsi="BRH Malayalam Extra" w:cs="BRH Malayalam Extra"/>
-                <w:color w:val="000000"/>
-                <w:sz w:val="32"/>
-                <w:szCs w:val="32"/>
+                <w:lang w:val="it-IT"/>
+              </w:rPr>
+              <w:t>–</w:t>
+            </w:r>
+            <w:r>
+              <w:rPr>
+                <w:rFonts w:ascii="BRH Malayalam Extra" w:hAnsi="BRH Malayalam Extra" w:cs="BRH Malayalam Extra"/>
+                <w:color w:val="000000"/>
+                <w:sz w:val="32"/>
+                <w:szCs w:val="32"/>
+                <w:lang w:val="it-IT"/>
               </w:rPr>
               <w:t>¥²</w:t>
             </w:r>
@@ -29085,15 +29638,17 @@
                 <w:color w:val="000000"/>
                 <w:sz w:val="26"/>
                 <w:szCs w:val="32"/>
-              </w:rPr>
-              <w:t>–</w:t>
-            </w:r>
-            <w:r>
-              <w:rPr>
-                <w:rFonts w:ascii="BRH Malayalam Extra" w:hAnsi="BRH Malayalam Extra" w:cs="BRH Malayalam Extra"/>
-                <w:color w:val="000000"/>
-                <w:sz w:val="32"/>
-                <w:szCs w:val="32"/>
+                <w:lang w:val="it-IT"/>
+              </w:rPr>
+              <w:t>–</w:t>
+            </w:r>
+            <w:r>
+              <w:rPr>
+                <w:rFonts w:ascii="BRH Malayalam Extra" w:hAnsi="BRH Malayalam Extra" w:cs="BRH Malayalam Extra"/>
+                <w:color w:val="000000"/>
+                <w:sz w:val="32"/>
+                <w:szCs w:val="32"/>
+                <w:lang w:val="it-IT"/>
               </w:rPr>
               <w:t xml:space="preserve"> </w:t>
             </w:r>
@@ -29104,6 +29659,7 @@
                 <w:sz w:val="32"/>
                 <w:szCs w:val="32"/>
                 <w:highlight w:val="green"/>
+                <w:lang w:val="it-IT"/>
               </w:rPr>
               <w:t>A</w:t>
             </w:r>
@@ -29113,15 +29669,17 @@
                 <w:color w:val="000000"/>
                 <w:sz w:val="26"/>
                 <w:szCs w:val="32"/>
-              </w:rPr>
-              <w:t>–</w:t>
-            </w:r>
-            <w:r>
-              <w:rPr>
-                <w:rFonts w:ascii="BRH Malayalam Extra" w:hAnsi="BRH Malayalam Extra" w:cs="BRH Malayalam Extra"/>
-                <w:color w:val="000000"/>
-                <w:sz w:val="32"/>
-                <w:szCs w:val="32"/>
+                <w:lang w:val="it-IT"/>
+              </w:rPr>
+              <w:t>–</w:t>
+            </w:r>
+            <w:r>
+              <w:rPr>
+                <w:rFonts w:ascii="BRH Malayalam Extra" w:hAnsi="BRH Malayalam Extra" w:cs="BRH Malayalam Extra"/>
+                <w:color w:val="000000"/>
+                <w:sz w:val="32"/>
+                <w:szCs w:val="32"/>
+                <w:lang w:val="it-IT"/>
               </w:rPr>
               <w:t>Zx</w:t>
             </w:r>
@@ -29131,15 +29689,17 @@
                 <w:color w:val="000000"/>
                 <w:sz w:val="26"/>
                 <w:szCs w:val="32"/>
-              </w:rPr>
-              <w:t>–</w:t>
-            </w:r>
-            <w:r>
-              <w:rPr>
-                <w:rFonts w:ascii="BRH Malayalam Extra" w:hAnsi="BRH Malayalam Extra" w:cs="BRH Malayalam Extra"/>
-                <w:color w:val="000000"/>
-                <w:sz w:val="32"/>
-                <w:szCs w:val="32"/>
+                <w:lang w:val="it-IT"/>
+              </w:rPr>
+              <w:t>–</w:t>
+            </w:r>
+            <w:r>
+              <w:rPr>
+                <w:rFonts w:ascii="BRH Malayalam Extra" w:hAnsi="BRH Malayalam Extra" w:cs="BRH Malayalam Extra"/>
+                <w:color w:val="000000"/>
+                <w:sz w:val="32"/>
+                <w:szCs w:val="32"/>
+                <w:lang w:val="it-IT"/>
               </w:rPr>
               <w:t>ª j</w:t>
             </w:r>
@@ -29149,15 +29709,17 @@
                 <w:color w:val="000000"/>
                 <w:sz w:val="26"/>
                 <w:szCs w:val="32"/>
-              </w:rPr>
-              <w:t>–</w:t>
-            </w:r>
-            <w:r>
-              <w:rPr>
-                <w:rFonts w:ascii="BRH Malayalam Extra" w:hAnsi="BRH Malayalam Extra" w:cs="BRH Malayalam Extra"/>
-                <w:color w:val="000000"/>
-                <w:sz w:val="32"/>
-                <w:szCs w:val="32"/>
+                <w:lang w:val="it-IT"/>
+              </w:rPr>
+              <w:t>–</w:t>
+            </w:r>
+            <w:r>
+              <w:rPr>
+                <w:rFonts w:ascii="BRH Malayalam Extra" w:hAnsi="BRH Malayalam Extra" w:cs="BRH Malayalam Extra"/>
+                <w:color w:val="000000"/>
+                <w:sz w:val="32"/>
+                <w:szCs w:val="32"/>
+                <w:lang w:val="it-IT"/>
               </w:rPr>
               <w:t>Zx</w:t>
             </w:r>
@@ -29167,15 +29729,17 @@
                 <w:color w:val="000000"/>
                 <w:sz w:val="26"/>
                 <w:szCs w:val="32"/>
-              </w:rPr>
-              <w:t>–</w:t>
-            </w:r>
-            <w:r>
-              <w:rPr>
-                <w:rFonts w:ascii="BRH Malayalam Extra" w:hAnsi="BRH Malayalam Extra" w:cs="BRH Malayalam Extra"/>
-                <w:color w:val="000000"/>
-                <w:sz w:val="32"/>
-                <w:szCs w:val="32"/>
+                <w:lang w:val="it-IT"/>
+              </w:rPr>
+              <w:t>–</w:t>
+            </w:r>
+            <w:r>
+              <w:rPr>
+                <w:rFonts w:ascii="BRH Malayalam Extra" w:hAnsi="BRH Malayalam Extra" w:cs="BRH Malayalam Extra"/>
+                <w:color w:val="000000"/>
+                <w:sz w:val="32"/>
+                <w:szCs w:val="32"/>
+                <w:lang w:val="it-IT"/>
               </w:rPr>
               <w:t>ª j</w:t>
             </w:r>
@@ -29185,15 +29749,17 @@
                 <w:color w:val="000000"/>
                 <w:sz w:val="26"/>
                 <w:szCs w:val="32"/>
-              </w:rPr>
-              <w:t>–</w:t>
-            </w:r>
-            <w:r>
-              <w:rPr>
-                <w:rFonts w:ascii="BRH Malayalam Extra" w:hAnsi="BRH Malayalam Extra" w:cs="BRH Malayalam Extra"/>
-                <w:color w:val="000000"/>
-                <w:sz w:val="32"/>
-                <w:szCs w:val="32"/>
+                <w:lang w:val="it-IT"/>
+              </w:rPr>
+              <w:t>–</w:t>
+            </w:r>
+            <w:r>
+              <w:rPr>
+                <w:rFonts w:ascii="BRH Malayalam Extra" w:hAnsi="BRH Malayalam Extra" w:cs="BRH Malayalam Extra"/>
+                <w:color w:val="000000"/>
+                <w:sz w:val="32"/>
+                <w:szCs w:val="32"/>
+                <w:lang w:val="it-IT"/>
               </w:rPr>
               <w:t>¥²</w:t>
             </w:r>
@@ -29203,15 +29769,17 @@
                 <w:color w:val="000000"/>
                 <w:sz w:val="26"/>
                 <w:szCs w:val="32"/>
-              </w:rPr>
-              <w:t>–</w:t>
-            </w:r>
-            <w:r>
-              <w:rPr>
-                <w:rFonts w:ascii="BRH Malayalam Extra" w:hAnsi="BRH Malayalam Extra" w:cs="BRH Malayalam Extra"/>
-                <w:color w:val="000000"/>
-                <w:sz w:val="32"/>
-                <w:szCs w:val="32"/>
+                <w:lang w:val="it-IT"/>
+              </w:rPr>
+              <w:t>–</w:t>
+            </w:r>
+            <w:r>
+              <w:rPr>
+                <w:rFonts w:ascii="BRH Malayalam Extra" w:hAnsi="BRH Malayalam Extra" w:cs="BRH Malayalam Extra"/>
+                <w:color w:val="000000"/>
+                <w:sz w:val="32"/>
+                <w:szCs w:val="32"/>
+                <w:lang w:val="it-IT"/>
               </w:rPr>
               <w:t xml:space="preserve"> </w:t>
             </w:r>
@@ -29228,6 +29796,7 @@
                 <w:color w:val="000000"/>
                 <w:sz w:val="32"/>
                 <w:szCs w:val="32"/>
+                <w:lang w:val="it-IT"/>
               </w:rPr>
             </w:pPr>
             <w:r>
@@ -29236,6 +29805,7 @@
                 <w:color w:val="000000"/>
                 <w:sz w:val="32"/>
                 <w:szCs w:val="32"/>
+                <w:lang w:val="it-IT"/>
               </w:rPr>
               <w:t>öe</w:t>
             </w:r>
@@ -29245,15 +29815,17 @@
                 <w:color w:val="000000"/>
                 <w:sz w:val="26"/>
                 <w:szCs w:val="32"/>
-              </w:rPr>
-              <w:t>–</w:t>
-            </w:r>
-            <w:r>
-              <w:rPr>
-                <w:rFonts w:ascii="BRH Malayalam Extra" w:hAnsi="BRH Malayalam Extra" w:cs="BRH Malayalam Extra"/>
-                <w:color w:val="000000"/>
-                <w:sz w:val="32"/>
-                <w:szCs w:val="32"/>
+                <w:lang w:val="it-IT"/>
+              </w:rPr>
+              <w:t>–</w:t>
+            </w:r>
+            <w:r>
+              <w:rPr>
+                <w:rFonts w:ascii="BRH Malayalam Extra" w:hAnsi="BRH Malayalam Extra" w:cs="BRH Malayalam Extra"/>
+                <w:color w:val="000000"/>
+                <w:sz w:val="32"/>
+                <w:szCs w:val="32"/>
+                <w:lang w:val="it-IT"/>
               </w:rPr>
               <w:t>Z</w:t>
             </w:r>
@@ -29263,15 +29835,17 @@
                 <w:color w:val="000000"/>
                 <w:sz w:val="26"/>
                 <w:szCs w:val="32"/>
-              </w:rPr>
-              <w:t>–</w:t>
-            </w:r>
-            <w:r>
-              <w:rPr>
-                <w:rFonts w:ascii="BRH Malayalam Extra" w:hAnsi="BRH Malayalam Extra" w:cs="BRH Malayalam Extra"/>
-                <w:color w:val="000000"/>
-                <w:sz w:val="32"/>
-                <w:szCs w:val="32"/>
+                <w:lang w:val="it-IT"/>
+              </w:rPr>
+              <w:t>–</w:t>
+            </w:r>
+            <w:r>
+              <w:rPr>
+                <w:rFonts w:ascii="BRH Malayalam Extra" w:hAnsi="BRH Malayalam Extra" w:cs="BRH Malayalam Extra"/>
+                <w:color w:val="000000"/>
+                <w:sz w:val="32"/>
+                <w:szCs w:val="32"/>
+                <w:lang w:val="it-IT"/>
               </w:rPr>
               <w:t>kxI öe—Z</w:t>
             </w:r>
@@ -29281,15 +29855,17 @@
                 <w:color w:val="000000"/>
                 <w:sz w:val="26"/>
                 <w:szCs w:val="32"/>
-              </w:rPr>
-              <w:t>–</w:t>
-            </w:r>
-            <w:r>
-              <w:rPr>
-                <w:rFonts w:ascii="BRH Malayalam Extra" w:hAnsi="BRH Malayalam Extra" w:cs="BRH Malayalam Extra"/>
-                <w:color w:val="000000"/>
-                <w:sz w:val="32"/>
-                <w:szCs w:val="32"/>
+                <w:lang w:val="it-IT"/>
+              </w:rPr>
+              <w:t>–</w:t>
+            </w:r>
+            <w:r>
+              <w:rPr>
+                <w:rFonts w:ascii="BRH Malayalam Extra" w:hAnsi="BRH Malayalam Extra" w:cs="BRH Malayalam Extra"/>
+                <w:color w:val="000000"/>
+                <w:sz w:val="32"/>
+                <w:szCs w:val="32"/>
+                <w:lang w:val="it-IT"/>
               </w:rPr>
               <w:t xml:space="preserve">kx i—¥² </w:t>
             </w:r>
@@ -29300,6 +29876,7 @@
                 <w:sz w:val="32"/>
                 <w:szCs w:val="32"/>
                 <w:highlight w:val="green"/>
+                <w:lang w:val="it-IT"/>
               </w:rPr>
               <w:t>A</w:t>
             </w:r>
@@ -29309,6 +29886,7 @@
                 <w:color w:val="000000"/>
                 <w:sz w:val="32"/>
                 <w:szCs w:val="32"/>
+                <w:lang w:val="it-IT"/>
               </w:rPr>
               <w:t xml:space="preserve">Zxª jZxª j¥² </w:t>
             </w:r>
@@ -29778,7 +30356,7 @@
 </file>
 
 <file path=word/endnotes.xml><?xml version="1.0" encoding="utf-8"?>
-<w:endnotes xmlns:wpc="http://schemas.microsoft.com/office/word/2010/wordprocessingCanvas" xmlns:cx="http://schemas.microsoft.com/office/drawing/2014/chartex" xmlns:cx1="http://schemas.microsoft.com/office/drawing/2015/9/8/chartex" xmlns:cx2="http://schemas.microsoft.com/office/drawing/2015/10/21/chartex" xmlns:cx3="http://schemas.microsoft.com/office/drawing/2016/5/9/chartex" xmlns:cx4="http://schemas.microsoft.com/office/drawing/2016/5/10/chartex" xmlns:cx5="http://schemas.microsoft.com/office/drawing/2016/5/11/chartex" xmlns:cx6="http://schemas.microsoft.com/office/drawing/2016/5/12/chartex" xmlns:cx7="http://schemas.microsoft.com/office/drawing/2016/5/13/chartex" xmlns:cx8="http://schemas.microsoft.com/office/drawing/2016/5/14/chartex" xmlns:mc="http://schemas.openxmlformats.org/markup-compatibility/2006" xmlns:aink="http://schemas.microsoft.com/office/drawing/2016/ink" xmlns:am3d="http://schemas.microsoft.com/office/drawing/2017/model3d" xmlns:o="urn:schemas-microsoft-com:office:office" xmlns:oel="http://schemas.microsoft.com/office/2019/extlst" xmlns:r="http://schemas.openxmlformats.org/officeDocument/2006/relationships" xmlns:m="http://schemas.openxmlformats.org/officeDocument/2006/math" xmlns:v="urn:schemas-microsoft-com:vml" xmlns:wp14="http://schemas.microsoft.com/office/word/2010/wordprocessingDrawing" xmlns:wp="http://schemas.openxmlformats.org/drawingml/2006/wordprocessingDrawing" xmlns:w10="urn:schemas-microsoft-com:office:word" xmlns:w="http://schemas.openxmlformats.org/wordprocessingml/2006/main" xmlns:w14="http://schemas.microsoft.com/office/word/2010/wordml" xmlns:w15="http://schemas.microsoft.com/office/word/2012/wordml" xmlns:w16cex="http://schemas.microsoft.com/office/word/2018/wordml/cex" xmlns:w16cid="http://schemas.microsoft.com/office/word/2016/wordml/cid" xmlns:w16="http://schemas.microsoft.com/office/word/2018/wordml" xmlns:w16du="http://schemas.microsoft.com/office/word/2023/wordml/word16du" xmlns:w16sdtdh="http://schemas.microsoft.com/office/word/2020/wordml/sdtdatahash" xmlns:w16se="http://schemas.microsoft.com/office/word/2015/wordml/symex" xmlns:wpg="http://schemas.microsoft.com/office/word/2010/wordprocessingGroup" xmlns:wpi="http://schemas.microsoft.com/office/word/2010/wordprocessingInk" xmlns:wne="http://schemas.microsoft.com/office/word/2006/wordml" xmlns:wps="http://schemas.microsoft.com/office/word/2010/wordprocessingShape" mc:Ignorable="w14 w15 w16se w16cid w16 w16cex w16sdtdh w16du wp14">
+<w:endnotes xmlns:wpc="http://schemas.microsoft.com/office/word/2010/wordprocessingCanvas" xmlns:cx="http://schemas.microsoft.com/office/drawing/2014/chartex" xmlns:cx1="http://schemas.microsoft.com/office/drawing/2015/9/8/chartex" xmlns:cx2="http://schemas.microsoft.com/office/drawing/2015/10/21/chartex" xmlns:cx3="http://schemas.microsoft.com/office/drawing/2016/5/9/chartex" xmlns:cx4="http://schemas.microsoft.com/office/drawing/2016/5/10/chartex" xmlns:cx5="http://schemas.microsoft.com/office/drawing/2016/5/11/chartex" xmlns:cx6="http://schemas.microsoft.com/office/drawing/2016/5/12/chartex" xmlns:cx7="http://schemas.microsoft.com/office/drawing/2016/5/13/chartex" xmlns:cx8="http://schemas.microsoft.com/office/drawing/2016/5/14/chartex" xmlns:mc="http://schemas.openxmlformats.org/markup-compatibility/2006" xmlns:aink="http://schemas.microsoft.com/office/drawing/2016/ink" xmlns:am3d="http://schemas.microsoft.com/office/drawing/2017/model3d" xmlns:o="urn:schemas-microsoft-com:office:office" xmlns:oel="http://schemas.microsoft.com/office/2019/extlst" xmlns:r="http://schemas.openxmlformats.org/officeDocument/2006/relationships" xmlns:m="http://schemas.openxmlformats.org/officeDocument/2006/math" xmlns:v="urn:schemas-microsoft-com:vml" xmlns:wp14="http://schemas.microsoft.com/office/word/2010/wordprocessingDrawing" xmlns:wp="http://schemas.openxmlformats.org/drawingml/2006/wordprocessingDrawing" xmlns:w10="urn:schemas-microsoft-com:office:word" xmlns:w="http://schemas.openxmlformats.org/wordprocessingml/2006/main" xmlns:w14="http://schemas.microsoft.com/office/word/2010/wordml" xmlns:w15="http://schemas.microsoft.com/office/word/2012/wordml" xmlns:w16cex="http://schemas.microsoft.com/office/word/2018/wordml/cex" xmlns:w16cid="http://schemas.microsoft.com/office/word/2016/wordml/cid" xmlns:w16="http://schemas.microsoft.com/office/word/2018/wordml" xmlns:w16du="http://schemas.microsoft.com/office/word/2023/wordml/word16du" xmlns:w16sdtdh="http://schemas.microsoft.com/office/word/2020/wordml/sdtdatahash" xmlns:w16sdtfl="http://schemas.microsoft.com/office/word/2024/wordml/sdtformatlock" xmlns:w16se="http://schemas.microsoft.com/office/word/2015/wordml/symex" xmlns:wpg="http://schemas.microsoft.com/office/word/2010/wordprocessingGroup" xmlns:wpi="http://schemas.microsoft.com/office/word/2010/wordprocessingInk" xmlns:wne="http://schemas.microsoft.com/office/word/2006/wordml" xmlns:wps="http://schemas.microsoft.com/office/word/2010/wordprocessingShape" mc:Ignorable="w14 w15 w16se w16cid w16 w16cex w16sdtdh w16sdtfl w16du wp14">
   <w:endnote w:type="separator" w:id="-1">
     <w:p>
       <w:pPr>
@@ -29803,7 +30381,7 @@
 </file>
 
 <file path=word/footer1.xml><?xml version="1.0" encoding="utf-8"?>
-<w:ftr xmlns:wpc="http://schemas.microsoft.com/office/word/2010/wordprocessingCanvas" xmlns:cx="http://schemas.microsoft.com/office/drawing/2014/chartex" xmlns:cx1="http://schemas.microsoft.com/office/drawing/2015/9/8/chartex" xmlns:cx2="http://schemas.microsoft.com/office/drawing/2015/10/21/chartex" xmlns:cx3="http://schemas.microsoft.com/office/drawing/2016/5/9/chartex" xmlns:cx4="http://schemas.microsoft.com/office/drawing/2016/5/10/chartex" xmlns:cx5="http://schemas.microsoft.com/office/drawing/2016/5/11/chartex" xmlns:cx6="http://schemas.microsoft.com/office/drawing/2016/5/12/chartex" xmlns:cx7="http://schemas.microsoft.com/office/drawing/2016/5/13/chartex" xmlns:cx8="http://schemas.microsoft.com/office/drawing/2016/5/14/chartex" xmlns:mc="http://schemas.openxmlformats.org/markup-compatibility/2006" xmlns:aink="http://schemas.microsoft.com/office/drawing/2016/ink" xmlns:am3d="http://schemas.microsoft.com/office/drawing/2017/model3d" xmlns:o="urn:schemas-microsoft-com:office:office" xmlns:oel="http://schemas.microsoft.com/office/2019/extlst" xmlns:r="http://schemas.openxmlformats.org/officeDocument/2006/relationships" xmlns:m="http://schemas.openxmlformats.org/officeDocument/2006/math" xmlns:v="urn:schemas-microsoft-com:vml" xmlns:wp14="http://schemas.microsoft.com/office/word/2010/wordprocessingDrawing" xmlns:wp="http://schemas.openxmlformats.org/drawingml/2006/wordprocessingDrawing" xmlns:w10="urn:schemas-microsoft-com:office:word" xmlns:w="http://schemas.openxmlformats.org/wordprocessingml/2006/main" xmlns:w14="http://schemas.microsoft.com/office/word/2010/wordml" xmlns:w15="http://schemas.microsoft.com/office/word/2012/wordml" xmlns:w16cex="http://schemas.microsoft.com/office/word/2018/wordml/cex" xmlns:w16cid="http://schemas.microsoft.com/office/word/2016/wordml/cid" xmlns:w16="http://schemas.microsoft.com/office/word/2018/wordml" xmlns:w16du="http://schemas.microsoft.com/office/word/2023/wordml/word16du" xmlns:w16sdtdh="http://schemas.microsoft.com/office/word/2020/wordml/sdtdatahash" xmlns:w16se="http://schemas.microsoft.com/office/word/2015/wordml/symex" xmlns:wpg="http://schemas.microsoft.com/office/word/2010/wordprocessingGroup" xmlns:wpi="http://schemas.microsoft.com/office/word/2010/wordprocessingInk" xmlns:wne="http://schemas.microsoft.com/office/word/2006/wordml" xmlns:wps="http://schemas.microsoft.com/office/word/2010/wordprocessingShape" mc:Ignorable="w14 w15 w16se w16cid w16 w16cex w16sdtdh w16du wp14">
+<w:ftr xmlns:wpc="http://schemas.microsoft.com/office/word/2010/wordprocessingCanvas" xmlns:cx="http://schemas.microsoft.com/office/drawing/2014/chartex" xmlns:cx1="http://schemas.microsoft.com/office/drawing/2015/9/8/chartex" xmlns:cx2="http://schemas.microsoft.com/office/drawing/2015/10/21/chartex" xmlns:cx3="http://schemas.microsoft.com/office/drawing/2016/5/9/chartex" xmlns:cx4="http://schemas.microsoft.com/office/drawing/2016/5/10/chartex" xmlns:cx5="http://schemas.microsoft.com/office/drawing/2016/5/11/chartex" xmlns:cx6="http://schemas.microsoft.com/office/drawing/2016/5/12/chartex" xmlns:cx7="http://schemas.microsoft.com/office/drawing/2016/5/13/chartex" xmlns:cx8="http://schemas.microsoft.com/office/drawing/2016/5/14/chartex" xmlns:mc="http://schemas.openxmlformats.org/markup-compatibility/2006" xmlns:aink="http://schemas.microsoft.com/office/drawing/2016/ink" xmlns:am3d="http://schemas.microsoft.com/office/drawing/2017/model3d" xmlns:o="urn:schemas-microsoft-com:office:office" xmlns:oel="http://schemas.microsoft.com/office/2019/extlst" xmlns:r="http://schemas.openxmlformats.org/officeDocument/2006/relationships" xmlns:m="http://schemas.openxmlformats.org/officeDocument/2006/math" xmlns:v="urn:schemas-microsoft-com:vml" xmlns:wp14="http://schemas.microsoft.com/office/word/2010/wordprocessingDrawing" xmlns:wp="http://schemas.openxmlformats.org/drawingml/2006/wordprocessingDrawing" xmlns:w10="urn:schemas-microsoft-com:office:word" xmlns:w="http://schemas.openxmlformats.org/wordprocessingml/2006/main" xmlns:w14="http://schemas.microsoft.com/office/word/2010/wordml" xmlns:w15="http://schemas.microsoft.com/office/word/2012/wordml" xmlns:w16cex="http://schemas.microsoft.com/office/word/2018/wordml/cex" xmlns:w16cid="http://schemas.microsoft.com/office/word/2016/wordml/cid" xmlns:w16="http://schemas.microsoft.com/office/word/2018/wordml" xmlns:w16du="http://schemas.microsoft.com/office/word/2023/wordml/word16du" xmlns:w16sdtdh="http://schemas.microsoft.com/office/word/2020/wordml/sdtdatahash" xmlns:w16sdtfl="http://schemas.microsoft.com/office/word/2024/wordml/sdtformatlock" xmlns:w16se="http://schemas.microsoft.com/office/word/2015/wordml/symex" xmlns:wpg="http://schemas.microsoft.com/office/word/2010/wordprocessingGroup" xmlns:wpi="http://schemas.microsoft.com/office/word/2010/wordprocessingInk" xmlns:wne="http://schemas.microsoft.com/office/word/2006/wordml" xmlns:wps="http://schemas.microsoft.com/office/word/2010/wordprocessingShape" mc:Ignorable="w14 w15 w16se w16cid w16 w16cex w16sdtdh w16sdtfl w16du wp14">
   <w:p>
     <w:pPr>
       <w:pBdr>
@@ -29985,7 +30563,7 @@
 </file>
 
 <file path=word/footer2.xml><?xml version="1.0" encoding="utf-8"?>
-<w:ftr xmlns:wpc="http://schemas.microsoft.com/office/word/2010/wordprocessingCanvas" xmlns:cx="http://schemas.microsoft.com/office/drawing/2014/chartex" xmlns:cx1="http://schemas.microsoft.com/office/drawing/2015/9/8/chartex" xmlns:cx2="http://schemas.microsoft.com/office/drawing/2015/10/21/chartex" xmlns:cx3="http://schemas.microsoft.com/office/drawing/2016/5/9/chartex" xmlns:cx4="http://schemas.microsoft.com/office/drawing/2016/5/10/chartex" xmlns:cx5="http://schemas.microsoft.com/office/drawing/2016/5/11/chartex" xmlns:cx6="http://schemas.microsoft.com/office/drawing/2016/5/12/chartex" xmlns:cx7="http://schemas.microsoft.com/office/drawing/2016/5/13/chartex" xmlns:cx8="http://schemas.microsoft.com/office/drawing/2016/5/14/chartex" xmlns:mc="http://schemas.openxmlformats.org/markup-compatibility/2006" xmlns:aink="http://schemas.microsoft.com/office/drawing/2016/ink" xmlns:am3d="http://schemas.microsoft.com/office/drawing/2017/model3d" xmlns:o="urn:schemas-microsoft-com:office:office" xmlns:oel="http://schemas.microsoft.com/office/2019/extlst" xmlns:r="http://schemas.openxmlformats.org/officeDocument/2006/relationships" xmlns:m="http://schemas.openxmlformats.org/officeDocument/2006/math" xmlns:v="urn:schemas-microsoft-com:vml" xmlns:wp14="http://schemas.microsoft.com/office/word/2010/wordprocessingDrawing" xmlns:wp="http://schemas.openxmlformats.org/drawingml/2006/wordprocessingDrawing" xmlns:w10="urn:schemas-microsoft-com:office:word" xmlns:w="http://schemas.openxmlformats.org/wordprocessingml/2006/main" xmlns:w14="http://schemas.microsoft.com/office/word/2010/wordml" xmlns:w15="http://schemas.microsoft.com/office/word/2012/wordml" xmlns:w16cex="http://schemas.microsoft.com/office/word/2018/wordml/cex" xmlns:w16cid="http://schemas.microsoft.com/office/word/2016/wordml/cid" xmlns:w16="http://schemas.microsoft.com/office/word/2018/wordml" xmlns:w16du="http://schemas.microsoft.com/office/word/2023/wordml/word16du" xmlns:w16sdtdh="http://schemas.microsoft.com/office/word/2020/wordml/sdtdatahash" xmlns:w16se="http://schemas.microsoft.com/office/word/2015/wordml/symex" xmlns:wpg="http://schemas.microsoft.com/office/word/2010/wordprocessingGroup" xmlns:wpi="http://schemas.microsoft.com/office/word/2010/wordprocessingInk" xmlns:wne="http://schemas.microsoft.com/office/word/2006/wordml" xmlns:wps="http://schemas.microsoft.com/office/word/2010/wordprocessingShape" mc:Ignorable="w14 w15 w16se w16cid w16 w16cex w16sdtdh w16du wp14">
+<w:ftr xmlns:wpc="http://schemas.microsoft.com/office/word/2010/wordprocessingCanvas" xmlns:cx="http://schemas.microsoft.com/office/drawing/2014/chartex" xmlns:cx1="http://schemas.microsoft.com/office/drawing/2015/9/8/chartex" xmlns:cx2="http://schemas.microsoft.com/office/drawing/2015/10/21/chartex" xmlns:cx3="http://schemas.microsoft.com/office/drawing/2016/5/9/chartex" xmlns:cx4="http://schemas.microsoft.com/office/drawing/2016/5/10/chartex" xmlns:cx5="http://schemas.microsoft.com/office/drawing/2016/5/11/chartex" xmlns:cx6="http://schemas.microsoft.com/office/drawing/2016/5/12/chartex" xmlns:cx7="http://schemas.microsoft.com/office/drawing/2016/5/13/chartex" xmlns:cx8="http://schemas.microsoft.com/office/drawing/2016/5/14/chartex" xmlns:mc="http://schemas.openxmlformats.org/markup-compatibility/2006" xmlns:aink="http://schemas.microsoft.com/office/drawing/2016/ink" xmlns:am3d="http://schemas.microsoft.com/office/drawing/2017/model3d" xmlns:o="urn:schemas-microsoft-com:office:office" xmlns:oel="http://schemas.microsoft.com/office/2019/extlst" xmlns:r="http://schemas.openxmlformats.org/officeDocument/2006/relationships" xmlns:m="http://schemas.openxmlformats.org/officeDocument/2006/math" xmlns:v="urn:schemas-microsoft-com:vml" xmlns:wp14="http://schemas.microsoft.com/office/word/2010/wordprocessingDrawing" xmlns:wp="http://schemas.openxmlformats.org/drawingml/2006/wordprocessingDrawing" xmlns:w10="urn:schemas-microsoft-com:office:word" xmlns:w="http://schemas.openxmlformats.org/wordprocessingml/2006/main" xmlns:w14="http://schemas.microsoft.com/office/word/2010/wordml" xmlns:w15="http://schemas.microsoft.com/office/word/2012/wordml" xmlns:w16cex="http://schemas.microsoft.com/office/word/2018/wordml/cex" xmlns:w16cid="http://schemas.microsoft.com/office/word/2016/wordml/cid" xmlns:w16="http://schemas.microsoft.com/office/word/2018/wordml" xmlns:w16du="http://schemas.microsoft.com/office/word/2023/wordml/word16du" xmlns:w16sdtdh="http://schemas.microsoft.com/office/word/2020/wordml/sdtdatahash" xmlns:w16sdtfl="http://schemas.microsoft.com/office/word/2024/wordml/sdtformatlock" xmlns:w16se="http://schemas.microsoft.com/office/word/2015/wordml/symex" xmlns:wpg="http://schemas.microsoft.com/office/word/2010/wordprocessingGroup" xmlns:wpi="http://schemas.microsoft.com/office/word/2010/wordprocessingInk" xmlns:wne="http://schemas.microsoft.com/office/word/2006/wordml" xmlns:wps="http://schemas.microsoft.com/office/word/2010/wordprocessingShape" mc:Ignorable="w14 w15 w16se w16cid w16 w16cex w16sdtdh w16sdtfl w16du wp14">
   <w:p>
     <w:pPr>
       <w:pBdr>
@@ -30191,7 +30769,7 @@
 </file>
 
 <file path=word/footnotes.xml><?xml version="1.0" encoding="utf-8"?>
-<w:footnotes xmlns:wpc="http://schemas.microsoft.com/office/word/2010/wordprocessingCanvas" xmlns:cx="http://schemas.microsoft.com/office/drawing/2014/chartex" xmlns:cx1="http://schemas.microsoft.com/office/drawing/2015/9/8/chartex" xmlns:cx2="http://schemas.microsoft.com/office/drawing/2015/10/21/chartex" xmlns:cx3="http://schemas.microsoft.com/office/drawing/2016/5/9/chartex" xmlns:cx4="http://schemas.microsoft.com/office/drawing/2016/5/10/chartex" xmlns:cx5="http://schemas.microsoft.com/office/drawing/2016/5/11/chartex" xmlns:cx6="http://schemas.microsoft.com/office/drawing/2016/5/12/chartex" xmlns:cx7="http://schemas.microsoft.com/office/drawing/2016/5/13/chartex" xmlns:cx8="http://schemas.microsoft.com/office/drawing/2016/5/14/chartex" xmlns:mc="http://schemas.openxmlformats.org/markup-compatibility/2006" xmlns:aink="http://schemas.microsoft.com/office/drawing/2016/ink" xmlns:am3d="http://schemas.microsoft.com/office/drawing/2017/model3d" xmlns:o="urn:schemas-microsoft-com:office:office" xmlns:oel="http://schemas.microsoft.com/office/2019/extlst" xmlns:r="http://schemas.openxmlformats.org/officeDocument/2006/relationships" xmlns:m="http://schemas.openxmlformats.org/officeDocument/2006/math" xmlns:v="urn:schemas-microsoft-com:vml" xmlns:wp14="http://schemas.microsoft.com/office/word/2010/wordprocessingDrawing" xmlns:wp="http://schemas.openxmlformats.org/drawingml/2006/wordprocessingDrawing" xmlns:w10="urn:schemas-microsoft-com:office:word" xmlns:w="http://schemas.openxmlformats.org/wordprocessingml/2006/main" xmlns:w14="http://schemas.microsoft.com/office/word/2010/wordml" xmlns:w15="http://schemas.microsoft.com/office/word/2012/wordml" xmlns:w16cex="http://schemas.microsoft.com/office/word/2018/wordml/cex" xmlns:w16cid="http://schemas.microsoft.com/office/word/2016/wordml/cid" xmlns:w16="http://schemas.microsoft.com/office/word/2018/wordml" xmlns:w16du="http://schemas.microsoft.com/office/word/2023/wordml/word16du" xmlns:w16sdtdh="http://schemas.microsoft.com/office/word/2020/wordml/sdtdatahash" xmlns:w16se="http://schemas.microsoft.com/office/word/2015/wordml/symex" xmlns:wpg="http://schemas.microsoft.com/office/word/2010/wordprocessingGroup" xmlns:wpi="http://schemas.microsoft.com/office/word/2010/wordprocessingInk" xmlns:wne="http://schemas.microsoft.com/office/word/2006/wordml" xmlns:wps="http://schemas.microsoft.com/office/word/2010/wordprocessingShape" mc:Ignorable="w14 w15 w16se w16cid w16 w16cex w16sdtdh w16du wp14">
+<w:footnotes xmlns:wpc="http://schemas.microsoft.com/office/word/2010/wordprocessingCanvas" xmlns:cx="http://schemas.microsoft.com/office/drawing/2014/chartex" xmlns:cx1="http://schemas.microsoft.com/office/drawing/2015/9/8/chartex" xmlns:cx2="http://schemas.microsoft.com/office/drawing/2015/10/21/chartex" xmlns:cx3="http://schemas.microsoft.com/office/drawing/2016/5/9/chartex" xmlns:cx4="http://schemas.microsoft.com/office/drawing/2016/5/10/chartex" xmlns:cx5="http://schemas.microsoft.com/office/drawing/2016/5/11/chartex" xmlns:cx6="http://schemas.microsoft.com/office/drawing/2016/5/12/chartex" xmlns:cx7="http://schemas.microsoft.com/office/drawing/2016/5/13/chartex" xmlns:cx8="http://schemas.microsoft.com/office/drawing/2016/5/14/chartex" xmlns:mc="http://schemas.openxmlformats.org/markup-compatibility/2006" xmlns:aink="http://schemas.microsoft.com/office/drawing/2016/ink" xmlns:am3d="http://schemas.microsoft.com/office/drawing/2017/model3d" xmlns:o="urn:schemas-microsoft-com:office:office" xmlns:oel="http://schemas.microsoft.com/office/2019/extlst" xmlns:r="http://schemas.openxmlformats.org/officeDocument/2006/relationships" xmlns:m="http://schemas.openxmlformats.org/officeDocument/2006/math" xmlns:v="urn:schemas-microsoft-com:vml" xmlns:wp14="http://schemas.microsoft.com/office/word/2010/wordprocessingDrawing" xmlns:wp="http://schemas.openxmlformats.org/drawingml/2006/wordprocessingDrawing" xmlns:w10="urn:schemas-microsoft-com:office:word" xmlns:w="http://schemas.openxmlformats.org/wordprocessingml/2006/main" xmlns:w14="http://schemas.microsoft.com/office/word/2010/wordml" xmlns:w15="http://schemas.microsoft.com/office/word/2012/wordml" xmlns:w16cex="http://schemas.microsoft.com/office/word/2018/wordml/cex" xmlns:w16cid="http://schemas.microsoft.com/office/word/2016/wordml/cid" xmlns:w16="http://schemas.microsoft.com/office/word/2018/wordml" xmlns:w16du="http://schemas.microsoft.com/office/word/2023/wordml/word16du" xmlns:w16sdtdh="http://schemas.microsoft.com/office/word/2020/wordml/sdtdatahash" xmlns:w16sdtfl="http://schemas.microsoft.com/office/word/2024/wordml/sdtformatlock" xmlns:w16se="http://schemas.microsoft.com/office/word/2015/wordml/symex" xmlns:wpg="http://schemas.microsoft.com/office/word/2010/wordprocessingGroup" xmlns:wpi="http://schemas.microsoft.com/office/word/2010/wordprocessingInk" xmlns:wne="http://schemas.microsoft.com/office/word/2006/wordml" xmlns:wps="http://schemas.microsoft.com/office/word/2010/wordprocessingShape" mc:Ignorable="w14 w15 w16se w16cid w16 w16cex w16sdtdh w16sdtfl w16du wp14">
   <w:footnote w:type="separator" w:id="-1">
     <w:p>
       <w:pPr>
@@ -30216,7 +30794,7 @@
 </file>
 
 <file path=word/header1.xml><?xml version="1.0" encoding="utf-8"?>
-<w:hdr xmlns:wpc="http://schemas.microsoft.com/office/word/2010/wordprocessingCanvas" xmlns:cx="http://schemas.microsoft.com/office/drawing/2014/chartex" xmlns:cx1="http://schemas.microsoft.com/office/drawing/2015/9/8/chartex" xmlns:cx2="http://schemas.microsoft.com/office/drawing/2015/10/21/chartex" xmlns:cx3="http://schemas.microsoft.com/office/drawing/2016/5/9/chartex" xmlns:cx4="http://schemas.microsoft.com/office/drawing/2016/5/10/chartex" xmlns:cx5="http://schemas.microsoft.com/office/drawing/2016/5/11/chartex" xmlns:cx6="http://schemas.microsoft.com/office/drawing/2016/5/12/chartex" xmlns:cx7="http://schemas.microsoft.com/office/drawing/2016/5/13/chartex" xmlns:cx8="http://schemas.microsoft.com/office/drawing/2016/5/14/chartex" xmlns:mc="http://schemas.openxmlformats.org/markup-compatibility/2006" xmlns:aink="http://schemas.microsoft.com/office/drawing/2016/ink" xmlns:am3d="http://schemas.microsoft.com/office/drawing/2017/model3d" xmlns:o="urn:schemas-microsoft-com:office:office" xmlns:oel="http://schemas.microsoft.com/office/2019/extlst" xmlns:r="http://schemas.openxmlformats.org/officeDocument/2006/relationships" xmlns:m="http://schemas.openxmlformats.org/officeDocument/2006/math" xmlns:v="urn:schemas-microsoft-com:vml" xmlns:wp14="http://schemas.microsoft.com/office/word/2010/wordprocessingDrawing" xmlns:wp="http://schemas.openxmlformats.org/drawingml/2006/wordprocessingDrawing" xmlns:w10="urn:schemas-microsoft-com:office:word" xmlns:w="http://schemas.openxmlformats.org/wordprocessingml/2006/main" xmlns:w14="http://schemas.microsoft.com/office/word/2010/wordml" xmlns:w15="http://schemas.microsoft.com/office/word/2012/wordml" xmlns:w16cex="http://schemas.microsoft.com/office/word/2018/wordml/cex" xmlns:w16cid="http://schemas.microsoft.com/office/word/2016/wordml/cid" xmlns:w16="http://schemas.microsoft.com/office/word/2018/wordml" xmlns:w16du="http://schemas.microsoft.com/office/word/2023/wordml/word16du" xmlns:w16sdtdh="http://schemas.microsoft.com/office/word/2020/wordml/sdtdatahash" xmlns:w16se="http://schemas.microsoft.com/office/word/2015/wordml/symex" xmlns:wpg="http://schemas.microsoft.com/office/word/2010/wordprocessingGroup" xmlns:wpi="http://schemas.microsoft.com/office/word/2010/wordprocessingInk" xmlns:wne="http://schemas.microsoft.com/office/word/2006/wordml" xmlns:wps="http://schemas.microsoft.com/office/word/2010/wordprocessingShape" mc:Ignorable="w14 w15 w16se w16cid w16 w16cex w16sdtdh w16du wp14">
+<w:hdr xmlns:wpc="http://schemas.microsoft.com/office/word/2010/wordprocessingCanvas" xmlns:cx="http://schemas.microsoft.com/office/drawing/2014/chartex" xmlns:cx1="http://schemas.microsoft.com/office/drawing/2015/9/8/chartex" xmlns:cx2="http://schemas.microsoft.com/office/drawing/2015/10/21/chartex" xmlns:cx3="http://schemas.microsoft.com/office/drawing/2016/5/9/chartex" xmlns:cx4="http://schemas.microsoft.com/office/drawing/2016/5/10/chartex" xmlns:cx5="http://schemas.microsoft.com/office/drawing/2016/5/11/chartex" xmlns:cx6="http://schemas.microsoft.com/office/drawing/2016/5/12/chartex" xmlns:cx7="http://schemas.microsoft.com/office/drawing/2016/5/13/chartex" xmlns:cx8="http://schemas.microsoft.com/office/drawing/2016/5/14/chartex" xmlns:mc="http://schemas.openxmlformats.org/markup-compatibility/2006" xmlns:aink="http://schemas.microsoft.com/office/drawing/2016/ink" xmlns:am3d="http://schemas.microsoft.com/office/drawing/2017/model3d" xmlns:o="urn:schemas-microsoft-com:office:office" xmlns:oel="http://schemas.microsoft.com/office/2019/extlst" xmlns:r="http://schemas.openxmlformats.org/officeDocument/2006/relationships" xmlns:m="http://schemas.openxmlformats.org/officeDocument/2006/math" xmlns:v="urn:schemas-microsoft-com:vml" xmlns:wp14="http://schemas.microsoft.com/office/word/2010/wordprocessingDrawing" xmlns:wp="http://schemas.openxmlformats.org/drawingml/2006/wordprocessingDrawing" xmlns:w10="urn:schemas-microsoft-com:office:word" xmlns:w="http://schemas.openxmlformats.org/wordprocessingml/2006/main" xmlns:w14="http://schemas.microsoft.com/office/word/2010/wordml" xmlns:w15="http://schemas.microsoft.com/office/word/2012/wordml" xmlns:w16cex="http://schemas.microsoft.com/office/word/2018/wordml/cex" xmlns:w16cid="http://schemas.microsoft.com/office/word/2016/wordml/cid" xmlns:w16="http://schemas.microsoft.com/office/word/2018/wordml" xmlns:w16du="http://schemas.microsoft.com/office/word/2023/wordml/word16du" xmlns:w16sdtdh="http://schemas.microsoft.com/office/word/2020/wordml/sdtdatahash" xmlns:w16sdtfl="http://schemas.microsoft.com/office/word/2024/wordml/sdtformatlock" xmlns:w16se="http://schemas.microsoft.com/office/word/2015/wordml/symex" xmlns:wpg="http://schemas.microsoft.com/office/word/2010/wordprocessingGroup" xmlns:wpi="http://schemas.microsoft.com/office/word/2010/wordprocessingInk" xmlns:wne="http://schemas.microsoft.com/office/word/2006/wordml" xmlns:wps="http://schemas.microsoft.com/office/word/2010/wordprocessingShape" mc:Ignorable="w14 w15 w16se w16cid w16 w16cex w16sdtdh w16sdtfl w16du wp14">
   <w:p>
     <w:pPr>
       <w:pStyle w:val="Header"/>
@@ -30237,7 +30815,7 @@
 </file>
 
 <file path=word/header2.xml><?xml version="1.0" encoding="utf-8"?>
-<w:hdr xmlns:wpc="http://schemas.microsoft.com/office/word/2010/wordprocessingCanvas" xmlns:cx="http://schemas.microsoft.com/office/drawing/2014/chartex" xmlns:cx1="http://schemas.microsoft.com/office/drawing/2015/9/8/chartex" xmlns:cx2="http://schemas.microsoft.com/office/drawing/2015/10/21/chartex" xmlns:cx3="http://schemas.microsoft.com/office/drawing/2016/5/9/chartex" xmlns:cx4="http://schemas.microsoft.com/office/drawing/2016/5/10/chartex" xmlns:cx5="http://schemas.microsoft.com/office/drawing/2016/5/11/chartex" xmlns:cx6="http://schemas.microsoft.com/office/drawing/2016/5/12/chartex" xmlns:cx7="http://schemas.microsoft.com/office/drawing/2016/5/13/chartex" xmlns:cx8="http://schemas.microsoft.com/office/drawing/2016/5/14/chartex" xmlns:mc="http://schemas.openxmlformats.org/markup-compatibility/2006" xmlns:aink="http://schemas.microsoft.com/office/drawing/2016/ink" xmlns:am3d="http://schemas.microsoft.com/office/drawing/2017/model3d" xmlns:o="urn:schemas-microsoft-com:office:office" xmlns:oel="http://schemas.microsoft.com/office/2019/extlst" xmlns:r="http://schemas.openxmlformats.org/officeDocument/2006/relationships" xmlns:m="http://schemas.openxmlformats.org/officeDocument/2006/math" xmlns:v="urn:schemas-microsoft-com:vml" xmlns:wp14="http://schemas.microsoft.com/office/word/2010/wordprocessingDrawing" xmlns:wp="http://schemas.openxmlformats.org/drawingml/2006/wordprocessingDrawing" xmlns:w10="urn:schemas-microsoft-com:office:word" xmlns:w="http://schemas.openxmlformats.org/wordprocessingml/2006/main" xmlns:w14="http://schemas.microsoft.com/office/word/2010/wordml" xmlns:w15="http://schemas.microsoft.com/office/word/2012/wordml" xmlns:w16cex="http://schemas.microsoft.com/office/word/2018/wordml/cex" xmlns:w16cid="http://schemas.microsoft.com/office/word/2016/wordml/cid" xmlns:w16="http://schemas.microsoft.com/office/word/2018/wordml" xmlns:w16du="http://schemas.microsoft.com/office/word/2023/wordml/word16du" xmlns:w16sdtdh="http://schemas.microsoft.com/office/word/2020/wordml/sdtdatahash" xmlns:w16se="http://schemas.microsoft.com/office/word/2015/wordml/symex" xmlns:wpg="http://schemas.microsoft.com/office/word/2010/wordprocessingGroup" xmlns:wpi="http://schemas.microsoft.com/office/word/2010/wordprocessingInk" xmlns:wne="http://schemas.microsoft.com/office/word/2006/wordml" xmlns:wps="http://schemas.microsoft.com/office/word/2010/wordprocessingShape" mc:Ignorable="w14 w15 w16se w16cid w16 w16cex w16sdtdh w16du wp14">
+<w:hdr xmlns:wpc="http://schemas.microsoft.com/office/word/2010/wordprocessingCanvas" xmlns:cx="http://schemas.microsoft.com/office/drawing/2014/chartex" xmlns:cx1="http://schemas.microsoft.com/office/drawing/2015/9/8/chartex" xmlns:cx2="http://schemas.microsoft.com/office/drawing/2015/10/21/chartex" xmlns:cx3="http://schemas.microsoft.com/office/drawing/2016/5/9/chartex" xmlns:cx4="http://schemas.microsoft.com/office/drawing/2016/5/10/chartex" xmlns:cx5="http://schemas.microsoft.com/office/drawing/2016/5/11/chartex" xmlns:cx6="http://schemas.microsoft.com/office/drawing/2016/5/12/chartex" xmlns:cx7="http://schemas.microsoft.com/office/drawing/2016/5/13/chartex" xmlns:cx8="http://schemas.microsoft.com/office/drawing/2016/5/14/chartex" xmlns:mc="http://schemas.openxmlformats.org/markup-compatibility/2006" xmlns:aink="http://schemas.microsoft.com/office/drawing/2016/ink" xmlns:am3d="http://schemas.microsoft.com/office/drawing/2017/model3d" xmlns:o="urn:schemas-microsoft-com:office:office" xmlns:oel="http://schemas.microsoft.com/office/2019/extlst" xmlns:r="http://schemas.openxmlformats.org/officeDocument/2006/relationships" xmlns:m="http://schemas.openxmlformats.org/officeDocument/2006/math" xmlns:v="urn:schemas-microsoft-com:vml" xmlns:wp14="http://schemas.microsoft.com/office/word/2010/wordprocessingDrawing" xmlns:wp="http://schemas.openxmlformats.org/drawingml/2006/wordprocessingDrawing" xmlns:w10="urn:schemas-microsoft-com:office:word" xmlns:w="http://schemas.openxmlformats.org/wordprocessingml/2006/main" xmlns:w14="http://schemas.microsoft.com/office/word/2010/wordml" xmlns:w15="http://schemas.microsoft.com/office/word/2012/wordml" xmlns:w16cex="http://schemas.microsoft.com/office/word/2018/wordml/cex" xmlns:w16cid="http://schemas.microsoft.com/office/word/2016/wordml/cid" xmlns:w16="http://schemas.microsoft.com/office/word/2018/wordml" xmlns:w16du="http://schemas.microsoft.com/office/word/2023/wordml/word16du" xmlns:w16sdtdh="http://schemas.microsoft.com/office/word/2020/wordml/sdtdatahash" xmlns:w16sdtfl="http://schemas.microsoft.com/office/word/2024/wordml/sdtformatlock" xmlns:w16se="http://schemas.microsoft.com/office/word/2015/wordml/symex" xmlns:wpg="http://schemas.microsoft.com/office/word/2010/wordprocessingGroup" xmlns:wpi="http://schemas.microsoft.com/office/word/2010/wordprocessingInk" xmlns:wne="http://schemas.microsoft.com/office/word/2006/wordml" xmlns:wps="http://schemas.microsoft.com/office/word/2010/wordprocessingShape" mc:Ignorable="w14 w15 w16se w16cid w16 w16cex w16sdtdh w16sdtfl w16du wp14">
   <w:p>
     <w:pPr>
       <w:pStyle w:val="Header"/>
@@ -30250,7 +30828,7 @@
 </file>
 
 <file path=word/styles.xml><?xml version="1.0" encoding="utf-8"?>
-<w:styles xmlns:mc="http://schemas.openxmlformats.org/markup-compatibility/2006" xmlns:r="http://schemas.openxmlformats.org/officeDocument/2006/relationships" xmlns:w="http://schemas.openxmlformats.org/wordprocessingml/2006/main" xmlns:w14="http://schemas.microsoft.com/office/word/2010/wordml" xmlns:w15="http://schemas.microsoft.com/office/word/2012/wordml" xmlns:w16cex="http://schemas.microsoft.com/office/word/2018/wordml/cex" xmlns:w16cid="http://schemas.microsoft.com/office/word/2016/wordml/cid" xmlns:w16="http://schemas.microsoft.com/office/word/2018/wordml" xmlns:w16du="http://schemas.microsoft.com/office/word/2023/wordml/word16du" xmlns:w16sdtdh="http://schemas.microsoft.com/office/word/2020/wordml/sdtdatahash" xmlns:w16se="http://schemas.microsoft.com/office/word/2015/wordml/symex" mc:Ignorable="w14 w15 w16se w16cid w16 w16cex w16sdtdh w16du">
+<w:styles xmlns:mc="http://schemas.openxmlformats.org/markup-compatibility/2006" xmlns:r="http://schemas.openxmlformats.org/officeDocument/2006/relationships" xmlns:w="http://schemas.openxmlformats.org/wordprocessingml/2006/main" xmlns:w14="http://schemas.microsoft.com/office/word/2010/wordml" xmlns:w15="http://schemas.microsoft.com/office/word/2012/wordml" xmlns:w16cex="http://schemas.microsoft.com/office/word/2018/wordml/cex" xmlns:w16cid="http://schemas.microsoft.com/office/word/2016/wordml/cid" xmlns:w16="http://schemas.microsoft.com/office/word/2018/wordml" xmlns:w16du="http://schemas.microsoft.com/office/word/2023/wordml/word16du" xmlns:w16sdtdh="http://schemas.microsoft.com/office/word/2020/wordml/sdtdatahash" xmlns:w16sdtfl="http://schemas.microsoft.com/office/word/2024/wordml/sdtformatlock" xmlns:w16se="http://schemas.microsoft.com/office/word/2015/wordml/symex" mc:Ignorable="w14 w15 w16se w16cid w16 w16cex w16sdtdh w16sdtfl w16du">
   <w:docDefaults>
     <w:rPrDefault>
       <w:rPr>

</xml_diff>